<commit_message>
cambios en los documentos
</commit_message>
<xml_diff>
--- a/FASE 2/avances grupales/2.4_GuiaEstudiante_Fase 2_DesarrolloProyecto APT.docx
+++ b/FASE 2/avances grupales/2.4_GuiaEstudiante_Fase 2_DesarrolloProyecto APT.docx
@@ -1,11 +1,8 @@
 
 <file path=word/document.xml><?xml version="1.0" encoding="utf-8"?>
-<w:document xmlns:wpc="http://schemas.microsoft.com/office/word/2010/wordprocessingCanvas" xmlns:cx="http://schemas.microsoft.com/office/drawing/2014/chartex" xmlns:mc="http://schemas.openxmlformats.org/markup-compatibility/2006" xmlns:o="urn:schemas-microsoft-com:office:office" xmlns:r="http://schemas.openxmlformats.org/officeDocument/2006/relationships" xmlns:m="http://schemas.openxmlformats.org/officeDocument/2006/math" xmlns:v="urn:schemas-microsoft-com:vml" xmlns:wp14="http://schemas.microsoft.com/office/word/2010/wordprocessingDrawing" xmlns:wp="http://schemas.openxmlformats.org/drawingml/2006/wordprocessingDrawing" xmlns:w10="urn:schemas-microsoft-com:office:word" xmlns:w="http://schemas.openxmlformats.org/wordprocessingml/2006/main" xmlns:w14="http://schemas.microsoft.com/office/word/2010/wordml" xmlns:w15="http://schemas.microsoft.com/office/word/2012/wordml" xmlns:w16se="http://schemas.microsoft.com/office/word/2015/wordml/symex" xmlns:wpg="http://schemas.microsoft.com/office/word/2010/wordprocessingGroup" xmlns:wpi="http://schemas.microsoft.com/office/word/2010/wordprocessingInk" xmlns:wne="http://schemas.microsoft.com/office/word/2006/wordml" xmlns:wps="http://schemas.microsoft.com/office/word/2010/wordprocessingShape" mc:Ignorable="w14 w15 w16se wp14">
+<w:document xmlns:wpc="http://schemas.microsoft.com/office/word/2010/wordprocessingCanvas" xmlns:cx="http://schemas.microsoft.com/office/drawing/2014/chartex" xmlns:cx1="http://schemas.microsoft.com/office/drawing/2015/9/8/chartex" xmlns:cx2="http://schemas.microsoft.com/office/drawing/2015/10/21/chartex" xmlns:cx3="http://schemas.microsoft.com/office/drawing/2016/5/9/chartex" xmlns:cx4="http://schemas.microsoft.com/office/drawing/2016/5/10/chartex" xmlns:cx5="http://schemas.microsoft.com/office/drawing/2016/5/11/chartex" xmlns:cx6="http://schemas.microsoft.com/office/drawing/2016/5/12/chartex" xmlns:cx7="http://schemas.microsoft.com/office/drawing/2016/5/13/chartex" xmlns:cx8="http://schemas.microsoft.com/office/drawing/2016/5/14/chartex" xmlns:mc="http://schemas.openxmlformats.org/markup-compatibility/2006" xmlns:aink="http://schemas.microsoft.com/office/drawing/2016/ink" xmlns:am3d="http://schemas.microsoft.com/office/drawing/2017/model3d" xmlns:o="urn:schemas-microsoft-com:office:office" xmlns:oel="http://schemas.microsoft.com/office/2019/extlst" xmlns:r="http://schemas.openxmlformats.org/officeDocument/2006/relationships" xmlns:m="http://schemas.openxmlformats.org/officeDocument/2006/math" xmlns:v="urn:schemas-microsoft-com:vml" xmlns:wp14="http://schemas.microsoft.com/office/word/2010/wordprocessingDrawing" xmlns:wp="http://schemas.openxmlformats.org/drawingml/2006/wordprocessingDrawing" xmlns:w10="urn:schemas-microsoft-com:office:word" xmlns:w="http://schemas.openxmlformats.org/wordprocessingml/2006/main" xmlns:w14="http://schemas.microsoft.com/office/word/2010/wordml" xmlns:w15="http://schemas.microsoft.com/office/word/2012/wordml" xmlns:w16cex="http://schemas.microsoft.com/office/word/2018/wordml/cex" xmlns:w16cid="http://schemas.microsoft.com/office/word/2016/wordml/cid" xmlns:w16="http://schemas.microsoft.com/office/word/2018/wordml" xmlns:w16du="http://schemas.microsoft.com/office/word/2023/wordml/word16du" xmlns:w16sdtdh="http://schemas.microsoft.com/office/word/2020/wordml/sdtdatahash" xmlns:w16sdtfl="http://schemas.microsoft.com/office/word/2024/wordml/sdtformatlock" xmlns:w16se="http://schemas.microsoft.com/office/word/2015/wordml/symex" xmlns:wpg="http://schemas.microsoft.com/office/word/2010/wordprocessingGroup" xmlns:wpi="http://schemas.microsoft.com/office/word/2010/wordprocessingInk" xmlns:wne="http://schemas.microsoft.com/office/word/2006/wordml" xmlns:wps="http://schemas.microsoft.com/office/word/2010/wordprocessingShape" mc:Ignorable="w14 w15 w16se w16cid w16 w16cex w16sdtdh w16sdtfl w16du wp14">
   <w:body>
-    <w:p>
-      <w:bookmarkStart w:id="0" w:name="_GoBack"/>
-      <w:bookmarkEnd w:id="0"/>
-    </w:p>
+    <w:p/>
     <w:p>
       <w:pPr>
         <w:rPr>
@@ -118,7 +115,7 @@
                                   <w:sz w:val="48"/>
                                   <w:szCs w:val="48"/>
                                 </w:rPr>
-                                <w:t xml:space="preserve">Asignatura Capstone</w:t>
+                                <w:t>Asignatura Capstone</w:t>
                               </w:r>
                             </w:p>
                           </w:txbxContent>
@@ -363,7 +360,7 @@
                 <w:sz w:val="28"/>
                 <w:szCs w:val="28"/>
               </w:rPr>
-              <w:t xml:space="preserve">1. Resumen avance Proyecto APT</w:t>
+              <w:t>1. Resumen avance Proyecto APT</w:t>
             </w:r>
           </w:p>
         </w:tc>
@@ -459,7 +456,7 @@
                 <w:rFonts w:ascii="Calibri" w:hAnsi="Calibri"/>
                 <w:color w:val="1F3864" w:themeColor="accent1" w:themeShade="80"/>
               </w:rPr>
-              <w:t xml:space="preserve">Resumen de avance proyecto APT</w:t>
+              <w:t>Resumen de avance proyecto APT</w:t>
             </w:r>
           </w:p>
         </w:tc>
@@ -469,47 +466,41 @@
           </w:tcPr>
           <w:p>
             <w:pPr>
-              <w:spacing w:after="120" w:line="259" w:lineRule="auto"/>
+              <w:spacing w:after="120"/>
               <w:jc w:val="both"/>
             </w:pPr>
             <w:r>
               <w:rPr>
                 <w:rFonts w:ascii="Calibri" w:hAnsi="Calibri" w:cs="Arial"/>
-                <w:sz w:val="22"/>
-                <w:szCs w:val="22"/>
-                <w:lang w:eastAsia="es-CL"/>
-              </w:rPr>
-              <w:t xml:space="preserve">En esta fase nos dedicamos a construir el núcleo del sistema. Partimos por la base de datos en MySQL, que conectamos al backend con Prisma, y la API en Node.js con Express. Después fuimos sumando los módulos uno por uno y conectándolos al frontend en React.</w:t>
-            </w:r>
-          </w:p>
-          <w:p>
-            <w:pPr>
-              <w:spacing w:after="120" w:line="259" w:lineRule="auto"/>
+                <w:lang w:eastAsia="es-CL"/>
+              </w:rPr>
+              <w:t>En esta fase nos dedicamos a construir el núcleo del sistema. Partimos por la base de datos en MySQL, que conectamos al backend con Prisma, y la API en Node.js con Express. Después fuimos sumando los módulos uno por uno y conectándolos al frontend en React.</w:t>
+            </w:r>
+          </w:p>
+          <w:p>
+            <w:pPr>
+              <w:spacing w:after="120"/>
               <w:jc w:val="both"/>
             </w:pPr>
             <w:r>
               <w:rPr>
                 <w:rFonts w:ascii="Calibri" w:hAnsi="Calibri" w:cs="Arial"/>
-                <w:sz w:val="22"/>
-                <w:szCs w:val="22"/>
-                <w:lang w:eastAsia="es-CL"/>
-              </w:rPr>
-              <w:t xml:space="preserve">Hoy el sistema ya permite entrar con usuario y contraseña más un código que llega al correo, y cada persona entra a su panel según su rol: administrador, operador, peoneta o cliente. Lo que ya funciona es crear órdenes de transporte con el precio calculado (por peso o por volumen, el que salga mayor) y con su historial; recibir los bultos en bodega con su código; armar manifiestos de reparto y de traspaso escaneando los bultos; registrar la entrega o el rechazo desde la vista del peoneta; cobrar en caja y con Webpay en ambiente de pruebas; llevar la cuenta corriente con su planilla del mes; el seguimiento público por número de OT; y el portal del cliente, donde el cliente con cuenta corriente además puede pagar sus pendientes y cotizar.</w:t>
-            </w:r>
-          </w:p>
-          <w:p>
-            <w:pPr>
-              <w:spacing w:after="120" w:line="259" w:lineRule="auto"/>
+                <w:lang w:eastAsia="es-CL"/>
+              </w:rPr>
+              <w:t>Hoy el sistema ya permite entrar con usuario y contraseña más un código que llega al correo, y cada persona entra a su panel según su rol: administrador, operador, peoneta o cliente. Lo que ya funciona es crear órdenes de transporte con el precio calculado (por peso o por volumen, el que salga mayor) y con su historial; recibir los bultos en bodega con su código; armar manifiestos de reparto y de traspaso escaneando los bultos; registrar la entrega o el rechazo desde la vista del peoneta; cobrar en caja y con Webpay en ambiente de pruebas; llevar la cuenta corriente con su planilla del mes; el seguimiento público por número de OT; y el portal del cliente, donde el cliente con cuenta corriente además puede pagar sus pendientes y cotizar.</w:t>
+            </w:r>
+          </w:p>
+          <w:p>
+            <w:pPr>
+              <w:spacing w:after="120"/>
               <w:jc w:val="both"/>
             </w:pPr>
             <w:r>
               <w:rPr>
                 <w:rFonts w:ascii="Calibri" w:hAnsi="Calibri" w:cs="Arial"/>
-                <w:sz w:val="22"/>
-                <w:szCs w:val="22"/>
-                <w:lang w:eastAsia="es-CL"/>
-              </w:rPr>
-              <w:t xml:space="preserve">De los objetivos específicos, tenemos cumplidos los de requerimientos, modelo de datos, OT con trazabilidad, tarifas y maestros, manifiestos, seguimiento web y Webpay en pruebas. Las alertas y los reportes están avanzados pero no terminados. El de Machine Learning todavía no lo empezamos y lo explicamos más abajo.</w:t>
+                <w:lang w:eastAsia="es-CL"/>
+              </w:rPr>
+              <w:t>De los objetivos específicos, tenemos cumplidos los de requerimientos, modelo de datos, OT con trazabilidad, tarifas y maestros, manifiestos, seguimiento web y Webpay en pruebas. Las alertas y los reportes están avanzados pero no terminados. El de Machine Learning todavía no lo empezamos y lo explicamos más abajo.</w:t>
             </w:r>
           </w:p>
         </w:tc>
@@ -546,32 +537,29 @@
           </w:tcPr>
           <w:p>
             <w:pPr>
-              <w:spacing w:after="120" w:line="259" w:lineRule="auto"/>
+              <w:spacing w:after="120"/>
               <w:jc w:val="both"/>
             </w:pPr>
             <w:r>
               <w:rPr>
                 <w:rFonts w:ascii="Calibri" w:hAnsi="Calibri" w:cs="Arial"/>
-                <w:sz w:val="22"/>
-                <w:szCs w:val="22"/>
-                <w:lang w:eastAsia="es-CL"/>
-              </w:rPr>
-              <w:t xml:space="preserve">El objetivo general y los objetivos específicos siguen siendo los mismos de la Fase 1. El único cambio es el de Machine Learning: lo mantenemos como meta del proyecto, pero no lo vamos a entregar en esta fase, porque todavía no hay datos históricos suficientes para entrenar un modelo que le sirva a la empresa. Mientras tanto, la cuenta corriente clasifica a los clientes con reglas simples (con deuda, al día, frecuentes o con posible baja).</w:t>
-            </w:r>
-          </w:p>
-          <w:p>
-            <w:pPr>
-              <w:spacing w:after="120" w:line="259" w:lineRule="auto"/>
+                <w:lang w:eastAsia="es-CL"/>
+              </w:rPr>
+              <w:t>El objetivo general y los objetivos específicos siguen siendo los mismos de la Fase 1. El único cambio es el de Machine Learning: lo mantenemos como meta del proyecto, pero no lo vamos a entregar en esta fase, porque todavía no hay datos históricos suficientes para entrenar un modelo que le sirva a la empresa. Mientras tanto, la cuenta corriente clasifica a los clientes con reglas simples (con deuda, al día, frecuentes o con posible baja).</w:t>
+            </w:r>
+          </w:p>
+          <w:p>
+            <w:pPr>
+              <w:spacing w:after="120"/>
               <w:jc w:val="both"/>
             </w:pPr>
             <w:r>
               <w:rPr>
                 <w:rFonts w:ascii="Calibri" w:hAnsi="Calibri" w:cs="Arial"/>
-                <w:sz w:val="22"/>
-                <w:szCs w:val="22"/>
-                <w:lang w:eastAsia="es-CL"/>
-              </w:rPr>
-              <w:t xml:space="preserve">Además, la facturación electrónica, que en la Fase 1 ya dependía de la autorización del servicio tributario, la sacamos del menú para no mostrar algo que el sistema no hace.</w:t>
+                <w:lang w:eastAsia="es-CL"/>
+              </w:rPr>
+              <w:lastRenderedPageBreak/>
+              <w:t>Además, la facturación electrónica, que en la Fase 1 ya dependía de la autorización del servicio tributario, la sacamos del menú para no mostrar algo que el sistema no hace.</w:t>
             </w:r>
           </w:p>
         </w:tc>
@@ -597,6 +585,7 @@
                 <w:rFonts w:ascii="Calibri" w:hAnsi="Calibri"/>
                 <w:color w:val="1F3864" w:themeColor="accent1" w:themeShade="80"/>
               </w:rPr>
+              <w:lastRenderedPageBreak/>
               <w:t>Metodología</w:t>
             </w:r>
           </w:p>
@@ -608,32 +597,28 @@
           </w:tcPr>
           <w:p>
             <w:pPr>
-              <w:spacing w:after="120" w:line="259" w:lineRule="auto"/>
+              <w:spacing w:after="120"/>
               <w:jc w:val="both"/>
             </w:pPr>
             <w:r>
               <w:rPr>
                 <w:rFonts w:ascii="Calibri" w:hAnsi="Calibri" w:cs="Arial"/>
-                <w:sz w:val="22"/>
-                <w:szCs w:val="22"/>
-                <w:lang w:eastAsia="es-CL"/>
-              </w:rPr>
-              <w:t xml:space="preserve">Seguimos con la metodología iterativa e incremental de la Fase 1, adaptada a un equipo de dos. Cada módulo lo pensamos primero con la operación de Marexpress, lo agregamos al modelo de datos, lo programamos en la API y en la pantalla del rol que lo usa, y lo probamos con datos de la base local antes de pasar al siguiente.</w:t>
-            </w:r>
-          </w:p>
-          <w:p>
-            <w:pPr>
-              <w:spacing w:after="120" w:line="259" w:lineRule="auto"/>
+                <w:lang w:eastAsia="es-CL"/>
+              </w:rPr>
+              <w:t>Seguimos con la metodología iterativa e incremental de la Fase 1, adaptada a un equipo de dos. Cada módulo lo pensamos primero con la operación de Marexpress, lo agregamos al modelo de datos, lo programamos en la API y en la pantalla del rol que lo usa, y lo probamos con datos de la base local antes de pasar al siguiente.</w:t>
+            </w:r>
+          </w:p>
+          <w:p>
+            <w:pPr>
+              <w:spacing w:after="120"/>
               <w:jc w:val="both"/>
             </w:pPr>
             <w:r>
               <w:rPr>
                 <w:rFonts w:ascii="Calibri" w:hAnsi="Calibri" w:cs="Arial"/>
-                <w:sz w:val="22"/>
-                <w:szCs w:val="22"/>
-                <w:lang w:eastAsia="es-CL"/>
-              </w:rPr>
-              <w:t xml:space="preserve">Lo que cambió en la práctica es que varias reglas aparecieron recién cuando empezamos a usar el sistema, por ejemplo que un manifiesto de traspaso no cobra o que el peoneta no debe dejar una OT como pagada en la calle. Por eso tuvimos que volver a módulos que creíamos terminados. Para coordinarnos usamos el repositorio de GitHub: cada uno trabajó su parte y juntamos los cambios con un pull request.</w:t>
+                <w:lang w:eastAsia="es-CL"/>
+              </w:rPr>
+              <w:t>Lo que cambió en la práctica es que varias reglas aparecieron recién cuando empezamos a usar el sistema, por ejemplo que un manifiesto de traspaso no cobra o que el peoneta no debe dejar una OT como pagada en la calle. Por eso tuvimos que volver a módulos que creíamos terminados. Para coordinarnos usamos el repositorio de GitHub: cada uno trabajó su parte y juntamos los cambios con un pull request.</w:t>
             </w:r>
           </w:p>
         </w:tc>
@@ -670,30 +655,26 @@
           </w:tcPr>
           <w:p>
             <w:pPr>
-              <w:spacing w:after="120" w:line="259" w:lineRule="auto"/>
+              <w:spacing w:after="120"/>
               <w:jc w:val="both"/>
             </w:pPr>
             <w:r>
               <w:rPr>
                 <w:rFonts w:ascii="Calibri" w:hAnsi="Calibri" w:cs="Arial"/>
-                <w:sz w:val="22"/>
-                <w:szCs w:val="22"/>
-                <w:lang w:eastAsia="es-CL"/>
-              </w:rPr>
-              <w:t xml:space="preserve">Las evidencias que presentamos en este avance son:</w:t>
-            </w:r>
-          </w:p>
-          <w:p>
-            <w:pPr>
-              <w:spacing w:after="120" w:line="259" w:lineRule="auto"/>
+                <w:lang w:eastAsia="es-CL"/>
+              </w:rPr>
+              <w:t>Las evidencias que presentamos en este avance son:</w:t>
+            </w:r>
+          </w:p>
+          <w:p>
+            <w:pPr>
+              <w:spacing w:after="120"/>
               <w:jc w:val="both"/>
             </w:pPr>
             <w:r>
               <w:rPr>
                 <w:rFonts w:ascii="Calibri" w:hAnsi="Calibri" w:cs="Arial"/>
                 <w:b/>
-                <w:sz w:val="22"/>
-                <w:szCs w:val="22"/>
                 <w:lang w:eastAsia="es-CL"/>
               </w:rPr>
               <w:t xml:space="preserve">Código del sistema: </w:t>
@@ -701,24 +682,20 @@
             <w:r>
               <w:rPr>
                 <w:rFonts w:ascii="Calibri" w:hAnsi="Calibri" w:cs="Arial"/>
-                <w:sz w:val="22"/>
-                <w:szCs w:val="22"/>
-                <w:lang w:eastAsia="es-CL"/>
-              </w:rPr>
-              <w:t xml:space="preserve">la API dividida en módulos (FASE 2/avances grupales/backend/src/modules), las vistas de cada rol en React (frontend/src/sistema) y el sitio público con el seguimiento.</w:t>
-            </w:r>
-          </w:p>
-          <w:p>
-            <w:pPr>
-              <w:spacing w:after="120" w:line="259" w:lineRule="auto"/>
+                <w:lang w:eastAsia="es-CL"/>
+              </w:rPr>
+              <w:t>la API dividida en módulos (FASE 2/avances grupales/backend/src/modules), las vistas de cada rol en React (frontend/src/sistema) y el sitio público con el seguimiento.</w:t>
+            </w:r>
+          </w:p>
+          <w:p>
+            <w:pPr>
+              <w:spacing w:after="120"/>
               <w:jc w:val="both"/>
             </w:pPr>
             <w:r>
               <w:rPr>
                 <w:rFonts w:ascii="Calibri" w:hAnsi="Calibri" w:cs="Arial"/>
                 <w:b/>
-                <w:sz w:val="22"/>
-                <w:szCs w:val="22"/>
                 <w:lang w:eastAsia="es-CL"/>
               </w:rPr>
               <w:t xml:space="preserve">Modelo de datos: </w:t>
@@ -726,24 +703,20 @@
             <w:r>
               <w:rPr>
                 <w:rFonts w:ascii="Calibri" w:hAnsi="Calibri" w:cs="Arial"/>
-                <w:sz w:val="22"/>
-                <w:szCs w:val="22"/>
-                <w:lang w:eastAsia="es-CL"/>
-              </w:rPr>
-              <w:t xml:space="preserve">el archivo schema.prisma y la base marexpress_db, con sus claves foráneas y los triggers que controlan el estado de los bultos.</w:t>
-            </w:r>
-          </w:p>
-          <w:p>
-            <w:pPr>
-              <w:spacing w:after="120" w:line="259" w:lineRule="auto"/>
+                <w:lang w:eastAsia="es-CL"/>
+              </w:rPr>
+              <w:t>el archivo schema.prisma y la base marexpress_db, con sus claves foráneas y los triggers que controlan el estado de los bultos.</w:t>
+            </w:r>
+          </w:p>
+          <w:p>
+            <w:pPr>
+              <w:spacing w:after="120"/>
               <w:jc w:val="both"/>
             </w:pPr>
             <w:r>
               <w:rPr>
                 <w:rFonts w:ascii="Calibri" w:hAnsi="Calibri" w:cs="Arial"/>
                 <w:b/>
-                <w:sz w:val="22"/>
-                <w:szCs w:val="22"/>
                 <w:lang w:eastAsia="es-CL"/>
               </w:rPr>
               <w:t xml:space="preserve">Colección de Postman </w:t>
@@ -751,24 +724,20 @@
             <w:r>
               <w:rPr>
                 <w:rFonts w:ascii="Calibri" w:hAnsi="Calibri" w:cs="Arial"/>
-                <w:sz w:val="22"/>
-                <w:szCs w:val="22"/>
-                <w:lang w:eastAsia="es-CL"/>
-              </w:rPr>
-              <w:t xml:space="preserve">(backend/postman): sirve para llamar cada módulo con el rol que corresponde y comprobar que responde bien.</w:t>
-            </w:r>
-          </w:p>
-          <w:p>
-            <w:pPr>
-              <w:spacing w:after="120" w:line="259" w:lineRule="auto"/>
+                <w:lang w:eastAsia="es-CL"/>
+              </w:rPr>
+              <w:t>(backend/postman): sirve para llamar cada módulo con el rol que corresponde y comprobar que responde bien.</w:t>
+            </w:r>
+          </w:p>
+          <w:p>
+            <w:pPr>
+              <w:spacing w:after="120"/>
               <w:jc w:val="both"/>
             </w:pPr>
             <w:r>
               <w:rPr>
                 <w:rFonts w:ascii="Calibri" w:hAnsi="Calibri" w:cs="Arial"/>
                 <w:b/>
-                <w:sz w:val="22"/>
-                <w:szCs w:val="22"/>
                 <w:lang w:eastAsia="es-CL"/>
               </w:rPr>
               <w:t xml:space="preserve">Informes de pruebas, roles y códigos </w:t>
@@ -776,24 +745,20 @@
             <w:r>
               <w:rPr>
                 <w:rFonts w:ascii="Calibri" w:hAnsi="Calibri" w:cs="Arial"/>
-                <w:sz w:val="22"/>
-                <w:szCs w:val="22"/>
-                <w:lang w:eastAsia="es-CL"/>
-              </w:rPr>
-              <w:t xml:space="preserve">(carpeta informes). En las pruebas hicimos 108 comprobaciones contra la API y la base, y las 108 quedaron correctas después de arreglar un error en la entrega del peoneta.</w:t>
-            </w:r>
-          </w:p>
-          <w:p>
-            <w:pPr>
-              <w:spacing w:after="120" w:line="259" w:lineRule="auto"/>
+                <w:lang w:eastAsia="es-CL"/>
+              </w:rPr>
+              <w:t>(carpeta informes). En las pruebas hicimos 108 comprobaciones contra la API y la base, y las 108 quedaron correctas después de arreglar un error en la entrega del peoneta.</w:t>
+            </w:r>
+          </w:p>
+          <w:p>
+            <w:pPr>
+              <w:spacing w:after="120"/>
               <w:jc w:val="both"/>
             </w:pPr>
             <w:r>
               <w:rPr>
                 <w:rFonts w:ascii="Calibri" w:hAnsi="Calibri" w:cs="Arial"/>
                 <w:b/>
-                <w:sz w:val="22"/>
-                <w:szCs w:val="22"/>
                 <w:lang w:eastAsia="es-CL"/>
               </w:rPr>
               <w:t xml:space="preserve">Carta Gantt actualizada al 18 de octubre, </w:t>
@@ -801,26 +766,22 @@
             <w:r>
               <w:rPr>
                 <w:rFonts w:ascii="Calibri" w:hAnsi="Calibri" w:cs="Arial"/>
-                <w:sz w:val="22"/>
-                <w:szCs w:val="22"/>
-                <w:lang w:eastAsia="es-CL"/>
-              </w:rPr>
-              <w:t xml:space="preserve">con el porcentaje real de avance de cada tarea, y el historial de commits en GitHub, donde se ve lo que hizo cada uno.</w:t>
-            </w:r>
-          </w:p>
-          <w:p>
-            <w:pPr>
-              <w:spacing w:after="120" w:line="259" w:lineRule="auto"/>
+                <w:lang w:eastAsia="es-CL"/>
+              </w:rPr>
+              <w:t>con el porcentaje real de avance de cada tarea, y el historial de commits en GitHub, donde se ve lo que hizo cada uno.</w:t>
+            </w:r>
+          </w:p>
+          <w:p>
+            <w:pPr>
+              <w:spacing w:after="120"/>
               <w:jc w:val="both"/>
             </w:pPr>
             <w:r>
               <w:rPr>
                 <w:rFonts w:ascii="Calibri" w:hAnsi="Calibri" w:cs="Arial"/>
-                <w:sz w:val="22"/>
-                <w:szCs w:val="22"/>
-                <w:lang w:eastAsia="es-CL"/>
-              </w:rPr>
-              <w:t xml:space="preserve">Con esto se puede ver el sistema funcionando y no solo descrito. Para cuidar la calidad separamos el sistema en capas y por rol, revisamos los permisos en el backend y no solo en la pantalla, guardamos las contraseñas con hash, pedimos un código por correo para entrar y dejamos que la base de datos bloquee estados que no corresponden (por ejemplo, subir a un camión un bulto que no está en bodega). Lo que nos falta es una batería de pruebas automáticas; por ahora probamos con Postman y revisando las pantallas.</w:t>
+                <w:lang w:eastAsia="es-CL"/>
+              </w:rPr>
+              <w:t>Con esto se puede ver el sistema funcionando y no solo descrito. Para cuidar la calidad separamos el sistema en capas y por rol, revisamos los permisos en el backend y no solo en la pantalla, guardamos las contraseñas con hash, pedimos un código por correo para entrar y dejamos que la base de datos bloquee estados que no corresponden (por ejemplo, subir a un camión un bulto que no está en bodega). Lo que nos falta es una batería de pruebas automáticas; por ahora probamos con Postman y revisando las pantallas.</w:t>
             </w:r>
           </w:p>
         </w:tc>
@@ -898,7 +859,7 @@
                 <w:rFonts w:ascii="Calibri" w:hAnsi="Calibri"/>
                 <w:color w:val="1F3864" w:themeColor="accent1" w:themeShade="80"/>
               </w:rPr>
-              <w:t xml:space="preserve">Examina cuidadosamente tu plan de trabajo, enfocándote especialmente en la columna de estado de avance y ajustes.</w:t>
+              <w:t>Examina cuidadosamente tu plan de trabajo, enfocándote especialmente en la columna de estado de avance y ajustes.</w:t>
             </w:r>
           </w:p>
         </w:tc>
@@ -945,6 +906,7 @@
       <w:tr>
         <w:trPr>
           <w:trHeight w:val="415"/>
+          <w:jc w:val="center"/>
         </w:trPr>
         <w:tc>
           <w:tcPr>
@@ -975,6 +937,7 @@
       <w:tr>
         <w:trPr>
           <w:trHeight w:val="711"/>
+          <w:jc w:val="center"/>
         </w:trPr>
         <w:tc>
           <w:tcPr>
@@ -996,7 +959,7 @@
                 <w:color w:val="1F3864" w:themeColor="accent1" w:themeShade="80"/>
                 <w:sz w:val="18"/>
               </w:rPr>
-              <w:t xml:space="preserve">Competencia o unidades de competencias</w:t>
+              <w:t>Competencia o unidades de competencias</w:t>
             </w:r>
           </w:p>
         </w:tc>
@@ -1181,6 +1144,7 @@
       <w:tr>
         <w:trPr>
           <w:cantSplit/>
+          <w:jc w:val="center"/>
         </w:trPr>
         <w:tc>
           <w:tcPr>
@@ -1188,17 +1152,16 @@
           </w:tcPr>
           <w:p>
             <w:pPr>
-              <w:spacing w:after="120" w:line="259" w:lineRule="auto"/>
-              <w:jc w:val="left"/>
-            </w:pPr>
-            <w:r>
-              <w:rPr>
-                <w:rFonts w:ascii="Calibri" w:hAnsi="Calibri" w:cs="Arial"/>
-                <w:sz w:val="18"/>
-                <w:szCs w:val="18"/>
-                <w:lang w:eastAsia="es-CL"/>
-              </w:rPr>
-              <w:t xml:space="preserve">Competencias 1, 3, 4 y 5</w:t>
+              <w:spacing w:after="120"/>
+            </w:pPr>
+            <w:r>
+              <w:rPr>
+                <w:rFonts w:ascii="Calibri" w:hAnsi="Calibri" w:cs="Arial"/>
+                <w:sz w:val="18"/>
+                <w:szCs w:val="18"/>
+                <w:lang w:eastAsia="es-CL"/>
+              </w:rPr>
+              <w:t>Competencias 1, 3, 4 y 5</w:t>
             </w:r>
           </w:p>
         </w:tc>
@@ -1208,17 +1171,16 @@
           </w:tcPr>
           <w:p>
             <w:pPr>
-              <w:spacing w:after="120" w:line="259" w:lineRule="auto"/>
-              <w:jc w:val="left"/>
-            </w:pPr>
-            <w:r>
-              <w:rPr>
-                <w:rFonts w:ascii="Calibri" w:hAnsi="Calibri" w:cs="Arial"/>
-                <w:sz w:val="18"/>
-                <w:szCs w:val="18"/>
-                <w:lang w:eastAsia="es-CL"/>
-              </w:rPr>
-              <w:t xml:space="preserve">Levantamiento y validación de requerimientos</w:t>
+              <w:spacing w:after="120"/>
+            </w:pPr>
+            <w:r>
+              <w:rPr>
+                <w:rFonts w:ascii="Calibri" w:hAnsi="Calibri" w:cs="Arial"/>
+                <w:sz w:val="18"/>
+                <w:szCs w:val="18"/>
+                <w:lang w:eastAsia="es-CL"/>
+              </w:rPr>
+              <w:t>Levantamiento y validación de requerimientos</w:t>
             </w:r>
           </w:p>
         </w:tc>
@@ -1228,17 +1190,16 @@
           </w:tcPr>
           <w:p>
             <w:pPr>
-              <w:spacing w:after="120" w:line="259" w:lineRule="auto"/>
-              <w:jc w:val="left"/>
-            </w:pPr>
-            <w:r>
-              <w:rPr>
-                <w:rFonts w:ascii="Calibri" w:hAnsi="Calibri" w:cs="Arial"/>
-                <w:sz w:val="18"/>
-                <w:szCs w:val="18"/>
-                <w:lang w:eastAsia="es-CL"/>
-              </w:rPr>
-              <w:t xml:space="preserve">Reuniones, documentación, GitHub</w:t>
+              <w:spacing w:after="120"/>
+            </w:pPr>
+            <w:r>
+              <w:rPr>
+                <w:rFonts w:ascii="Calibri" w:hAnsi="Calibri" w:cs="Arial"/>
+                <w:sz w:val="18"/>
+                <w:szCs w:val="18"/>
+                <w:lang w:eastAsia="es-CL"/>
+              </w:rPr>
+              <w:t>Reuniones, documentación, GitHub</w:t>
             </w:r>
           </w:p>
         </w:tc>
@@ -1248,17 +1209,16 @@
           </w:tcPr>
           <w:p>
             <w:pPr>
-              <w:spacing w:after="120" w:line="259" w:lineRule="auto"/>
-              <w:jc w:val="left"/>
-            </w:pPr>
-            <w:r>
-              <w:rPr>
-                <w:rFonts w:ascii="Calibri" w:hAnsi="Calibri" w:cs="Arial"/>
-                <w:sz w:val="18"/>
-                <w:szCs w:val="18"/>
-                <w:lang w:eastAsia="es-CL"/>
-              </w:rPr>
-              <w:t xml:space="preserve">1 semana</w:t>
+              <w:spacing w:after="120"/>
+            </w:pPr>
+            <w:r>
+              <w:rPr>
+                <w:rFonts w:ascii="Calibri" w:hAnsi="Calibri" w:cs="Arial"/>
+                <w:sz w:val="18"/>
+                <w:szCs w:val="18"/>
+                <w:lang w:eastAsia="es-CL"/>
+              </w:rPr>
+              <w:t>1 semana</w:t>
             </w:r>
           </w:p>
         </w:tc>
@@ -1268,17 +1228,16 @@
           </w:tcPr>
           <w:p>
             <w:pPr>
-              <w:spacing w:after="120" w:line="259" w:lineRule="auto"/>
-              <w:jc w:val="left"/>
-            </w:pPr>
-            <w:r>
-              <w:rPr>
-                <w:rFonts w:ascii="Calibri" w:hAnsi="Calibri" w:cs="Arial"/>
-                <w:sz w:val="18"/>
-                <w:szCs w:val="18"/>
-                <w:lang w:eastAsia="es-CL"/>
-              </w:rPr>
-              <w:t xml:space="preserve">Raúl y Benjamín</w:t>
+              <w:spacing w:after="120"/>
+            </w:pPr>
+            <w:r>
+              <w:rPr>
+                <w:rFonts w:ascii="Calibri" w:hAnsi="Calibri" w:cs="Arial"/>
+                <w:sz w:val="18"/>
+                <w:szCs w:val="18"/>
+                <w:lang w:eastAsia="es-CL"/>
+              </w:rPr>
+              <w:t>Raúl y Benjamín</w:t>
             </w:r>
           </w:p>
         </w:tc>
@@ -1288,17 +1247,16 @@
           </w:tcPr>
           <w:p>
             <w:pPr>
-              <w:spacing w:after="120" w:line="259" w:lineRule="auto"/>
-              <w:jc w:val="left"/>
-            </w:pPr>
-            <w:r>
-              <w:rPr>
-                <w:rFonts w:ascii="Calibri" w:hAnsi="Calibri" w:cs="Arial"/>
-                <w:sz w:val="18"/>
-                <w:szCs w:val="18"/>
-                <w:lang w:eastAsia="es-CL"/>
-              </w:rPr>
-              <w:t xml:space="preserve">Las reglas de cobro se terminaron de aclarar al usar el sistema</w:t>
+              <w:spacing w:after="120"/>
+            </w:pPr>
+            <w:r>
+              <w:rPr>
+                <w:rFonts w:ascii="Calibri" w:hAnsi="Calibri" w:cs="Arial"/>
+                <w:sz w:val="18"/>
+                <w:szCs w:val="18"/>
+                <w:lang w:eastAsia="es-CL"/>
+              </w:rPr>
+              <w:t>Las reglas de cobro se terminaron de aclarar al usar el sistema</w:t>
             </w:r>
           </w:p>
         </w:tc>
@@ -1308,17 +1266,16 @@
           </w:tcPr>
           <w:p>
             <w:pPr>
-              <w:spacing w:after="120" w:line="259" w:lineRule="auto"/>
-              <w:jc w:val="left"/>
-            </w:pPr>
-            <w:r>
-              <w:rPr>
-                <w:rFonts w:ascii="Calibri" w:hAnsi="Calibri" w:cs="Arial"/>
-                <w:sz w:val="18"/>
-                <w:szCs w:val="18"/>
-                <w:lang w:eastAsia="es-CL"/>
-              </w:rPr>
-              <w:t xml:space="preserve">Completado</w:t>
+              <w:spacing w:after="120"/>
+            </w:pPr>
+            <w:r>
+              <w:rPr>
+                <w:rFonts w:ascii="Calibri" w:hAnsi="Calibri" w:cs="Arial"/>
+                <w:sz w:val="18"/>
+                <w:szCs w:val="18"/>
+                <w:lang w:eastAsia="es-CL"/>
+              </w:rPr>
+              <w:t>Completado</w:t>
             </w:r>
           </w:p>
         </w:tc>
@@ -1328,17 +1285,16 @@
           </w:tcPr>
           <w:p>
             <w:pPr>
-              <w:spacing w:after="120" w:line="259" w:lineRule="auto"/>
-              <w:jc w:val="left"/>
-            </w:pPr>
-            <w:r>
-              <w:rPr>
-                <w:rFonts w:ascii="Calibri" w:hAnsi="Calibri" w:cs="Arial"/>
-                <w:sz w:val="18"/>
-                <w:szCs w:val="18"/>
-                <w:lang w:eastAsia="es-CL"/>
-              </w:rPr>
-              <w:t xml:space="preserve">Se agregaron reglas de caja y cuadre</w:t>
+              <w:spacing w:after="120"/>
+            </w:pPr>
+            <w:r>
+              <w:rPr>
+                <w:rFonts w:ascii="Calibri" w:hAnsi="Calibri" w:cs="Arial"/>
+                <w:sz w:val="18"/>
+                <w:szCs w:val="18"/>
+                <w:lang w:eastAsia="es-CL"/>
+              </w:rPr>
+              <w:t>Se agregaron reglas de caja y cuadre</w:t>
             </w:r>
           </w:p>
         </w:tc>
@@ -1346,6 +1302,7 @@
       <w:tr>
         <w:trPr>
           <w:cantSplit/>
+          <w:jc w:val="center"/>
         </w:trPr>
         <w:tc>
           <w:tcPr>
@@ -1353,17 +1310,16 @@
           </w:tcPr>
           <w:p>
             <w:pPr>
-              <w:spacing w:after="120" w:line="259" w:lineRule="auto"/>
-              <w:jc w:val="left"/>
-            </w:pPr>
-            <w:r>
-              <w:rPr>
-                <w:rFonts w:ascii="Calibri" w:hAnsi="Calibri" w:cs="Arial"/>
-                <w:sz w:val="18"/>
-                <w:szCs w:val="18"/>
-                <w:lang w:eastAsia="es-CL"/>
-              </w:rPr>
-              <w:t xml:space="preserve">Competencias 1, 2, 3 y 5</w:t>
+              <w:spacing w:after="120"/>
+            </w:pPr>
+            <w:r>
+              <w:rPr>
+                <w:rFonts w:ascii="Calibri" w:hAnsi="Calibri" w:cs="Arial"/>
+                <w:sz w:val="18"/>
+                <w:szCs w:val="18"/>
+                <w:lang w:eastAsia="es-CL"/>
+              </w:rPr>
+              <w:t>Competencias 1, 2, 3 y 5</w:t>
             </w:r>
           </w:p>
         </w:tc>
@@ -1373,17 +1329,16 @@
           </w:tcPr>
           <w:p>
             <w:pPr>
-              <w:spacing w:after="120" w:line="259" w:lineRule="auto"/>
-              <w:jc w:val="left"/>
-            </w:pPr>
-            <w:r>
-              <w:rPr>
-                <w:rFonts w:ascii="Calibri" w:hAnsi="Calibri" w:cs="Arial"/>
-                <w:sz w:val="18"/>
-                <w:szCs w:val="18"/>
-                <w:lang w:eastAsia="es-CL"/>
-              </w:rPr>
-              <w:t xml:space="preserve">Arquitectura y base de datos</w:t>
+              <w:spacing w:after="120"/>
+            </w:pPr>
+            <w:r>
+              <w:rPr>
+                <w:rFonts w:ascii="Calibri" w:hAnsi="Calibri" w:cs="Arial"/>
+                <w:sz w:val="18"/>
+                <w:szCs w:val="18"/>
+                <w:lang w:eastAsia="es-CL"/>
+              </w:rPr>
+              <w:t>Arquitectura y base de datos</w:t>
             </w:r>
           </w:p>
         </w:tc>
@@ -1393,17 +1348,19 @@
           </w:tcPr>
           <w:p>
             <w:pPr>
-              <w:spacing w:after="120" w:line="259" w:lineRule="auto"/>
-              <w:jc w:val="left"/>
-            </w:pPr>
-            <w:r>
-              <w:rPr>
-                <w:rFonts w:ascii="Calibri" w:hAnsi="Calibri" w:cs="Arial"/>
-                <w:sz w:val="18"/>
-                <w:szCs w:val="18"/>
-                <w:lang w:eastAsia="es-CL"/>
-              </w:rPr>
-              <w:t xml:space="preserve">MySQL, Workbench, Prisma, Node.js</w:t>
+              <w:spacing w:after="120"/>
+              <w:rPr>
+                <w:lang w:val="en-US"/>
+              </w:rPr>
+            </w:pPr>
+            <w:r>
+              <w:rPr>
+                <w:rFonts w:ascii="Calibri" w:hAnsi="Calibri" w:cs="Arial"/>
+                <w:sz w:val="18"/>
+                <w:szCs w:val="18"/>
+                <w:lang w:val="en-US" w:eastAsia="es-CL"/>
+              </w:rPr>
+              <w:t>MySQL, Workbench, Prisma, Node.js</w:t>
             </w:r>
           </w:p>
         </w:tc>
@@ -1413,17 +1370,16 @@
           </w:tcPr>
           <w:p>
             <w:pPr>
-              <w:spacing w:after="120" w:line="259" w:lineRule="auto"/>
-              <w:jc w:val="left"/>
-            </w:pPr>
-            <w:r>
-              <w:rPr>
-                <w:rFonts w:ascii="Calibri" w:hAnsi="Calibri" w:cs="Arial"/>
-                <w:sz w:val="18"/>
-                <w:szCs w:val="18"/>
-                <w:lang w:eastAsia="es-CL"/>
-              </w:rPr>
-              <w:t xml:space="preserve">1 semana</w:t>
+              <w:spacing w:after="120"/>
+            </w:pPr>
+            <w:r>
+              <w:rPr>
+                <w:rFonts w:ascii="Calibri" w:hAnsi="Calibri" w:cs="Arial"/>
+                <w:sz w:val="18"/>
+                <w:szCs w:val="18"/>
+                <w:lang w:eastAsia="es-CL"/>
+              </w:rPr>
+              <w:t>1 semana</w:t>
             </w:r>
           </w:p>
         </w:tc>
@@ -1433,17 +1389,16 @@
           </w:tcPr>
           <w:p>
             <w:pPr>
-              <w:spacing w:after="120" w:line="259" w:lineRule="auto"/>
-              <w:jc w:val="left"/>
-            </w:pPr>
-            <w:r>
-              <w:rPr>
-                <w:rFonts w:ascii="Calibri" w:hAnsi="Calibri" w:cs="Arial"/>
-                <w:sz w:val="18"/>
-                <w:szCs w:val="18"/>
-                <w:lang w:eastAsia="es-CL"/>
-              </w:rPr>
-              <w:t xml:space="preserve">Raúl (revisión de Benjamín)</w:t>
+              <w:spacing w:after="120"/>
+            </w:pPr>
+            <w:r>
+              <w:rPr>
+                <w:rFonts w:ascii="Calibri" w:hAnsi="Calibri" w:cs="Arial"/>
+                <w:sz w:val="18"/>
+                <w:szCs w:val="18"/>
+                <w:lang w:eastAsia="es-CL"/>
+              </w:rPr>
+              <w:t>Raúl (revisión de Benjamín)</w:t>
             </w:r>
           </w:p>
         </w:tc>
@@ -1453,17 +1408,16 @@
           </w:tcPr>
           <w:p>
             <w:pPr>
-              <w:spacing w:after="120" w:line="259" w:lineRule="auto"/>
-              <w:jc w:val="left"/>
-            </w:pPr>
-            <w:r>
-              <w:rPr>
-                <w:rFonts w:ascii="Calibri" w:hAnsi="Calibri" w:cs="Arial"/>
-                <w:sz w:val="18"/>
-                <w:szCs w:val="18"/>
-                <w:lang w:eastAsia="es-CL"/>
-              </w:rPr>
-              <w:t xml:space="preserve">El modelo creció más de lo planeado</w:t>
+              <w:spacing w:after="120"/>
+            </w:pPr>
+            <w:r>
+              <w:rPr>
+                <w:rFonts w:ascii="Calibri" w:hAnsi="Calibri" w:cs="Arial"/>
+                <w:sz w:val="18"/>
+                <w:szCs w:val="18"/>
+                <w:lang w:eastAsia="es-CL"/>
+              </w:rPr>
+              <w:t>El modelo creció más de lo planeado</w:t>
             </w:r>
           </w:p>
         </w:tc>
@@ -1473,17 +1427,16 @@
           </w:tcPr>
           <w:p>
             <w:pPr>
-              <w:spacing w:after="120" w:line="259" w:lineRule="auto"/>
-              <w:jc w:val="left"/>
-            </w:pPr>
-            <w:r>
-              <w:rPr>
-                <w:rFonts w:ascii="Calibri" w:hAnsi="Calibri" w:cs="Arial"/>
-                <w:sz w:val="18"/>
-                <w:szCs w:val="18"/>
-                <w:lang w:eastAsia="es-CL"/>
-              </w:rPr>
-              <w:t xml:space="preserve">Completado</w:t>
+              <w:spacing w:after="120"/>
+            </w:pPr>
+            <w:r>
+              <w:rPr>
+                <w:rFonts w:ascii="Calibri" w:hAnsi="Calibri" w:cs="Arial"/>
+                <w:sz w:val="18"/>
+                <w:szCs w:val="18"/>
+                <w:lang w:eastAsia="es-CL"/>
+              </w:rPr>
+              <w:t>Completado</w:t>
             </w:r>
           </w:p>
         </w:tc>
@@ -1493,17 +1446,16 @@
           </w:tcPr>
           <w:p>
             <w:pPr>
-              <w:spacing w:after="120" w:line="259" w:lineRule="auto"/>
-              <w:jc w:val="left"/>
-            </w:pPr>
-            <w:r>
-              <w:rPr>
-                <w:rFonts w:ascii="Calibri" w:hAnsi="Calibri" w:cs="Arial"/>
-                <w:sz w:val="18"/>
-                <w:szCs w:val="18"/>
-                <w:lang w:eastAsia="es-CL"/>
-              </w:rPr>
-              <w:t xml:space="preserve">Se agregaron tablas de bultos, alertas y cotizaciones</w:t>
+              <w:spacing w:after="120"/>
+            </w:pPr>
+            <w:r>
+              <w:rPr>
+                <w:rFonts w:ascii="Calibri" w:hAnsi="Calibri" w:cs="Arial"/>
+                <w:sz w:val="18"/>
+                <w:szCs w:val="18"/>
+                <w:lang w:eastAsia="es-CL"/>
+              </w:rPr>
+              <w:t>Se agregaron tablas de bultos, alertas y cotizaciones</w:t>
             </w:r>
           </w:p>
         </w:tc>
@@ -1511,6 +1463,7 @@
       <w:tr>
         <w:trPr>
           <w:cantSplit/>
+          <w:jc w:val="center"/>
         </w:trPr>
         <w:tc>
           <w:tcPr>
@@ -1518,17 +1471,16 @@
           </w:tcPr>
           <w:p>
             <w:pPr>
-              <w:spacing w:after="120" w:line="259" w:lineRule="auto"/>
-              <w:jc w:val="left"/>
-            </w:pPr>
-            <w:r>
-              <w:rPr>
-                <w:rFonts w:ascii="Calibri" w:hAnsi="Calibri" w:cs="Arial"/>
-                <w:sz w:val="18"/>
-                <w:szCs w:val="18"/>
-                <w:lang w:eastAsia="es-CL"/>
-              </w:rPr>
-              <w:t xml:space="preserve">Competencias 1, 2 y 5</w:t>
+              <w:spacing w:after="120"/>
+            </w:pPr>
+            <w:r>
+              <w:rPr>
+                <w:rFonts w:ascii="Calibri" w:hAnsi="Calibri" w:cs="Arial"/>
+                <w:sz w:val="18"/>
+                <w:szCs w:val="18"/>
+                <w:lang w:eastAsia="es-CL"/>
+              </w:rPr>
+              <w:t>Competencias 1, 2 y 5</w:t>
             </w:r>
           </w:p>
         </w:tc>
@@ -1538,17 +1490,16 @@
           </w:tcPr>
           <w:p>
             <w:pPr>
-              <w:spacing w:after="120" w:line="259" w:lineRule="auto"/>
-              <w:jc w:val="left"/>
-            </w:pPr>
-            <w:r>
-              <w:rPr>
-                <w:rFonts w:ascii="Calibri" w:hAnsi="Calibri" w:cs="Arial"/>
-                <w:sz w:val="18"/>
-                <w:szCs w:val="18"/>
-                <w:lang w:eastAsia="es-CL"/>
-              </w:rPr>
-              <w:t xml:space="preserve">Prototipos, interfaz y navegación</w:t>
+              <w:spacing w:after="120"/>
+            </w:pPr>
+            <w:r>
+              <w:rPr>
+                <w:rFonts w:ascii="Calibri" w:hAnsi="Calibri" w:cs="Arial"/>
+                <w:sz w:val="18"/>
+                <w:szCs w:val="18"/>
+                <w:lang w:eastAsia="es-CL"/>
+              </w:rPr>
+              <w:t>Prototipos, interfaz y navegación</w:t>
             </w:r>
           </w:p>
         </w:tc>
@@ -1558,17 +1509,16 @@
           </w:tcPr>
           <w:p>
             <w:pPr>
-              <w:spacing w:after="120" w:line="259" w:lineRule="auto"/>
-              <w:jc w:val="left"/>
-            </w:pPr>
-            <w:r>
-              <w:rPr>
-                <w:rFonts w:ascii="Calibri" w:hAnsi="Calibri" w:cs="Arial"/>
-                <w:sz w:val="18"/>
-                <w:szCs w:val="18"/>
-                <w:lang w:eastAsia="es-CL"/>
-              </w:rPr>
-              <w:t xml:space="preserve">HTML, CSS, React, Tailwind</w:t>
+              <w:spacing w:after="120"/>
+            </w:pPr>
+            <w:r>
+              <w:rPr>
+                <w:rFonts w:ascii="Calibri" w:hAnsi="Calibri" w:cs="Arial"/>
+                <w:sz w:val="18"/>
+                <w:szCs w:val="18"/>
+                <w:lang w:eastAsia="es-CL"/>
+              </w:rPr>
+              <w:t>HTML, CSS, React, Tailwind</w:t>
             </w:r>
           </w:p>
         </w:tc>
@@ -1578,17 +1528,16 @@
           </w:tcPr>
           <w:p>
             <w:pPr>
-              <w:spacing w:after="120" w:line="259" w:lineRule="auto"/>
-              <w:jc w:val="left"/>
-            </w:pPr>
-            <w:r>
-              <w:rPr>
-                <w:rFonts w:ascii="Calibri" w:hAnsi="Calibri" w:cs="Arial"/>
-                <w:sz w:val="18"/>
-                <w:szCs w:val="18"/>
-                <w:lang w:eastAsia="es-CL"/>
-              </w:rPr>
-              <w:t xml:space="preserve">1 semana</w:t>
+              <w:spacing w:after="120"/>
+            </w:pPr>
+            <w:r>
+              <w:rPr>
+                <w:rFonts w:ascii="Calibri" w:hAnsi="Calibri" w:cs="Arial"/>
+                <w:sz w:val="18"/>
+                <w:szCs w:val="18"/>
+                <w:lang w:eastAsia="es-CL"/>
+              </w:rPr>
+              <w:t>1 semana</w:t>
             </w:r>
           </w:p>
         </w:tc>
@@ -1598,17 +1547,16 @@
           </w:tcPr>
           <w:p>
             <w:pPr>
-              <w:spacing w:after="120" w:line="259" w:lineRule="auto"/>
-              <w:jc w:val="left"/>
-            </w:pPr>
-            <w:r>
-              <w:rPr>
-                <w:rFonts w:ascii="Calibri" w:hAnsi="Calibri" w:cs="Arial"/>
-                <w:sz w:val="18"/>
-                <w:szCs w:val="18"/>
-                <w:lang w:eastAsia="es-CL"/>
-              </w:rPr>
-              <w:t xml:space="preserve">Benjamín (apoyo de Raúl)</w:t>
+              <w:spacing w:after="120"/>
+            </w:pPr>
+            <w:r>
+              <w:rPr>
+                <w:rFonts w:ascii="Calibri" w:hAnsi="Calibri" w:cs="Arial"/>
+                <w:sz w:val="18"/>
+                <w:szCs w:val="18"/>
+                <w:lang w:eastAsia="es-CL"/>
+              </w:rPr>
+              <w:t>Benjamín (apoyo de Raúl)</w:t>
             </w:r>
           </w:p>
         </w:tc>
@@ -1618,17 +1566,16 @@
           </w:tcPr>
           <w:p>
             <w:pPr>
-              <w:spacing w:after="120" w:line="259" w:lineRule="auto"/>
-              <w:jc w:val="left"/>
-            </w:pPr>
-            <w:r>
-              <w:rPr>
-                <w:rFonts w:ascii="Calibri" w:hAnsi="Calibri" w:cs="Arial"/>
-                <w:sz w:val="18"/>
-                <w:szCs w:val="18"/>
-                <w:lang w:eastAsia="es-CL"/>
-              </w:rPr>
-              <w:t xml:space="preserve">Primero se hizo un prototipo en HTML para mostrar avances</w:t>
+              <w:spacing w:after="120"/>
+            </w:pPr>
+            <w:r>
+              <w:rPr>
+                <w:rFonts w:ascii="Calibri" w:hAnsi="Calibri" w:cs="Arial"/>
+                <w:sz w:val="18"/>
+                <w:szCs w:val="18"/>
+                <w:lang w:eastAsia="es-CL"/>
+              </w:rPr>
+              <w:t>Primero se hizo un prototipo en HTML para mostrar avances</w:t>
             </w:r>
           </w:p>
         </w:tc>
@@ -1638,17 +1585,16 @@
           </w:tcPr>
           <w:p>
             <w:pPr>
-              <w:spacing w:after="120" w:line="259" w:lineRule="auto"/>
-              <w:jc w:val="left"/>
-            </w:pPr>
-            <w:r>
-              <w:rPr>
-                <w:rFonts w:ascii="Calibri" w:hAnsi="Calibri" w:cs="Arial"/>
-                <w:sz w:val="18"/>
-                <w:szCs w:val="18"/>
-                <w:lang w:eastAsia="es-CL"/>
-              </w:rPr>
-              <w:t xml:space="preserve">Completado</w:t>
+              <w:spacing w:after="120"/>
+            </w:pPr>
+            <w:r>
+              <w:rPr>
+                <w:rFonts w:ascii="Calibri" w:hAnsi="Calibri" w:cs="Arial"/>
+                <w:sz w:val="18"/>
+                <w:szCs w:val="18"/>
+                <w:lang w:eastAsia="es-CL"/>
+              </w:rPr>
+              <w:t>Completado</w:t>
             </w:r>
           </w:p>
         </w:tc>
@@ -1658,17 +1604,16 @@
           </w:tcPr>
           <w:p>
             <w:pPr>
-              <w:spacing w:after="120" w:line="259" w:lineRule="auto"/>
-              <w:jc w:val="left"/>
-            </w:pPr>
-            <w:r>
-              <w:rPr>
-                <w:rFonts w:ascii="Calibri" w:hAnsi="Calibri" w:cs="Arial"/>
-                <w:sz w:val="18"/>
-                <w:szCs w:val="18"/>
-                <w:lang w:eastAsia="es-CL"/>
-              </w:rPr>
-              <w:t xml:space="preserve">Se pasó del prototipo a React</w:t>
+              <w:spacing w:after="120"/>
+            </w:pPr>
+            <w:r>
+              <w:rPr>
+                <w:rFonts w:ascii="Calibri" w:hAnsi="Calibri" w:cs="Arial"/>
+                <w:sz w:val="18"/>
+                <w:szCs w:val="18"/>
+                <w:lang w:eastAsia="es-CL"/>
+              </w:rPr>
+              <w:t>Se pasó del prototipo a React</w:t>
             </w:r>
           </w:p>
         </w:tc>
@@ -1676,6 +1621,7 @@
       <w:tr>
         <w:trPr>
           <w:cantSplit/>
+          <w:jc w:val="center"/>
         </w:trPr>
         <w:tc>
           <w:tcPr>
@@ -1683,17 +1629,16 @@
           </w:tcPr>
           <w:p>
             <w:pPr>
-              <w:spacing w:after="120" w:line="259" w:lineRule="auto"/>
-              <w:jc w:val="left"/>
-            </w:pPr>
-            <w:r>
-              <w:rPr>
-                <w:rFonts w:ascii="Calibri" w:hAnsi="Calibri" w:cs="Arial"/>
-                <w:sz w:val="18"/>
-                <w:szCs w:val="18"/>
-                <w:lang w:eastAsia="es-CL"/>
-              </w:rPr>
-              <w:t xml:space="preserve">Competencias 1, 2 y 5</w:t>
+              <w:spacing w:after="120"/>
+            </w:pPr>
+            <w:r>
+              <w:rPr>
+                <w:rFonts w:ascii="Calibri" w:hAnsi="Calibri" w:cs="Arial"/>
+                <w:sz w:val="18"/>
+                <w:szCs w:val="18"/>
+                <w:lang w:eastAsia="es-CL"/>
+              </w:rPr>
+              <w:t>Competencias 1, 2 y 5</w:t>
             </w:r>
           </w:p>
         </w:tc>
@@ -1703,17 +1648,16 @@
           </w:tcPr>
           <w:p>
             <w:pPr>
-              <w:spacing w:after="120" w:line="259" w:lineRule="auto"/>
-              <w:jc w:val="left"/>
-            </w:pPr>
-            <w:r>
-              <w:rPr>
-                <w:rFonts w:ascii="Calibri" w:hAnsi="Calibri" w:cs="Arial"/>
-                <w:sz w:val="18"/>
-                <w:szCs w:val="18"/>
-                <w:lang w:eastAsia="es-CL"/>
-              </w:rPr>
-              <w:t xml:space="preserve">Autenticación y maestros</w:t>
+              <w:spacing w:after="120"/>
+            </w:pPr>
+            <w:r>
+              <w:rPr>
+                <w:rFonts w:ascii="Calibri" w:hAnsi="Calibri" w:cs="Arial"/>
+                <w:sz w:val="18"/>
+                <w:szCs w:val="18"/>
+                <w:lang w:eastAsia="es-CL"/>
+              </w:rPr>
+              <w:t>Autenticación y maestros</w:t>
             </w:r>
           </w:p>
         </w:tc>
@@ -1723,17 +1667,16 @@
           </w:tcPr>
           <w:p>
             <w:pPr>
-              <w:spacing w:after="120" w:line="259" w:lineRule="auto"/>
-              <w:jc w:val="left"/>
-            </w:pPr>
-            <w:r>
-              <w:rPr>
-                <w:rFonts w:ascii="Calibri" w:hAnsi="Calibri" w:cs="Arial"/>
-                <w:sz w:val="18"/>
-                <w:szCs w:val="18"/>
-                <w:lang w:eastAsia="es-CL"/>
-              </w:rPr>
-              <w:t xml:space="preserve">Node.js, Prisma, MySQL, React</w:t>
+              <w:spacing w:after="120"/>
+            </w:pPr>
+            <w:r>
+              <w:rPr>
+                <w:rFonts w:ascii="Calibri" w:hAnsi="Calibri" w:cs="Arial"/>
+                <w:sz w:val="18"/>
+                <w:szCs w:val="18"/>
+                <w:lang w:eastAsia="es-CL"/>
+              </w:rPr>
+              <w:t>Node.js, Prisma, MySQL, React</w:t>
             </w:r>
           </w:p>
         </w:tc>
@@ -1743,17 +1686,16 @@
           </w:tcPr>
           <w:p>
             <w:pPr>
-              <w:spacing w:after="120" w:line="259" w:lineRule="auto"/>
-              <w:jc w:val="left"/>
-            </w:pPr>
-            <w:r>
-              <w:rPr>
-                <w:rFonts w:ascii="Calibri" w:hAnsi="Calibri" w:cs="Arial"/>
-                <w:sz w:val="18"/>
-                <w:szCs w:val="18"/>
-                <w:lang w:eastAsia="es-CL"/>
-              </w:rPr>
-              <w:t xml:space="preserve">1 semana</w:t>
+              <w:spacing w:after="120"/>
+            </w:pPr>
+            <w:r>
+              <w:rPr>
+                <w:rFonts w:ascii="Calibri" w:hAnsi="Calibri" w:cs="Arial"/>
+                <w:sz w:val="18"/>
+                <w:szCs w:val="18"/>
+                <w:lang w:eastAsia="es-CL"/>
+              </w:rPr>
+              <w:t>1 semana</w:t>
             </w:r>
           </w:p>
         </w:tc>
@@ -1763,17 +1705,16 @@
           </w:tcPr>
           <w:p>
             <w:pPr>
-              <w:spacing w:after="120" w:line="259" w:lineRule="auto"/>
-              <w:jc w:val="left"/>
-            </w:pPr>
-            <w:r>
-              <w:rPr>
-                <w:rFonts w:ascii="Calibri" w:hAnsi="Calibri" w:cs="Arial"/>
-                <w:sz w:val="18"/>
-                <w:szCs w:val="18"/>
-                <w:lang w:eastAsia="es-CL"/>
-              </w:rPr>
-              <w:t xml:space="preserve">Raúl y Benjamín</w:t>
+              <w:spacing w:after="120"/>
+            </w:pPr>
+            <w:r>
+              <w:rPr>
+                <w:rFonts w:ascii="Calibri" w:hAnsi="Calibri" w:cs="Arial"/>
+                <w:sz w:val="18"/>
+                <w:szCs w:val="18"/>
+                <w:lang w:eastAsia="es-CL"/>
+              </w:rPr>
+              <w:t>Raúl y Benjamín</w:t>
             </w:r>
           </w:p>
         </w:tc>
@@ -1783,17 +1724,16 @@
           </w:tcPr>
           <w:p>
             <w:pPr>
-              <w:spacing w:after="120" w:line="259" w:lineRule="auto"/>
-              <w:jc w:val="left"/>
-            </w:pPr>
-            <w:r>
-              <w:rPr>
-                <w:rFonts w:ascii="Calibri" w:hAnsi="Calibri" w:cs="Arial"/>
-                <w:sz w:val="18"/>
-                <w:szCs w:val="18"/>
-                <w:lang w:eastAsia="es-CL"/>
-              </w:rPr>
-              <w:t xml:space="preserve">Sin mayores problemas</w:t>
+              <w:spacing w:after="120"/>
+            </w:pPr>
+            <w:r>
+              <w:rPr>
+                <w:rFonts w:ascii="Calibri" w:hAnsi="Calibri" w:cs="Arial"/>
+                <w:sz w:val="18"/>
+                <w:szCs w:val="18"/>
+                <w:lang w:eastAsia="es-CL"/>
+              </w:rPr>
+              <w:t>Sin mayores problemas</w:t>
             </w:r>
           </w:p>
         </w:tc>
@@ -1803,17 +1743,16 @@
           </w:tcPr>
           <w:p>
             <w:pPr>
-              <w:spacing w:after="120" w:line="259" w:lineRule="auto"/>
-              <w:jc w:val="left"/>
-            </w:pPr>
-            <w:r>
-              <w:rPr>
-                <w:rFonts w:ascii="Calibri" w:hAnsi="Calibri" w:cs="Arial"/>
-                <w:sz w:val="18"/>
-                <w:szCs w:val="18"/>
-                <w:lang w:eastAsia="es-CL"/>
-              </w:rPr>
-              <w:t xml:space="preserve">Completado</w:t>
+              <w:spacing w:after="120"/>
+            </w:pPr>
+            <w:r>
+              <w:rPr>
+                <w:rFonts w:ascii="Calibri" w:hAnsi="Calibri" w:cs="Arial"/>
+                <w:sz w:val="18"/>
+                <w:szCs w:val="18"/>
+                <w:lang w:eastAsia="es-CL"/>
+              </w:rPr>
+              <w:t>Completado</w:t>
             </w:r>
           </w:p>
         </w:tc>
@@ -1823,17 +1762,16 @@
           </w:tcPr>
           <w:p>
             <w:pPr>
-              <w:spacing w:after="120" w:line="259" w:lineRule="auto"/>
-              <w:jc w:val="left"/>
-            </w:pPr>
-            <w:r>
-              <w:rPr>
-                <w:rFonts w:ascii="Calibri" w:hAnsi="Calibri" w:cs="Arial"/>
-                <w:sz w:val="18"/>
-                <w:szCs w:val="18"/>
-                <w:lang w:eastAsia="es-CL"/>
-              </w:rPr>
-              <w:t xml:space="preserve">Se sumó el código de verificación por correo</w:t>
+              <w:spacing w:after="120"/>
+            </w:pPr>
+            <w:r>
+              <w:rPr>
+                <w:rFonts w:ascii="Calibri" w:hAnsi="Calibri" w:cs="Arial"/>
+                <w:sz w:val="18"/>
+                <w:szCs w:val="18"/>
+                <w:lang w:eastAsia="es-CL"/>
+              </w:rPr>
+              <w:t>Se sumó el código de verificación por correo</w:t>
             </w:r>
           </w:p>
         </w:tc>
@@ -1841,6 +1779,7 @@
       <w:tr>
         <w:trPr>
           <w:cantSplit/>
+          <w:jc w:val="center"/>
         </w:trPr>
         <w:tc>
           <w:tcPr>
@@ -1848,17 +1787,16 @@
           </w:tcPr>
           <w:p>
             <w:pPr>
-              <w:spacing w:after="120" w:line="259" w:lineRule="auto"/>
-              <w:jc w:val="left"/>
-            </w:pPr>
-            <w:r>
-              <w:rPr>
-                <w:rFonts w:ascii="Calibri" w:hAnsi="Calibri" w:cs="Arial"/>
-                <w:sz w:val="18"/>
-                <w:szCs w:val="18"/>
-                <w:lang w:eastAsia="es-CL"/>
-              </w:rPr>
-              <w:t xml:space="preserve">Competencias 1, 2, 3 y 5</w:t>
+              <w:spacing w:after="120"/>
+            </w:pPr>
+            <w:r>
+              <w:rPr>
+                <w:rFonts w:ascii="Calibri" w:hAnsi="Calibri" w:cs="Arial"/>
+                <w:sz w:val="18"/>
+                <w:szCs w:val="18"/>
+                <w:lang w:eastAsia="es-CL"/>
+              </w:rPr>
+              <w:t>Competencias 1, 2, 3 y 5</w:t>
             </w:r>
           </w:p>
         </w:tc>
@@ -1868,17 +1806,16 @@
           </w:tcPr>
           <w:p>
             <w:pPr>
-              <w:spacing w:after="120" w:line="259" w:lineRule="auto"/>
-              <w:jc w:val="left"/>
-            </w:pPr>
-            <w:r>
-              <w:rPr>
-                <w:rFonts w:ascii="Calibri" w:hAnsi="Calibri" w:cs="Arial"/>
-                <w:sz w:val="18"/>
-                <w:szCs w:val="18"/>
-                <w:lang w:eastAsia="es-CL"/>
-              </w:rPr>
-              <w:t xml:space="preserve">Módulo de Orden de Transporte</w:t>
+              <w:spacing w:after="120"/>
+            </w:pPr>
+            <w:r>
+              <w:rPr>
+                <w:rFonts w:ascii="Calibri" w:hAnsi="Calibri" w:cs="Arial"/>
+                <w:sz w:val="18"/>
+                <w:szCs w:val="18"/>
+                <w:lang w:eastAsia="es-CL"/>
+              </w:rPr>
+              <w:t>Módulo de Orden de Transporte</w:t>
             </w:r>
           </w:p>
         </w:tc>
@@ -1888,17 +1825,16 @@
           </w:tcPr>
           <w:p>
             <w:pPr>
-              <w:spacing w:after="120" w:line="259" w:lineRule="auto"/>
-              <w:jc w:val="left"/>
-            </w:pPr>
-            <w:r>
-              <w:rPr>
-                <w:rFonts w:ascii="Calibri" w:hAnsi="Calibri" w:cs="Arial"/>
-                <w:sz w:val="18"/>
-                <w:szCs w:val="18"/>
-                <w:lang w:eastAsia="es-CL"/>
-              </w:rPr>
-              <w:t xml:space="preserve">Node.js, Prisma, MySQL, React</w:t>
+              <w:spacing w:after="120"/>
+            </w:pPr>
+            <w:r>
+              <w:rPr>
+                <w:rFonts w:ascii="Calibri" w:hAnsi="Calibri" w:cs="Arial"/>
+                <w:sz w:val="18"/>
+                <w:szCs w:val="18"/>
+                <w:lang w:eastAsia="es-CL"/>
+              </w:rPr>
+              <w:t>Node.js, Prisma, MySQL, React</w:t>
             </w:r>
           </w:p>
         </w:tc>
@@ -1908,17 +1844,16 @@
           </w:tcPr>
           <w:p>
             <w:pPr>
-              <w:spacing w:after="120" w:line="259" w:lineRule="auto"/>
-              <w:jc w:val="left"/>
-            </w:pPr>
-            <w:r>
-              <w:rPr>
-                <w:rFonts w:ascii="Calibri" w:hAnsi="Calibri" w:cs="Arial"/>
-                <w:sz w:val="18"/>
-                <w:szCs w:val="18"/>
-                <w:lang w:eastAsia="es-CL"/>
-              </w:rPr>
-              <w:t xml:space="preserve">2 semanas</w:t>
+              <w:spacing w:after="120"/>
+            </w:pPr>
+            <w:r>
+              <w:rPr>
+                <w:rFonts w:ascii="Calibri" w:hAnsi="Calibri" w:cs="Arial"/>
+                <w:sz w:val="18"/>
+                <w:szCs w:val="18"/>
+                <w:lang w:eastAsia="es-CL"/>
+              </w:rPr>
+              <w:t>2 semanas</w:t>
             </w:r>
           </w:p>
         </w:tc>
@@ -1928,17 +1863,19 @@
           </w:tcPr>
           <w:p>
             <w:pPr>
-              <w:spacing w:after="120" w:line="259" w:lineRule="auto"/>
-              <w:jc w:val="left"/>
-            </w:pPr>
-            <w:r>
-              <w:rPr>
-                <w:rFonts w:ascii="Calibri" w:hAnsi="Calibri" w:cs="Arial"/>
-                <w:sz w:val="18"/>
-                <w:szCs w:val="18"/>
-                <w:lang w:eastAsia="es-CL"/>
-              </w:rPr>
-              <w:t xml:space="preserve">Raúl (backend) y Benjamín (interfaz)</w:t>
+              <w:spacing w:after="120"/>
+              <w:rPr>
+                <w:lang w:val="en-US"/>
+              </w:rPr>
+            </w:pPr>
+            <w:r>
+              <w:rPr>
+                <w:rFonts w:ascii="Calibri" w:hAnsi="Calibri" w:cs="Arial"/>
+                <w:sz w:val="18"/>
+                <w:szCs w:val="18"/>
+                <w:lang w:val="en-US" w:eastAsia="es-CL"/>
+              </w:rPr>
+              <w:t>Raúl (backend) y Benjamín (interfaz)</w:t>
             </w:r>
           </w:p>
         </w:tc>
@@ -1948,17 +1885,16 @@
           </w:tcPr>
           <w:p>
             <w:pPr>
-              <w:spacing w:after="120" w:line="259" w:lineRule="auto"/>
-              <w:jc w:val="left"/>
-            </w:pPr>
-            <w:r>
-              <w:rPr>
-                <w:rFonts w:ascii="Calibri" w:hAnsi="Calibri" w:cs="Arial"/>
-                <w:sz w:val="18"/>
-                <w:szCs w:val="18"/>
-                <w:lang w:eastAsia="es-CL"/>
-              </w:rPr>
-              <w:t xml:space="preserve">El cálculo de tarifas tomó más tiempo</w:t>
+              <w:spacing w:after="120"/>
+            </w:pPr>
+            <w:r>
+              <w:rPr>
+                <w:rFonts w:ascii="Calibri" w:hAnsi="Calibri" w:cs="Arial"/>
+                <w:sz w:val="18"/>
+                <w:szCs w:val="18"/>
+                <w:lang w:eastAsia="es-CL"/>
+              </w:rPr>
+              <w:t>El cálculo de tarifas tomó más tiempo</w:t>
             </w:r>
           </w:p>
         </w:tc>
@@ -1968,17 +1904,16 @@
           </w:tcPr>
           <w:p>
             <w:pPr>
-              <w:spacing w:after="120" w:line="259" w:lineRule="auto"/>
-              <w:jc w:val="left"/>
-            </w:pPr>
-            <w:r>
-              <w:rPr>
-                <w:rFonts w:ascii="Calibri" w:hAnsi="Calibri" w:cs="Arial"/>
-                <w:sz w:val="18"/>
-                <w:szCs w:val="18"/>
-                <w:lang w:eastAsia="es-CL"/>
-              </w:rPr>
-              <w:t xml:space="preserve">Completado</w:t>
+              <w:spacing w:after="120"/>
+            </w:pPr>
+            <w:r>
+              <w:rPr>
+                <w:rFonts w:ascii="Calibri" w:hAnsi="Calibri" w:cs="Arial"/>
+                <w:sz w:val="18"/>
+                <w:szCs w:val="18"/>
+                <w:lang w:eastAsia="es-CL"/>
+              </w:rPr>
+              <w:t>Completado</w:t>
             </w:r>
           </w:p>
         </w:tc>
@@ -1988,17 +1923,16 @@
           </w:tcPr>
           <w:p>
             <w:pPr>
-              <w:spacing w:after="120" w:line="259" w:lineRule="auto"/>
-              <w:jc w:val="left"/>
-            </w:pPr>
-            <w:r>
-              <w:rPr>
-                <w:rFonts w:ascii="Calibri" w:hAnsi="Calibri" w:cs="Arial"/>
-                <w:sz w:val="18"/>
-                <w:szCs w:val="18"/>
-                <w:lang w:eastAsia="es-CL"/>
-              </w:rPr>
-              <w:t xml:space="preserve">Tarifas por ruta y por tramo de peso</w:t>
+              <w:spacing w:after="120"/>
+            </w:pPr>
+            <w:r>
+              <w:rPr>
+                <w:rFonts w:ascii="Calibri" w:hAnsi="Calibri" w:cs="Arial"/>
+                <w:sz w:val="18"/>
+                <w:szCs w:val="18"/>
+                <w:lang w:eastAsia="es-CL"/>
+              </w:rPr>
+              <w:t>Tarifas por ruta y por tramo de peso</w:t>
             </w:r>
           </w:p>
         </w:tc>
@@ -2006,6 +1940,7 @@
       <w:tr>
         <w:trPr>
           <w:cantSplit/>
+          <w:jc w:val="center"/>
         </w:trPr>
         <w:tc>
           <w:tcPr>
@@ -2013,17 +1948,16 @@
           </w:tcPr>
           <w:p>
             <w:pPr>
-              <w:spacing w:after="120" w:line="259" w:lineRule="auto"/>
-              <w:jc w:val="left"/>
-            </w:pPr>
-            <w:r>
-              <w:rPr>
-                <w:rFonts w:ascii="Calibri" w:hAnsi="Calibri" w:cs="Arial"/>
-                <w:sz w:val="18"/>
-                <w:szCs w:val="18"/>
-                <w:lang w:eastAsia="es-CL"/>
-              </w:rPr>
-              <w:t xml:space="preserve">Competencias 1, 2 y 5</w:t>
+              <w:spacing w:after="120"/>
+            </w:pPr>
+            <w:r>
+              <w:rPr>
+                <w:rFonts w:ascii="Calibri" w:hAnsi="Calibri" w:cs="Arial"/>
+                <w:sz w:val="18"/>
+                <w:szCs w:val="18"/>
+                <w:lang w:eastAsia="es-CL"/>
+              </w:rPr>
+              <w:t>Competencias 1, 2 y 5</w:t>
             </w:r>
           </w:p>
         </w:tc>
@@ -2033,17 +1967,16 @@
           </w:tcPr>
           <w:p>
             <w:pPr>
-              <w:spacing w:after="120" w:line="259" w:lineRule="auto"/>
-              <w:jc w:val="left"/>
-            </w:pPr>
-            <w:r>
-              <w:rPr>
-                <w:rFonts w:ascii="Calibri" w:hAnsi="Calibri" w:cs="Arial"/>
-                <w:sz w:val="18"/>
-                <w:szCs w:val="18"/>
-                <w:lang w:eastAsia="es-CL"/>
-              </w:rPr>
-              <w:t xml:space="preserve">Auditoría y recuperación de OT</w:t>
+              <w:spacing w:after="120"/>
+            </w:pPr>
+            <w:r>
+              <w:rPr>
+                <w:rFonts w:ascii="Calibri" w:hAnsi="Calibri" w:cs="Arial"/>
+                <w:sz w:val="18"/>
+                <w:szCs w:val="18"/>
+                <w:lang w:eastAsia="es-CL"/>
+              </w:rPr>
+              <w:t>Auditoría y recuperación de OT</w:t>
             </w:r>
           </w:p>
         </w:tc>
@@ -2053,17 +1986,16 @@
           </w:tcPr>
           <w:p>
             <w:pPr>
-              <w:spacing w:after="120" w:line="259" w:lineRule="auto"/>
-              <w:jc w:val="left"/>
-            </w:pPr>
-            <w:r>
-              <w:rPr>
-                <w:rFonts w:ascii="Calibri" w:hAnsi="Calibri" w:cs="Arial"/>
-                <w:sz w:val="18"/>
-                <w:szCs w:val="18"/>
-                <w:lang w:eastAsia="es-CL"/>
-              </w:rPr>
-              <w:t xml:space="preserve">Node.js, Prisma, MySQL</w:t>
+              <w:spacing w:after="120"/>
+            </w:pPr>
+            <w:r>
+              <w:rPr>
+                <w:rFonts w:ascii="Calibri" w:hAnsi="Calibri" w:cs="Arial"/>
+                <w:sz w:val="18"/>
+                <w:szCs w:val="18"/>
+                <w:lang w:eastAsia="es-CL"/>
+              </w:rPr>
+              <w:t>Node.js, Prisma, MySQL</w:t>
             </w:r>
           </w:p>
         </w:tc>
@@ -2073,17 +2005,16 @@
           </w:tcPr>
           <w:p>
             <w:pPr>
-              <w:spacing w:after="120" w:line="259" w:lineRule="auto"/>
-              <w:jc w:val="left"/>
-            </w:pPr>
-            <w:r>
-              <w:rPr>
-                <w:rFonts w:ascii="Calibri" w:hAnsi="Calibri" w:cs="Arial"/>
-                <w:sz w:val="18"/>
-                <w:szCs w:val="18"/>
-                <w:lang w:eastAsia="es-CL"/>
-              </w:rPr>
-              <w:t xml:space="preserve">1 semana</w:t>
+              <w:spacing w:after="120"/>
+            </w:pPr>
+            <w:r>
+              <w:rPr>
+                <w:rFonts w:ascii="Calibri" w:hAnsi="Calibri" w:cs="Arial"/>
+                <w:sz w:val="18"/>
+                <w:szCs w:val="18"/>
+                <w:lang w:eastAsia="es-CL"/>
+              </w:rPr>
+              <w:t>1 semana</w:t>
             </w:r>
           </w:p>
         </w:tc>
@@ -2093,17 +2024,16 @@
           </w:tcPr>
           <w:p>
             <w:pPr>
-              <w:spacing w:after="120" w:line="259" w:lineRule="auto"/>
-              <w:jc w:val="left"/>
-            </w:pPr>
-            <w:r>
-              <w:rPr>
-                <w:rFonts w:ascii="Calibri" w:hAnsi="Calibri" w:cs="Arial"/>
-                <w:sz w:val="18"/>
-                <w:szCs w:val="18"/>
-                <w:lang w:eastAsia="es-CL"/>
-              </w:rPr>
-              <w:t xml:space="preserve">Raúl (pruebas de Benjamín)</w:t>
+              <w:spacing w:after="120"/>
+            </w:pPr>
+            <w:r>
+              <w:rPr>
+                <w:rFonts w:ascii="Calibri" w:hAnsi="Calibri" w:cs="Arial"/>
+                <w:sz w:val="18"/>
+                <w:szCs w:val="18"/>
+                <w:lang w:eastAsia="es-CL"/>
+              </w:rPr>
+              <w:t>Raúl (pruebas de Benjamín)</w:t>
             </w:r>
           </w:p>
         </w:tc>
@@ -2113,17 +2043,16 @@
           </w:tcPr>
           <w:p>
             <w:pPr>
-              <w:spacing w:after="120" w:line="259" w:lineRule="auto"/>
-              <w:jc w:val="left"/>
-            </w:pPr>
-            <w:r>
-              <w:rPr>
-                <w:rFonts w:ascii="Calibri" w:hAnsi="Calibri" w:cs="Arial"/>
-                <w:sz w:val="18"/>
-                <w:szCs w:val="18"/>
-                <w:lang w:eastAsia="es-CL"/>
-              </w:rPr>
-              <w:t xml:space="preserve">Cada evento de la OT queda con usuario y fecha</w:t>
+              <w:spacing w:after="120"/>
+            </w:pPr>
+            <w:r>
+              <w:rPr>
+                <w:rFonts w:ascii="Calibri" w:hAnsi="Calibri" w:cs="Arial"/>
+                <w:sz w:val="18"/>
+                <w:szCs w:val="18"/>
+                <w:lang w:eastAsia="es-CL"/>
+              </w:rPr>
+              <w:t>Cada evento de la OT queda con usuario y fecha</w:t>
             </w:r>
           </w:p>
         </w:tc>
@@ -2133,17 +2062,16 @@
           </w:tcPr>
           <w:p>
             <w:pPr>
-              <w:spacing w:after="120" w:line="259" w:lineRule="auto"/>
-              <w:jc w:val="left"/>
-            </w:pPr>
-            <w:r>
-              <w:rPr>
-                <w:rFonts w:ascii="Calibri" w:hAnsi="Calibri" w:cs="Arial"/>
-                <w:sz w:val="18"/>
-                <w:szCs w:val="18"/>
-                <w:lang w:eastAsia="es-CL"/>
-              </w:rPr>
-              <w:t xml:space="preserve">Completado</w:t>
+              <w:spacing w:after="120"/>
+            </w:pPr>
+            <w:r>
+              <w:rPr>
+                <w:rFonts w:ascii="Calibri" w:hAnsi="Calibri" w:cs="Arial"/>
+                <w:sz w:val="18"/>
+                <w:szCs w:val="18"/>
+                <w:lang w:eastAsia="es-CL"/>
+              </w:rPr>
+              <w:t>Completado</w:t>
             </w:r>
           </w:p>
         </w:tc>
@@ -2153,17 +2081,16 @@
           </w:tcPr>
           <w:p>
             <w:pPr>
-              <w:spacing w:after="120" w:line="259" w:lineRule="auto"/>
-              <w:jc w:val="left"/>
-            </w:pPr>
-            <w:r>
-              <w:rPr>
-                <w:rFonts w:ascii="Calibri" w:hAnsi="Calibri" w:cs="Arial"/>
-                <w:sz w:val="18"/>
-                <w:szCs w:val="18"/>
-                <w:lang w:eastAsia="es-CL"/>
-              </w:rPr>
-              <w:t xml:space="preserve">Falta guardar el detalle de cada campo editado</w:t>
+              <w:spacing w:after="120"/>
+            </w:pPr>
+            <w:r>
+              <w:rPr>
+                <w:rFonts w:ascii="Calibri" w:hAnsi="Calibri" w:cs="Arial"/>
+                <w:sz w:val="18"/>
+                <w:szCs w:val="18"/>
+                <w:lang w:eastAsia="es-CL"/>
+              </w:rPr>
+              <w:t>Falta guardar el detalle de cada campo editado</w:t>
             </w:r>
           </w:p>
         </w:tc>
@@ -2171,6 +2098,7 @@
       <w:tr>
         <w:trPr>
           <w:cantSplit/>
+          <w:jc w:val="center"/>
         </w:trPr>
         <w:tc>
           <w:tcPr>
@@ -2178,17 +2106,16 @@
           </w:tcPr>
           <w:p>
             <w:pPr>
-              <w:spacing w:after="120" w:line="259" w:lineRule="auto"/>
-              <w:jc w:val="left"/>
-            </w:pPr>
-            <w:r>
-              <w:rPr>
-                <w:rFonts w:ascii="Calibri" w:hAnsi="Calibri" w:cs="Arial"/>
-                <w:sz w:val="18"/>
-                <w:szCs w:val="18"/>
-                <w:lang w:eastAsia="es-CL"/>
-              </w:rPr>
-              <w:t xml:space="preserve">Competencias 1, 2 y 5</w:t>
+              <w:spacing w:after="120"/>
+            </w:pPr>
+            <w:r>
+              <w:rPr>
+                <w:rFonts w:ascii="Calibri" w:hAnsi="Calibri" w:cs="Arial"/>
+                <w:sz w:val="18"/>
+                <w:szCs w:val="18"/>
+                <w:lang w:eastAsia="es-CL"/>
+              </w:rPr>
+              <w:t>Competencias 1, 2 y 5</w:t>
             </w:r>
           </w:p>
         </w:tc>
@@ -2198,17 +2125,16 @@
           </w:tcPr>
           <w:p>
             <w:pPr>
-              <w:spacing w:after="120" w:line="259" w:lineRule="auto"/>
-              <w:jc w:val="left"/>
-            </w:pPr>
-            <w:r>
-              <w:rPr>
-                <w:rFonts w:ascii="Calibri" w:hAnsi="Calibri" w:cs="Arial"/>
-                <w:sz w:val="18"/>
-                <w:szCs w:val="18"/>
-                <w:lang w:eastAsia="es-CL"/>
-              </w:rPr>
-              <w:t xml:space="preserve">Manifiesto y control de carga</w:t>
+              <w:spacing w:after="120"/>
+            </w:pPr>
+            <w:r>
+              <w:rPr>
+                <w:rFonts w:ascii="Calibri" w:hAnsi="Calibri" w:cs="Arial"/>
+                <w:sz w:val="18"/>
+                <w:szCs w:val="18"/>
+                <w:lang w:eastAsia="es-CL"/>
+              </w:rPr>
+              <w:t>Manifiesto y control de carga</w:t>
             </w:r>
           </w:p>
         </w:tc>
@@ -2218,17 +2144,16 @@
           </w:tcPr>
           <w:p>
             <w:pPr>
-              <w:spacing w:after="120" w:line="259" w:lineRule="auto"/>
-              <w:jc w:val="left"/>
-            </w:pPr>
-            <w:r>
-              <w:rPr>
-                <w:rFonts w:ascii="Calibri" w:hAnsi="Calibri" w:cs="Arial"/>
-                <w:sz w:val="18"/>
-                <w:szCs w:val="18"/>
-                <w:lang w:eastAsia="es-CL"/>
-              </w:rPr>
-              <w:t xml:space="preserve">API REST, MySQL, lector de código de barras</w:t>
+              <w:spacing w:after="120"/>
+            </w:pPr>
+            <w:r>
+              <w:rPr>
+                <w:rFonts w:ascii="Calibri" w:hAnsi="Calibri" w:cs="Arial"/>
+                <w:sz w:val="18"/>
+                <w:szCs w:val="18"/>
+                <w:lang w:eastAsia="es-CL"/>
+              </w:rPr>
+              <w:t>API REST, MySQL, lector de código de barras</w:t>
             </w:r>
           </w:p>
         </w:tc>
@@ -2238,17 +2163,16 @@
           </w:tcPr>
           <w:p>
             <w:pPr>
-              <w:spacing w:after="120" w:line="259" w:lineRule="auto"/>
-              <w:jc w:val="left"/>
-            </w:pPr>
-            <w:r>
-              <w:rPr>
-                <w:rFonts w:ascii="Calibri" w:hAnsi="Calibri" w:cs="Arial"/>
-                <w:sz w:val="18"/>
-                <w:szCs w:val="18"/>
-                <w:lang w:eastAsia="es-CL"/>
-              </w:rPr>
-              <w:t xml:space="preserve">2 semanas</w:t>
+              <w:spacing w:after="120"/>
+            </w:pPr>
+            <w:r>
+              <w:rPr>
+                <w:rFonts w:ascii="Calibri" w:hAnsi="Calibri" w:cs="Arial"/>
+                <w:sz w:val="18"/>
+                <w:szCs w:val="18"/>
+                <w:lang w:eastAsia="es-CL"/>
+              </w:rPr>
+              <w:t>2 semanas</w:t>
             </w:r>
           </w:p>
         </w:tc>
@@ -2258,17 +2182,16 @@
           </w:tcPr>
           <w:p>
             <w:pPr>
-              <w:spacing w:after="120" w:line="259" w:lineRule="auto"/>
-              <w:jc w:val="left"/>
-            </w:pPr>
-            <w:r>
-              <w:rPr>
-                <w:rFonts w:ascii="Calibri" w:hAnsi="Calibri" w:cs="Arial"/>
-                <w:sz w:val="18"/>
-                <w:szCs w:val="18"/>
-                <w:lang w:eastAsia="es-CL"/>
-              </w:rPr>
-              <w:t xml:space="preserve">Raúl y Benjamín</w:t>
+              <w:spacing w:after="120"/>
+            </w:pPr>
+            <w:r>
+              <w:rPr>
+                <w:rFonts w:ascii="Calibri" w:hAnsi="Calibri" w:cs="Arial"/>
+                <w:sz w:val="18"/>
+                <w:szCs w:val="18"/>
+                <w:lang w:eastAsia="es-CL"/>
+              </w:rPr>
+              <w:t>Raúl y Benjamín</w:t>
             </w:r>
           </w:p>
         </w:tc>
@@ -2278,17 +2201,16 @@
           </w:tcPr>
           <w:p>
             <w:pPr>
-              <w:spacing w:after="120" w:line="259" w:lineRule="auto"/>
-              <w:jc w:val="left"/>
-            </w:pPr>
-            <w:r>
-              <w:rPr>
-                <w:rFonts w:ascii="Calibri" w:hAnsi="Calibri" w:cs="Arial"/>
-                <w:sz w:val="18"/>
-                <w:szCs w:val="18"/>
-                <w:lang w:eastAsia="es-CL"/>
-              </w:rPr>
-              <w:t xml:space="preserve">Aparecieron dos tipos de viaje</w:t>
+              <w:spacing w:after="120"/>
+            </w:pPr>
+            <w:r>
+              <w:rPr>
+                <w:rFonts w:ascii="Calibri" w:hAnsi="Calibri" w:cs="Arial"/>
+                <w:sz w:val="18"/>
+                <w:szCs w:val="18"/>
+                <w:lang w:eastAsia="es-CL"/>
+              </w:rPr>
+              <w:t>Aparecieron dos tipos de viaje</w:t>
             </w:r>
           </w:p>
         </w:tc>
@@ -2298,17 +2220,16 @@
           </w:tcPr>
           <w:p>
             <w:pPr>
-              <w:spacing w:after="120" w:line="259" w:lineRule="auto"/>
-              <w:jc w:val="left"/>
-            </w:pPr>
-            <w:r>
-              <w:rPr>
-                <w:rFonts w:ascii="Calibri" w:hAnsi="Calibri" w:cs="Arial"/>
-                <w:sz w:val="18"/>
-                <w:szCs w:val="18"/>
-                <w:lang w:eastAsia="es-CL"/>
-              </w:rPr>
-              <w:t xml:space="preserve">Completado</w:t>
+              <w:spacing w:after="120"/>
+            </w:pPr>
+            <w:r>
+              <w:rPr>
+                <w:rFonts w:ascii="Calibri" w:hAnsi="Calibri" w:cs="Arial"/>
+                <w:sz w:val="18"/>
+                <w:szCs w:val="18"/>
+                <w:lang w:eastAsia="es-CL"/>
+              </w:rPr>
+              <w:t>Completado</w:t>
             </w:r>
           </w:p>
         </w:tc>
@@ -2318,17 +2239,16 @@
           </w:tcPr>
           <w:p>
             <w:pPr>
-              <w:spacing w:after="120" w:line="259" w:lineRule="auto"/>
-              <w:jc w:val="left"/>
-            </w:pPr>
-            <w:r>
-              <w:rPr>
-                <w:rFonts w:ascii="Calibri" w:hAnsi="Calibri" w:cs="Arial"/>
-                <w:sz w:val="18"/>
-                <w:szCs w:val="18"/>
-                <w:lang w:eastAsia="es-CL"/>
-              </w:rPr>
-              <w:t xml:space="preserve">Manifiestos de reparto y de traspaso, con PDF</w:t>
+              <w:spacing w:after="120"/>
+            </w:pPr>
+            <w:r>
+              <w:rPr>
+                <w:rFonts w:ascii="Calibri" w:hAnsi="Calibri" w:cs="Arial"/>
+                <w:sz w:val="18"/>
+                <w:szCs w:val="18"/>
+                <w:lang w:eastAsia="es-CL"/>
+              </w:rPr>
+              <w:t>Manifiestos de reparto y de traspaso, con PDF</w:t>
             </w:r>
           </w:p>
         </w:tc>
@@ -2336,6 +2256,7 @@
       <w:tr>
         <w:trPr>
           <w:cantSplit/>
+          <w:jc w:val="center"/>
         </w:trPr>
         <w:tc>
           <w:tcPr>
@@ -2343,17 +2264,16 @@
           </w:tcPr>
           <w:p>
             <w:pPr>
-              <w:spacing w:after="120" w:line="259" w:lineRule="auto"/>
-              <w:jc w:val="left"/>
-            </w:pPr>
-            <w:r>
-              <w:rPr>
-                <w:rFonts w:ascii="Calibri" w:hAnsi="Calibri" w:cs="Arial"/>
-                <w:sz w:val="18"/>
-                <w:szCs w:val="18"/>
-                <w:lang w:eastAsia="es-CL"/>
-              </w:rPr>
-              <w:t xml:space="preserve">Competencias 1, 2 y 5</w:t>
+              <w:spacing w:after="120"/>
+            </w:pPr>
+            <w:r>
+              <w:rPr>
+                <w:rFonts w:ascii="Calibri" w:hAnsi="Calibri" w:cs="Arial"/>
+                <w:sz w:val="18"/>
+                <w:szCs w:val="18"/>
+                <w:lang w:eastAsia="es-CL"/>
+              </w:rPr>
+              <w:t>Competencias 1, 2 y 5</w:t>
             </w:r>
           </w:p>
         </w:tc>
@@ -2363,17 +2283,16 @@
           </w:tcPr>
           <w:p>
             <w:pPr>
-              <w:spacing w:after="120" w:line="259" w:lineRule="auto"/>
-              <w:jc w:val="left"/>
-            </w:pPr>
-            <w:r>
-              <w:rPr>
-                <w:rFonts w:ascii="Calibri" w:hAnsi="Calibri" w:cs="Arial"/>
-                <w:sz w:val="18"/>
-                <w:szCs w:val="18"/>
-                <w:lang w:eastAsia="es-CL"/>
-              </w:rPr>
-              <w:t xml:space="preserve">Portal del cliente (actividad nueva)</w:t>
+              <w:spacing w:after="120"/>
+            </w:pPr>
+            <w:r>
+              <w:rPr>
+                <w:rFonts w:ascii="Calibri" w:hAnsi="Calibri" w:cs="Arial"/>
+                <w:sz w:val="18"/>
+                <w:szCs w:val="18"/>
+                <w:lang w:eastAsia="es-CL"/>
+              </w:rPr>
+              <w:t>Portal del cliente (actividad nueva)</w:t>
             </w:r>
           </w:p>
         </w:tc>
@@ -2383,17 +2302,16 @@
           </w:tcPr>
           <w:p>
             <w:pPr>
-              <w:spacing w:after="120" w:line="259" w:lineRule="auto"/>
-              <w:jc w:val="left"/>
-            </w:pPr>
-            <w:r>
-              <w:rPr>
-                <w:rFonts w:ascii="Calibri" w:hAnsi="Calibri" w:cs="Arial"/>
-                <w:sz w:val="18"/>
-                <w:szCs w:val="18"/>
-                <w:lang w:eastAsia="es-CL"/>
-              </w:rPr>
-              <w:t xml:space="preserve">React, Express, Prisma</w:t>
+              <w:spacing w:after="120"/>
+            </w:pPr>
+            <w:r>
+              <w:rPr>
+                <w:rFonts w:ascii="Calibri" w:hAnsi="Calibri" w:cs="Arial"/>
+                <w:sz w:val="18"/>
+                <w:szCs w:val="18"/>
+                <w:lang w:eastAsia="es-CL"/>
+              </w:rPr>
+              <w:t>React, Express, Prisma</w:t>
             </w:r>
           </w:p>
         </w:tc>
@@ -2403,17 +2321,16 @@
           </w:tcPr>
           <w:p>
             <w:pPr>
-              <w:spacing w:after="120" w:line="259" w:lineRule="auto"/>
-              <w:jc w:val="left"/>
-            </w:pPr>
-            <w:r>
-              <w:rPr>
-                <w:rFonts w:ascii="Calibri" w:hAnsi="Calibri" w:cs="Arial"/>
-                <w:sz w:val="18"/>
-                <w:szCs w:val="18"/>
-                <w:lang w:eastAsia="es-CL"/>
-              </w:rPr>
-              <w:t xml:space="preserve">1 semana</w:t>
+              <w:spacing w:after="120"/>
+            </w:pPr>
+            <w:r>
+              <w:rPr>
+                <w:rFonts w:ascii="Calibri" w:hAnsi="Calibri" w:cs="Arial"/>
+                <w:sz w:val="18"/>
+                <w:szCs w:val="18"/>
+                <w:lang w:eastAsia="es-CL"/>
+              </w:rPr>
+              <w:t>1 semana</w:t>
             </w:r>
           </w:p>
         </w:tc>
@@ -2423,17 +2340,16 @@
           </w:tcPr>
           <w:p>
             <w:pPr>
-              <w:spacing w:after="120" w:line="259" w:lineRule="auto"/>
-              <w:jc w:val="left"/>
-            </w:pPr>
-            <w:r>
-              <w:rPr>
-                <w:rFonts w:ascii="Calibri" w:hAnsi="Calibri" w:cs="Arial"/>
-                <w:sz w:val="18"/>
-                <w:szCs w:val="18"/>
-                <w:lang w:eastAsia="es-CL"/>
-              </w:rPr>
-              <w:t xml:space="preserve">Benjamín</w:t>
+              <w:spacing w:after="120"/>
+            </w:pPr>
+            <w:r>
+              <w:rPr>
+                <w:rFonts w:ascii="Calibri" w:hAnsi="Calibri" w:cs="Arial"/>
+                <w:sz w:val="18"/>
+                <w:szCs w:val="18"/>
+                <w:lang w:eastAsia="es-CL"/>
+              </w:rPr>
+              <w:t>Benjamín</w:t>
             </w:r>
           </w:p>
         </w:tc>
@@ -2443,17 +2359,16 @@
           </w:tcPr>
           <w:p>
             <w:pPr>
-              <w:spacing w:after="120" w:line="259" w:lineRule="auto"/>
-              <w:jc w:val="left"/>
-            </w:pPr>
-            <w:r>
-              <w:rPr>
-                <w:rFonts w:ascii="Calibri" w:hAnsi="Calibri" w:cs="Arial"/>
-                <w:sz w:val="18"/>
-                <w:szCs w:val="18"/>
-                <w:lang w:eastAsia="es-CL"/>
-              </w:rPr>
-              <w:t xml:space="preserve">Surgió al separar lo que puede ver el cliente</w:t>
+              <w:spacing w:after="120"/>
+            </w:pPr>
+            <w:r>
+              <w:rPr>
+                <w:rFonts w:ascii="Calibri" w:hAnsi="Calibri" w:cs="Arial"/>
+                <w:sz w:val="18"/>
+                <w:szCs w:val="18"/>
+                <w:lang w:eastAsia="es-CL"/>
+              </w:rPr>
+              <w:t>Surgió al separar lo que puede ver el cliente</w:t>
             </w:r>
           </w:p>
         </w:tc>
@@ -2463,17 +2378,16 @@
           </w:tcPr>
           <w:p>
             <w:pPr>
-              <w:spacing w:after="120" w:line="259" w:lineRule="auto"/>
-              <w:jc w:val="left"/>
-            </w:pPr>
-            <w:r>
-              <w:rPr>
-                <w:rFonts w:ascii="Calibri" w:hAnsi="Calibri" w:cs="Arial"/>
-                <w:sz w:val="18"/>
-                <w:szCs w:val="18"/>
-                <w:lang w:eastAsia="es-CL"/>
-              </w:rPr>
-              <w:t xml:space="preserve">Completado</w:t>
+              <w:spacing w:after="120"/>
+            </w:pPr>
+            <w:r>
+              <w:rPr>
+                <w:rFonts w:ascii="Calibri" w:hAnsi="Calibri" w:cs="Arial"/>
+                <w:sz w:val="18"/>
+                <w:szCs w:val="18"/>
+                <w:lang w:eastAsia="es-CL"/>
+              </w:rPr>
+              <w:t>Completado</w:t>
             </w:r>
           </w:p>
         </w:tc>
@@ -2483,17 +2397,16 @@
           </w:tcPr>
           <w:p>
             <w:pPr>
-              <w:spacing w:after="120" w:line="259" w:lineRule="auto"/>
-              <w:jc w:val="left"/>
-            </w:pPr>
-            <w:r>
-              <w:rPr>
-                <w:rFonts w:ascii="Calibri" w:hAnsi="Calibri" w:cs="Arial"/>
-                <w:sz w:val="18"/>
-                <w:szCs w:val="18"/>
-                <w:lang w:eastAsia="es-CL"/>
-              </w:rPr>
-              <w:t xml:space="preserve">Se agregó al plan en esta fase</w:t>
+              <w:spacing w:after="120"/>
+            </w:pPr>
+            <w:r>
+              <w:rPr>
+                <w:rFonts w:ascii="Calibri" w:hAnsi="Calibri" w:cs="Arial"/>
+                <w:sz w:val="18"/>
+                <w:szCs w:val="18"/>
+                <w:lang w:eastAsia="es-CL"/>
+              </w:rPr>
+              <w:t>Se agregó al plan en esta fase</w:t>
             </w:r>
           </w:p>
         </w:tc>
@@ -2501,6 +2414,7 @@
       <w:tr>
         <w:trPr>
           <w:cantSplit/>
+          <w:jc w:val="center"/>
         </w:trPr>
         <w:tc>
           <w:tcPr>
@@ -2508,17 +2422,17 @@
           </w:tcPr>
           <w:p>
             <w:pPr>
-              <w:spacing w:after="120" w:line="259" w:lineRule="auto"/>
-              <w:jc w:val="left"/>
-            </w:pPr>
-            <w:r>
-              <w:rPr>
-                <w:rFonts w:ascii="Calibri" w:hAnsi="Calibri" w:cs="Arial"/>
-                <w:sz w:val="18"/>
-                <w:szCs w:val="18"/>
-                <w:lang w:eastAsia="es-CL"/>
-              </w:rPr>
-              <w:t xml:space="preserve">Competencias 1, 2 y 5</w:t>
+              <w:spacing w:after="120"/>
+            </w:pPr>
+            <w:r>
+              <w:rPr>
+                <w:rFonts w:ascii="Calibri" w:hAnsi="Calibri" w:cs="Arial"/>
+                <w:sz w:val="18"/>
+                <w:szCs w:val="18"/>
+                <w:lang w:eastAsia="es-CL"/>
+              </w:rPr>
+              <w:lastRenderedPageBreak/>
+              <w:t>Competencias 1, 2 y 5</w:t>
             </w:r>
           </w:p>
         </w:tc>
@@ -2528,17 +2442,16 @@
           </w:tcPr>
           <w:p>
             <w:pPr>
-              <w:spacing w:after="120" w:line="259" w:lineRule="auto"/>
-              <w:jc w:val="left"/>
-            </w:pPr>
-            <w:r>
-              <w:rPr>
-                <w:rFonts w:ascii="Calibri" w:hAnsi="Calibri" w:cs="Arial"/>
-                <w:sz w:val="18"/>
-                <w:szCs w:val="18"/>
-                <w:lang w:eastAsia="es-CL"/>
-              </w:rPr>
-              <w:t xml:space="preserve">Seguimiento de envíos por la web</w:t>
+              <w:spacing w:after="120"/>
+            </w:pPr>
+            <w:r>
+              <w:rPr>
+                <w:rFonts w:ascii="Calibri" w:hAnsi="Calibri" w:cs="Arial"/>
+                <w:sz w:val="18"/>
+                <w:szCs w:val="18"/>
+                <w:lang w:eastAsia="es-CL"/>
+              </w:rPr>
+              <w:t>Seguimiento de envíos por la web</w:t>
             </w:r>
           </w:p>
         </w:tc>
@@ -2548,17 +2461,16 @@
           </w:tcPr>
           <w:p>
             <w:pPr>
-              <w:spacing w:after="120" w:line="259" w:lineRule="auto"/>
-              <w:jc w:val="left"/>
-            </w:pPr>
-            <w:r>
-              <w:rPr>
-                <w:rFonts w:ascii="Calibri" w:hAnsi="Calibri" w:cs="Arial"/>
-                <w:sz w:val="18"/>
-                <w:szCs w:val="18"/>
-                <w:lang w:eastAsia="es-CL"/>
-              </w:rPr>
-              <w:t xml:space="preserve">React, API REST, MySQL</w:t>
+              <w:spacing w:after="120"/>
+            </w:pPr>
+            <w:r>
+              <w:rPr>
+                <w:rFonts w:ascii="Calibri" w:hAnsi="Calibri" w:cs="Arial"/>
+                <w:sz w:val="18"/>
+                <w:szCs w:val="18"/>
+                <w:lang w:eastAsia="es-CL"/>
+              </w:rPr>
+              <w:t>React, API REST, MySQL</w:t>
             </w:r>
           </w:p>
         </w:tc>
@@ -2568,17 +2480,16 @@
           </w:tcPr>
           <w:p>
             <w:pPr>
-              <w:spacing w:after="120" w:line="259" w:lineRule="auto"/>
-              <w:jc w:val="left"/>
-            </w:pPr>
-            <w:r>
-              <w:rPr>
-                <w:rFonts w:ascii="Calibri" w:hAnsi="Calibri" w:cs="Arial"/>
-                <w:sz w:val="18"/>
-                <w:szCs w:val="18"/>
-                <w:lang w:eastAsia="es-CL"/>
-              </w:rPr>
-              <w:t xml:space="preserve">1 semana</w:t>
+              <w:spacing w:after="120"/>
+            </w:pPr>
+            <w:r>
+              <w:rPr>
+                <w:rFonts w:ascii="Calibri" w:hAnsi="Calibri" w:cs="Arial"/>
+                <w:sz w:val="18"/>
+                <w:szCs w:val="18"/>
+                <w:lang w:eastAsia="es-CL"/>
+              </w:rPr>
+              <w:t>1 semana</w:t>
             </w:r>
           </w:p>
         </w:tc>
@@ -2588,17 +2499,16 @@
           </w:tcPr>
           <w:p>
             <w:pPr>
-              <w:spacing w:after="120" w:line="259" w:lineRule="auto"/>
-              <w:jc w:val="left"/>
-            </w:pPr>
-            <w:r>
-              <w:rPr>
-                <w:rFonts w:ascii="Calibri" w:hAnsi="Calibri" w:cs="Arial"/>
-                <w:sz w:val="18"/>
-                <w:szCs w:val="18"/>
-                <w:lang w:eastAsia="es-CL"/>
-              </w:rPr>
-              <w:t xml:space="preserve">Benjamín (APIs de Raúl)</w:t>
+              <w:spacing w:after="120"/>
+            </w:pPr>
+            <w:r>
+              <w:rPr>
+                <w:rFonts w:ascii="Calibri" w:hAnsi="Calibri" w:cs="Arial"/>
+                <w:sz w:val="18"/>
+                <w:szCs w:val="18"/>
+                <w:lang w:eastAsia="es-CL"/>
+              </w:rPr>
+              <w:t>Benjamín (APIs de Raúl)</w:t>
             </w:r>
           </w:p>
         </w:tc>
@@ -2608,17 +2518,16 @@
           </w:tcPr>
           <w:p>
             <w:pPr>
-              <w:spacing w:after="120" w:line="259" w:lineRule="auto"/>
-              <w:jc w:val="left"/>
-            </w:pPr>
-            <w:r>
-              <w:rPr>
-                <w:rFonts w:ascii="Calibri" w:hAnsi="Calibri" w:cs="Arial"/>
-                <w:sz w:val="18"/>
-                <w:szCs w:val="18"/>
-                <w:lang w:eastAsia="es-CL"/>
-              </w:rPr>
-              <w:t xml:space="preserve">Consulta pública sin datos internos</w:t>
+              <w:spacing w:after="120"/>
+            </w:pPr>
+            <w:r>
+              <w:rPr>
+                <w:rFonts w:ascii="Calibri" w:hAnsi="Calibri" w:cs="Arial"/>
+                <w:sz w:val="18"/>
+                <w:szCs w:val="18"/>
+                <w:lang w:eastAsia="es-CL"/>
+              </w:rPr>
+              <w:t>Consulta pública sin datos internos</w:t>
             </w:r>
           </w:p>
         </w:tc>
@@ -2628,17 +2537,16 @@
           </w:tcPr>
           <w:p>
             <w:pPr>
-              <w:spacing w:after="120" w:line="259" w:lineRule="auto"/>
-              <w:jc w:val="left"/>
-            </w:pPr>
-            <w:r>
-              <w:rPr>
-                <w:rFonts w:ascii="Calibri" w:hAnsi="Calibri" w:cs="Arial"/>
-                <w:sz w:val="18"/>
-                <w:szCs w:val="18"/>
-                <w:lang w:eastAsia="es-CL"/>
-              </w:rPr>
-              <w:t xml:space="preserve">Completado</w:t>
+              <w:spacing w:after="120"/>
+            </w:pPr>
+            <w:r>
+              <w:rPr>
+                <w:rFonts w:ascii="Calibri" w:hAnsi="Calibri" w:cs="Arial"/>
+                <w:sz w:val="18"/>
+                <w:szCs w:val="18"/>
+                <w:lang w:eastAsia="es-CL"/>
+              </w:rPr>
+              <w:t>Completado</w:t>
             </w:r>
           </w:p>
         </w:tc>
@@ -2648,17 +2556,16 @@
           </w:tcPr>
           <w:p>
             <w:pPr>
-              <w:spacing w:after="120" w:line="259" w:lineRule="auto"/>
-              <w:jc w:val="left"/>
-            </w:pPr>
-            <w:r>
-              <w:rPr>
-                <w:rFonts w:ascii="Calibri" w:hAnsi="Calibri" w:cs="Arial"/>
-                <w:sz w:val="18"/>
-                <w:szCs w:val="18"/>
-                <w:lang w:eastAsia="es-CL"/>
-              </w:rPr>
-              <w:t xml:space="preserve">Se busca por OT o por código de bulto</w:t>
+              <w:spacing w:after="120"/>
+            </w:pPr>
+            <w:r>
+              <w:rPr>
+                <w:rFonts w:ascii="Calibri" w:hAnsi="Calibri" w:cs="Arial"/>
+                <w:sz w:val="18"/>
+                <w:szCs w:val="18"/>
+                <w:lang w:eastAsia="es-CL"/>
+              </w:rPr>
+              <w:t>Se busca por OT o por código de bulto</w:t>
             </w:r>
           </w:p>
         </w:tc>
@@ -2666,6 +2573,7 @@
       <w:tr>
         <w:trPr>
           <w:cantSplit/>
+          <w:jc w:val="center"/>
         </w:trPr>
         <w:tc>
           <w:tcPr>
@@ -2673,17 +2581,16 @@
           </w:tcPr>
           <w:p>
             <w:pPr>
-              <w:spacing w:after="120" w:line="259" w:lineRule="auto"/>
-              <w:jc w:val="left"/>
-            </w:pPr>
-            <w:r>
-              <w:rPr>
-                <w:rFonts w:ascii="Calibri" w:hAnsi="Calibri" w:cs="Arial"/>
-                <w:sz w:val="18"/>
-                <w:szCs w:val="18"/>
-                <w:lang w:eastAsia="es-CL"/>
-              </w:rPr>
-              <w:t xml:space="preserve">Competencias 1, 2 y 5</w:t>
+              <w:spacing w:after="120"/>
+            </w:pPr>
+            <w:r>
+              <w:rPr>
+                <w:rFonts w:ascii="Calibri" w:hAnsi="Calibri" w:cs="Arial"/>
+                <w:sz w:val="18"/>
+                <w:szCs w:val="18"/>
+                <w:lang w:eastAsia="es-CL"/>
+              </w:rPr>
+              <w:t>Competencias 1, 2 y 5</w:t>
             </w:r>
           </w:p>
         </w:tc>
@@ -2693,17 +2600,16 @@
           </w:tcPr>
           <w:p>
             <w:pPr>
-              <w:spacing w:after="120" w:line="259" w:lineRule="auto"/>
-              <w:jc w:val="left"/>
-            </w:pPr>
-            <w:r>
-              <w:rPr>
-                <w:rFonts w:ascii="Calibri" w:hAnsi="Calibri" w:cs="Arial"/>
-                <w:sz w:val="18"/>
-                <w:szCs w:val="18"/>
-                <w:lang w:eastAsia="es-CL"/>
-              </w:rPr>
-              <w:t xml:space="preserve">Pagos y alertas</w:t>
+              <w:spacing w:after="120"/>
+            </w:pPr>
+            <w:r>
+              <w:rPr>
+                <w:rFonts w:ascii="Calibri" w:hAnsi="Calibri" w:cs="Arial"/>
+                <w:sz w:val="18"/>
+                <w:szCs w:val="18"/>
+                <w:lang w:eastAsia="es-CL"/>
+              </w:rPr>
+              <w:t>Pagos y alertas</w:t>
             </w:r>
           </w:p>
         </w:tc>
@@ -2713,17 +2619,16 @@
           </w:tcPr>
           <w:p>
             <w:pPr>
-              <w:spacing w:after="120" w:line="259" w:lineRule="auto"/>
-              <w:jc w:val="left"/>
-            </w:pPr>
-            <w:r>
-              <w:rPr>
-                <w:rFonts w:ascii="Calibri" w:hAnsi="Calibri" w:cs="Arial"/>
-                <w:sz w:val="18"/>
-                <w:szCs w:val="18"/>
-                <w:lang w:eastAsia="es-CL"/>
-              </w:rPr>
-              <w:t xml:space="preserve">Node.js, Webpay, MySQL</w:t>
+              <w:spacing w:after="120"/>
+            </w:pPr>
+            <w:r>
+              <w:rPr>
+                <w:rFonts w:ascii="Calibri" w:hAnsi="Calibri" w:cs="Arial"/>
+                <w:sz w:val="18"/>
+                <w:szCs w:val="18"/>
+                <w:lang w:eastAsia="es-CL"/>
+              </w:rPr>
+              <w:t>Node.js, Webpay, MySQL</w:t>
             </w:r>
           </w:p>
         </w:tc>
@@ -2733,17 +2638,16 @@
           </w:tcPr>
           <w:p>
             <w:pPr>
-              <w:spacing w:after="120" w:line="259" w:lineRule="auto"/>
-              <w:jc w:val="left"/>
-            </w:pPr>
-            <w:r>
-              <w:rPr>
-                <w:rFonts w:ascii="Calibri" w:hAnsi="Calibri" w:cs="Arial"/>
-                <w:sz w:val="18"/>
-                <w:szCs w:val="18"/>
-                <w:lang w:eastAsia="es-CL"/>
-              </w:rPr>
-              <w:t xml:space="preserve">1 semana</w:t>
+              <w:spacing w:after="120"/>
+            </w:pPr>
+            <w:r>
+              <w:rPr>
+                <w:rFonts w:ascii="Calibri" w:hAnsi="Calibri" w:cs="Arial"/>
+                <w:sz w:val="18"/>
+                <w:szCs w:val="18"/>
+                <w:lang w:eastAsia="es-CL"/>
+              </w:rPr>
+              <w:t>1 semana</w:t>
             </w:r>
           </w:p>
         </w:tc>
@@ -2753,17 +2657,16 @@
           </w:tcPr>
           <w:p>
             <w:pPr>
-              <w:spacing w:after="120" w:line="259" w:lineRule="auto"/>
-              <w:jc w:val="left"/>
-            </w:pPr>
-            <w:r>
-              <w:rPr>
-                <w:rFonts w:ascii="Calibri" w:hAnsi="Calibri" w:cs="Arial"/>
-                <w:sz w:val="18"/>
-                <w:szCs w:val="18"/>
-                <w:lang w:eastAsia="es-CL"/>
-              </w:rPr>
-              <w:t xml:space="preserve">Raúl (interfaz y pruebas de Benjamín)</w:t>
+              <w:spacing w:after="120"/>
+            </w:pPr>
+            <w:r>
+              <w:rPr>
+                <w:rFonts w:ascii="Calibri" w:hAnsi="Calibri" w:cs="Arial"/>
+                <w:sz w:val="18"/>
+                <w:szCs w:val="18"/>
+                <w:lang w:eastAsia="es-CL"/>
+              </w:rPr>
+              <w:t>Raúl (interfaz y pruebas de Benjamín)</w:t>
             </w:r>
           </w:p>
         </w:tc>
@@ -2773,17 +2676,16 @@
           </w:tcPr>
           <w:p>
             <w:pPr>
-              <w:spacing w:after="120" w:line="259" w:lineRule="auto"/>
-              <w:jc w:val="left"/>
-            </w:pPr>
-            <w:r>
-              <w:rPr>
-                <w:rFonts w:ascii="Calibri" w:hAnsi="Calibri" w:cs="Arial"/>
-                <w:sz w:val="18"/>
-                <w:szCs w:val="18"/>
-                <w:lang w:eastAsia="es-CL"/>
-              </w:rPr>
-              <w:t xml:space="preserve">Webpay solo en ambiente de pruebas</w:t>
+              <w:spacing w:after="120"/>
+            </w:pPr>
+            <w:r>
+              <w:rPr>
+                <w:rFonts w:ascii="Calibri" w:hAnsi="Calibri" w:cs="Arial"/>
+                <w:sz w:val="18"/>
+                <w:szCs w:val="18"/>
+                <w:lang w:eastAsia="es-CL"/>
+              </w:rPr>
+              <w:t>Webpay solo en ambiente de pruebas</w:t>
             </w:r>
           </w:p>
         </w:tc>
@@ -2793,17 +2695,16 @@
           </w:tcPr>
           <w:p>
             <w:pPr>
-              <w:spacing w:after="120" w:line="259" w:lineRule="auto"/>
-              <w:jc w:val="left"/>
-            </w:pPr>
-            <w:r>
-              <w:rPr>
-                <w:rFonts w:ascii="Calibri" w:hAnsi="Calibri" w:cs="Arial"/>
-                <w:sz w:val="18"/>
-                <w:szCs w:val="18"/>
-                <w:lang w:eastAsia="es-CL"/>
-              </w:rPr>
-              <w:t xml:space="preserve">En curso</w:t>
+              <w:spacing w:after="120"/>
+            </w:pPr>
+            <w:r>
+              <w:rPr>
+                <w:rFonts w:ascii="Calibri" w:hAnsi="Calibri" w:cs="Arial"/>
+                <w:sz w:val="18"/>
+                <w:szCs w:val="18"/>
+                <w:lang w:eastAsia="es-CL"/>
+              </w:rPr>
+              <w:t>En curso</w:t>
             </w:r>
           </w:p>
         </w:tc>
@@ -2813,17 +2714,16 @@
           </w:tcPr>
           <w:p>
             <w:pPr>
-              <w:spacing w:after="120" w:line="259" w:lineRule="auto"/>
-              <w:jc w:val="left"/>
-            </w:pPr>
-            <w:r>
-              <w:rPr>
-                <w:rFonts w:ascii="Calibri" w:hAnsi="Calibri" w:cs="Arial"/>
-                <w:sz w:val="18"/>
-                <w:szCs w:val="18"/>
-                <w:lang w:eastAsia="es-CL"/>
-              </w:rPr>
-              <w:t xml:space="preserve">Falta la alerta de morosidad</w:t>
+              <w:spacing w:after="120"/>
+            </w:pPr>
+            <w:r>
+              <w:rPr>
+                <w:rFonts w:ascii="Calibri" w:hAnsi="Calibri" w:cs="Arial"/>
+                <w:sz w:val="18"/>
+                <w:szCs w:val="18"/>
+                <w:lang w:eastAsia="es-CL"/>
+              </w:rPr>
+              <w:t>Falta la alerta de morosidad</w:t>
             </w:r>
           </w:p>
         </w:tc>
@@ -2831,6 +2731,7 @@
       <w:tr>
         <w:trPr>
           <w:cantSplit/>
+          <w:jc w:val="center"/>
         </w:trPr>
         <w:tc>
           <w:tcPr>
@@ -2838,17 +2739,16 @@
           </w:tcPr>
           <w:p>
             <w:pPr>
-              <w:spacing w:after="120" w:line="259" w:lineRule="auto"/>
-              <w:jc w:val="left"/>
-            </w:pPr>
-            <w:r>
-              <w:rPr>
-                <w:rFonts w:ascii="Calibri" w:hAnsi="Calibri" w:cs="Arial"/>
-                <w:sz w:val="18"/>
-                <w:szCs w:val="18"/>
-                <w:lang w:eastAsia="es-CL"/>
-              </w:rPr>
-              <w:t xml:space="preserve">Competencias 1, 2, 4 y 5</w:t>
+              <w:spacing w:after="120"/>
+            </w:pPr>
+            <w:r>
+              <w:rPr>
+                <w:rFonts w:ascii="Calibri" w:hAnsi="Calibri" w:cs="Arial"/>
+                <w:sz w:val="18"/>
+                <w:szCs w:val="18"/>
+                <w:lang w:eastAsia="es-CL"/>
+              </w:rPr>
+              <w:t>Competencias 1, 2, 4 y 5</w:t>
             </w:r>
           </w:p>
         </w:tc>
@@ -2858,17 +2758,16 @@
           </w:tcPr>
           <w:p>
             <w:pPr>
-              <w:spacing w:after="120" w:line="259" w:lineRule="auto"/>
-              <w:jc w:val="left"/>
-            </w:pPr>
-            <w:r>
-              <w:rPr>
-                <w:rFonts w:ascii="Calibri" w:hAnsi="Calibri" w:cs="Arial"/>
-                <w:sz w:val="18"/>
-                <w:szCs w:val="18"/>
-                <w:lang w:eastAsia="es-CL"/>
-              </w:rPr>
-              <w:t xml:space="preserve">Reportes y Machine Learning</w:t>
+              <w:spacing w:after="120"/>
+            </w:pPr>
+            <w:r>
+              <w:rPr>
+                <w:rFonts w:ascii="Calibri" w:hAnsi="Calibri" w:cs="Arial"/>
+                <w:sz w:val="18"/>
+                <w:szCs w:val="18"/>
+                <w:lang w:eastAsia="es-CL"/>
+              </w:rPr>
+              <w:t>Reportes y Machine Learning</w:t>
             </w:r>
           </w:p>
         </w:tc>
@@ -2878,17 +2777,16 @@
           </w:tcPr>
           <w:p>
             <w:pPr>
-              <w:spacing w:after="120" w:line="259" w:lineRule="auto"/>
-              <w:jc w:val="left"/>
-            </w:pPr>
-            <w:r>
-              <w:rPr>
-                <w:rFonts w:ascii="Calibri" w:hAnsi="Calibri" w:cs="Arial"/>
-                <w:sz w:val="18"/>
-                <w:szCs w:val="18"/>
-                <w:lang w:eastAsia="es-CL"/>
-              </w:rPr>
-              <w:t xml:space="preserve">SQL, pandas, scikit-learn</w:t>
+              <w:spacing w:after="120"/>
+            </w:pPr>
+            <w:r>
+              <w:rPr>
+                <w:rFonts w:ascii="Calibri" w:hAnsi="Calibri" w:cs="Arial"/>
+                <w:sz w:val="18"/>
+                <w:szCs w:val="18"/>
+                <w:lang w:eastAsia="es-CL"/>
+              </w:rPr>
+              <w:t>SQL, pandas, scikit-learn</w:t>
             </w:r>
           </w:p>
         </w:tc>
@@ -2898,17 +2796,16 @@
           </w:tcPr>
           <w:p>
             <w:pPr>
-              <w:spacing w:after="120" w:line="259" w:lineRule="auto"/>
-              <w:jc w:val="left"/>
-            </w:pPr>
-            <w:r>
-              <w:rPr>
-                <w:rFonts w:ascii="Calibri" w:hAnsi="Calibri" w:cs="Arial"/>
-                <w:sz w:val="18"/>
-                <w:szCs w:val="18"/>
-                <w:lang w:eastAsia="es-CL"/>
-              </w:rPr>
-              <w:t xml:space="preserve">2 semanas</w:t>
+              <w:spacing w:after="120"/>
+            </w:pPr>
+            <w:r>
+              <w:rPr>
+                <w:rFonts w:ascii="Calibri" w:hAnsi="Calibri" w:cs="Arial"/>
+                <w:sz w:val="18"/>
+                <w:szCs w:val="18"/>
+                <w:lang w:eastAsia="es-CL"/>
+              </w:rPr>
+              <w:t>2 semanas</w:t>
             </w:r>
           </w:p>
         </w:tc>
@@ -2918,17 +2815,16 @@
           </w:tcPr>
           <w:p>
             <w:pPr>
-              <w:spacing w:after="120" w:line="259" w:lineRule="auto"/>
-              <w:jc w:val="left"/>
-            </w:pPr>
-            <w:r>
-              <w:rPr>
-                <w:rFonts w:ascii="Calibri" w:hAnsi="Calibri" w:cs="Arial"/>
-                <w:sz w:val="18"/>
-                <w:szCs w:val="18"/>
-                <w:lang w:eastAsia="es-CL"/>
-              </w:rPr>
-              <w:t xml:space="preserve">Raúl (ML) y Benjamín (reportes)</w:t>
+              <w:spacing w:after="120"/>
+            </w:pPr>
+            <w:r>
+              <w:rPr>
+                <w:rFonts w:ascii="Calibri" w:hAnsi="Calibri" w:cs="Arial"/>
+                <w:sz w:val="18"/>
+                <w:szCs w:val="18"/>
+                <w:lang w:eastAsia="es-CL"/>
+              </w:rPr>
+              <w:t>Raúl (ML) y Benjamín (reportes)</w:t>
             </w:r>
           </w:p>
         </w:tc>
@@ -2938,17 +2834,16 @@
           </w:tcPr>
           <w:p>
             <w:pPr>
-              <w:spacing w:after="120" w:line="259" w:lineRule="auto"/>
-              <w:jc w:val="left"/>
-            </w:pPr>
-            <w:r>
-              <w:rPr>
-                <w:rFonts w:ascii="Calibri" w:hAnsi="Calibri" w:cs="Arial"/>
-                <w:sz w:val="18"/>
-                <w:szCs w:val="18"/>
-                <w:lang w:eastAsia="es-CL"/>
-              </w:rPr>
-              <w:t xml:space="preserve">No hay datos históricos suficientes para ML</w:t>
+              <w:spacing w:after="120"/>
+            </w:pPr>
+            <w:r>
+              <w:rPr>
+                <w:rFonts w:ascii="Calibri" w:hAnsi="Calibri" w:cs="Arial"/>
+                <w:sz w:val="18"/>
+                <w:szCs w:val="18"/>
+                <w:lang w:eastAsia="es-CL"/>
+              </w:rPr>
+              <w:t>No hay datos históricos suficientes para ML</w:t>
             </w:r>
           </w:p>
         </w:tc>
@@ -2958,17 +2853,16 @@
           </w:tcPr>
           <w:p>
             <w:pPr>
-              <w:spacing w:after="120" w:line="259" w:lineRule="auto"/>
-              <w:jc w:val="left"/>
-            </w:pPr>
-            <w:r>
-              <w:rPr>
-                <w:rFonts w:ascii="Calibri" w:hAnsi="Calibri" w:cs="Arial"/>
-                <w:sz w:val="18"/>
-                <w:szCs w:val="18"/>
-                <w:lang w:eastAsia="es-CL"/>
-              </w:rPr>
-              <w:t xml:space="preserve">Ajustada</w:t>
+              <w:spacing w:after="120"/>
+            </w:pPr>
+            <w:r>
+              <w:rPr>
+                <w:rFonts w:ascii="Calibri" w:hAnsi="Calibri" w:cs="Arial"/>
+                <w:sz w:val="18"/>
+                <w:szCs w:val="18"/>
+                <w:lang w:eastAsia="es-CL"/>
+              </w:rPr>
+              <w:t>Ajustada</w:t>
             </w:r>
           </w:p>
         </w:tc>
@@ -2978,17 +2872,16 @@
           </w:tcPr>
           <w:p>
             <w:pPr>
-              <w:spacing w:after="120" w:line="259" w:lineRule="auto"/>
-              <w:jc w:val="left"/>
-            </w:pPr>
-            <w:r>
-              <w:rPr>
-                <w:rFonts w:ascii="Calibri" w:hAnsi="Calibri" w:cs="Arial"/>
-                <w:sz w:val="18"/>
-                <w:szCs w:val="18"/>
-                <w:lang w:eastAsia="es-CL"/>
-              </w:rPr>
-              <w:t xml:space="preserve">Reportes en curso; ML queda fuera de esta entrega</w:t>
+              <w:spacing w:after="120"/>
+            </w:pPr>
+            <w:r>
+              <w:rPr>
+                <w:rFonts w:ascii="Calibri" w:hAnsi="Calibri" w:cs="Arial"/>
+                <w:sz w:val="18"/>
+                <w:szCs w:val="18"/>
+                <w:lang w:eastAsia="es-CL"/>
+              </w:rPr>
+              <w:t>Reportes en curso; ML queda fuera de esta entrega</w:t>
             </w:r>
           </w:p>
         </w:tc>
@@ -2996,6 +2889,7 @@
       <w:tr>
         <w:trPr>
           <w:cantSplit/>
+          <w:jc w:val="center"/>
         </w:trPr>
         <w:tc>
           <w:tcPr>
@@ -3003,17 +2897,16 @@
           </w:tcPr>
           <w:p>
             <w:pPr>
-              <w:spacing w:after="120" w:line="259" w:lineRule="auto"/>
-              <w:jc w:val="left"/>
-            </w:pPr>
-            <w:r>
-              <w:rPr>
-                <w:rFonts w:ascii="Calibri" w:hAnsi="Calibri" w:cs="Arial"/>
-                <w:sz w:val="18"/>
-                <w:szCs w:val="18"/>
-                <w:lang w:eastAsia="es-CL"/>
-              </w:rPr>
-              <w:t xml:space="preserve">Competencias 1, 2, 4 y 5</w:t>
+              <w:spacing w:after="120"/>
+            </w:pPr>
+            <w:r>
+              <w:rPr>
+                <w:rFonts w:ascii="Calibri" w:hAnsi="Calibri" w:cs="Arial"/>
+                <w:sz w:val="18"/>
+                <w:szCs w:val="18"/>
+                <w:lang w:eastAsia="es-CL"/>
+              </w:rPr>
+              <w:t>Competencias 1, 2, 4 y 5</w:t>
             </w:r>
           </w:p>
         </w:tc>
@@ -3023,17 +2916,16 @@
           </w:tcPr>
           <w:p>
             <w:pPr>
-              <w:spacing w:after="120" w:line="259" w:lineRule="auto"/>
-              <w:jc w:val="left"/>
-            </w:pPr>
-            <w:r>
-              <w:rPr>
-                <w:rFonts w:ascii="Calibri" w:hAnsi="Calibri" w:cs="Arial"/>
-                <w:sz w:val="18"/>
-                <w:szCs w:val="18"/>
-                <w:lang w:eastAsia="es-CL"/>
-              </w:rPr>
-              <w:t xml:space="preserve">Pruebas e integración general</w:t>
+              <w:spacing w:after="120"/>
+            </w:pPr>
+            <w:r>
+              <w:rPr>
+                <w:rFonts w:ascii="Calibri" w:hAnsi="Calibri" w:cs="Arial"/>
+                <w:sz w:val="18"/>
+                <w:szCs w:val="18"/>
+                <w:lang w:eastAsia="es-CL"/>
+              </w:rPr>
+              <w:t>Pruebas e integración general</w:t>
             </w:r>
           </w:p>
         </w:tc>
@@ -3043,17 +2935,16 @@
           </w:tcPr>
           <w:p>
             <w:pPr>
-              <w:spacing w:after="120" w:line="259" w:lineRule="auto"/>
-              <w:jc w:val="left"/>
-            </w:pPr>
-            <w:r>
-              <w:rPr>
-                <w:rFonts w:ascii="Calibri" w:hAnsi="Calibri" w:cs="Arial"/>
-                <w:sz w:val="18"/>
-                <w:szCs w:val="18"/>
-                <w:lang w:eastAsia="es-CL"/>
-              </w:rPr>
-              <w:t xml:space="preserve">Postman, GitHub, navegadores</w:t>
+              <w:spacing w:after="120"/>
+            </w:pPr>
+            <w:r>
+              <w:rPr>
+                <w:rFonts w:ascii="Calibri" w:hAnsi="Calibri" w:cs="Arial"/>
+                <w:sz w:val="18"/>
+                <w:szCs w:val="18"/>
+                <w:lang w:eastAsia="es-CL"/>
+              </w:rPr>
+              <w:t>Postman, GitHub, navegadores</w:t>
             </w:r>
           </w:p>
         </w:tc>
@@ -3063,17 +2954,16 @@
           </w:tcPr>
           <w:p>
             <w:pPr>
-              <w:spacing w:after="120" w:line="259" w:lineRule="auto"/>
-              <w:jc w:val="left"/>
-            </w:pPr>
-            <w:r>
-              <w:rPr>
-                <w:rFonts w:ascii="Calibri" w:hAnsi="Calibri" w:cs="Arial"/>
-                <w:sz w:val="18"/>
-                <w:szCs w:val="18"/>
-                <w:lang w:eastAsia="es-CL"/>
-              </w:rPr>
-              <w:t xml:space="preserve">2 semanas</w:t>
+              <w:spacing w:after="120"/>
+            </w:pPr>
+            <w:r>
+              <w:rPr>
+                <w:rFonts w:ascii="Calibri" w:hAnsi="Calibri" w:cs="Arial"/>
+                <w:sz w:val="18"/>
+                <w:szCs w:val="18"/>
+                <w:lang w:eastAsia="es-CL"/>
+              </w:rPr>
+              <w:t>2 semanas</w:t>
             </w:r>
           </w:p>
         </w:tc>
@@ -3083,17 +2973,16 @@
           </w:tcPr>
           <w:p>
             <w:pPr>
-              <w:spacing w:after="120" w:line="259" w:lineRule="auto"/>
-              <w:jc w:val="left"/>
-            </w:pPr>
-            <w:r>
-              <w:rPr>
-                <w:rFonts w:ascii="Calibri" w:hAnsi="Calibri" w:cs="Arial"/>
-                <w:sz w:val="18"/>
-                <w:szCs w:val="18"/>
-                <w:lang w:eastAsia="es-CL"/>
-              </w:rPr>
-              <w:t xml:space="preserve">Raúl y Benjamín</w:t>
+              <w:spacing w:after="120"/>
+            </w:pPr>
+            <w:r>
+              <w:rPr>
+                <w:rFonts w:ascii="Calibri" w:hAnsi="Calibri" w:cs="Arial"/>
+                <w:sz w:val="18"/>
+                <w:szCs w:val="18"/>
+                <w:lang w:eastAsia="es-CL"/>
+              </w:rPr>
+              <w:t>Raúl y Benjamín</w:t>
             </w:r>
           </w:p>
         </w:tc>
@@ -3103,17 +2992,16 @@
           </w:tcPr>
           <w:p>
             <w:pPr>
-              <w:spacing w:after="120" w:line="259" w:lineRule="auto"/>
-              <w:jc w:val="left"/>
-            </w:pPr>
-            <w:r>
-              <w:rPr>
-                <w:rFonts w:ascii="Calibri" w:hAnsi="Calibri" w:cs="Arial"/>
-                <w:sz w:val="18"/>
-                <w:szCs w:val="18"/>
-                <w:lang w:eastAsia="es-CL"/>
-              </w:rPr>
-              <w:t xml:space="preserve">Falta automatizar las pruebas</w:t>
+              <w:spacing w:after="120"/>
+            </w:pPr>
+            <w:r>
+              <w:rPr>
+                <w:rFonts w:ascii="Calibri" w:hAnsi="Calibri" w:cs="Arial"/>
+                <w:sz w:val="18"/>
+                <w:szCs w:val="18"/>
+                <w:lang w:eastAsia="es-CL"/>
+              </w:rPr>
+              <w:t>Falta automatizar las pruebas</w:t>
             </w:r>
           </w:p>
         </w:tc>
@@ -3123,17 +3011,16 @@
           </w:tcPr>
           <w:p>
             <w:pPr>
-              <w:spacing w:after="120" w:line="259" w:lineRule="auto"/>
-              <w:jc w:val="left"/>
-            </w:pPr>
-            <w:r>
-              <w:rPr>
-                <w:rFonts w:ascii="Calibri" w:hAnsi="Calibri" w:cs="Arial"/>
-                <w:sz w:val="18"/>
-                <w:szCs w:val="18"/>
-                <w:lang w:eastAsia="es-CL"/>
-              </w:rPr>
-              <w:t xml:space="preserve">En curso</w:t>
+              <w:spacing w:after="120"/>
+            </w:pPr>
+            <w:r>
+              <w:rPr>
+                <w:rFonts w:ascii="Calibri" w:hAnsi="Calibri" w:cs="Arial"/>
+                <w:sz w:val="18"/>
+                <w:szCs w:val="18"/>
+                <w:lang w:eastAsia="es-CL"/>
+              </w:rPr>
+              <w:t>En curso</w:t>
             </w:r>
           </w:p>
         </w:tc>
@@ -3143,17 +3030,16 @@
           </w:tcPr>
           <w:p>
             <w:pPr>
-              <w:spacing w:after="120" w:line="259" w:lineRule="auto"/>
-              <w:jc w:val="left"/>
-            </w:pPr>
-            <w:r>
-              <w:rPr>
-                <w:rFonts w:ascii="Calibri" w:hAnsi="Calibri" w:cs="Arial"/>
-                <w:sz w:val="18"/>
-                <w:szCs w:val="18"/>
-                <w:lang w:eastAsia="es-CL"/>
-              </w:rPr>
-              <w:t xml:space="preserve">Pruebas con Postman en vez de una suite automática</w:t>
+              <w:spacing w:after="120"/>
+            </w:pPr>
+            <w:r>
+              <w:rPr>
+                <w:rFonts w:ascii="Calibri" w:hAnsi="Calibri" w:cs="Arial"/>
+                <w:sz w:val="18"/>
+                <w:szCs w:val="18"/>
+                <w:lang w:eastAsia="es-CL"/>
+              </w:rPr>
+              <w:t>Pruebas con Postman en vez de una suite automática</w:t>
             </w:r>
           </w:p>
         </w:tc>
@@ -3161,6 +3047,7 @@
       <w:tr>
         <w:trPr>
           <w:cantSplit/>
+          <w:jc w:val="center"/>
         </w:trPr>
         <w:tc>
           <w:tcPr>
@@ -3168,17 +3055,16 @@
           </w:tcPr>
           <w:p>
             <w:pPr>
-              <w:spacing w:after="120" w:line="259" w:lineRule="auto"/>
-              <w:jc w:val="left"/>
-            </w:pPr>
-            <w:r>
-              <w:rPr>
-                <w:rFonts w:ascii="Calibri" w:hAnsi="Calibri" w:cs="Arial"/>
-                <w:sz w:val="18"/>
-                <w:szCs w:val="18"/>
-                <w:lang w:eastAsia="es-CL"/>
-              </w:rPr>
-              <w:t xml:space="preserve">Competencias 1, 4 y 5</w:t>
+              <w:spacing w:after="120"/>
+            </w:pPr>
+            <w:r>
+              <w:rPr>
+                <w:rFonts w:ascii="Calibri" w:hAnsi="Calibri" w:cs="Arial"/>
+                <w:sz w:val="18"/>
+                <w:szCs w:val="18"/>
+                <w:lang w:eastAsia="es-CL"/>
+              </w:rPr>
+              <w:t>Competencias 1, 4 y 5</w:t>
             </w:r>
           </w:p>
         </w:tc>
@@ -3188,17 +3074,16 @@
           </w:tcPr>
           <w:p>
             <w:pPr>
-              <w:spacing w:after="120" w:line="259" w:lineRule="auto"/>
-              <w:jc w:val="left"/>
-            </w:pPr>
-            <w:r>
-              <w:rPr>
-                <w:rFonts w:ascii="Calibri" w:hAnsi="Calibri" w:cs="Arial"/>
-                <w:sz w:val="18"/>
-                <w:szCs w:val="18"/>
-                <w:lang w:eastAsia="es-CL"/>
-              </w:rPr>
-              <w:t xml:space="preserve">Documentación, evidencias y presentación</w:t>
+              <w:spacing w:after="120"/>
+            </w:pPr>
+            <w:r>
+              <w:rPr>
+                <w:rFonts w:ascii="Calibri" w:hAnsi="Calibri" w:cs="Arial"/>
+                <w:sz w:val="18"/>
+                <w:szCs w:val="18"/>
+                <w:lang w:eastAsia="es-CL"/>
+              </w:rPr>
+              <w:t>Documentación, evidencias y presentación</w:t>
             </w:r>
           </w:p>
         </w:tc>
@@ -3208,17 +3093,16 @@
           </w:tcPr>
           <w:p>
             <w:pPr>
-              <w:spacing w:after="120" w:line="259" w:lineRule="auto"/>
-              <w:jc w:val="left"/>
-            </w:pPr>
-            <w:r>
-              <w:rPr>
-                <w:rFonts w:ascii="Calibri" w:hAnsi="Calibri" w:cs="Arial"/>
-                <w:sz w:val="18"/>
-                <w:szCs w:val="18"/>
-                <w:lang w:eastAsia="es-CL"/>
-              </w:rPr>
-              <w:t xml:space="preserve">Word, PowerPoint, GitHub</w:t>
+              <w:spacing w:after="120"/>
+            </w:pPr>
+            <w:r>
+              <w:rPr>
+                <w:rFonts w:ascii="Calibri" w:hAnsi="Calibri" w:cs="Arial"/>
+                <w:sz w:val="18"/>
+                <w:szCs w:val="18"/>
+                <w:lang w:eastAsia="es-CL"/>
+              </w:rPr>
+              <w:t>Word, PowerPoint, GitHub</w:t>
             </w:r>
           </w:p>
         </w:tc>
@@ -3228,17 +3112,16 @@
           </w:tcPr>
           <w:p>
             <w:pPr>
-              <w:spacing w:after="120" w:line="259" w:lineRule="auto"/>
-              <w:jc w:val="left"/>
-            </w:pPr>
-            <w:r>
-              <w:rPr>
-                <w:rFonts w:ascii="Calibri" w:hAnsi="Calibri" w:cs="Arial"/>
-                <w:sz w:val="18"/>
-                <w:szCs w:val="18"/>
-                <w:lang w:eastAsia="es-CL"/>
-              </w:rPr>
-              <w:t xml:space="preserve">2 semanas</w:t>
+              <w:spacing w:after="120"/>
+            </w:pPr>
+            <w:r>
+              <w:rPr>
+                <w:rFonts w:ascii="Calibri" w:hAnsi="Calibri" w:cs="Arial"/>
+                <w:sz w:val="18"/>
+                <w:szCs w:val="18"/>
+                <w:lang w:eastAsia="es-CL"/>
+              </w:rPr>
+              <w:t>2 semanas</w:t>
             </w:r>
           </w:p>
         </w:tc>
@@ -3248,17 +3131,16 @@
           </w:tcPr>
           <w:p>
             <w:pPr>
-              <w:spacing w:after="120" w:line="259" w:lineRule="auto"/>
-              <w:jc w:val="left"/>
-            </w:pPr>
-            <w:r>
-              <w:rPr>
-                <w:rFonts w:ascii="Calibri" w:hAnsi="Calibri" w:cs="Arial"/>
-                <w:sz w:val="18"/>
-                <w:szCs w:val="18"/>
-                <w:lang w:eastAsia="es-CL"/>
-              </w:rPr>
-              <w:t xml:space="preserve">Raúl y Benjamín</w:t>
+              <w:spacing w:after="120"/>
+            </w:pPr>
+            <w:r>
+              <w:rPr>
+                <w:rFonts w:ascii="Calibri" w:hAnsi="Calibri" w:cs="Arial"/>
+                <w:sz w:val="18"/>
+                <w:szCs w:val="18"/>
+                <w:lang w:eastAsia="es-CL"/>
+              </w:rPr>
+              <w:t>Raúl y Benjamín</w:t>
             </w:r>
           </w:p>
         </w:tc>
@@ -3268,17 +3150,16 @@
           </w:tcPr>
           <w:p>
             <w:pPr>
-              <w:spacing w:after="120" w:line="259" w:lineRule="auto"/>
-              <w:jc w:val="left"/>
-            </w:pPr>
-            <w:r>
-              <w:rPr>
-                <w:rFonts w:ascii="Calibri" w:hAnsi="Calibri" w:cs="Arial"/>
-                <w:sz w:val="18"/>
-                <w:szCs w:val="18"/>
-                <w:lang w:eastAsia="es-CL"/>
-              </w:rPr>
-              <w:t xml:space="preserve">Los informes de esta fase ya están</w:t>
+              <w:spacing w:after="120"/>
+            </w:pPr>
+            <w:r>
+              <w:rPr>
+                <w:rFonts w:ascii="Calibri" w:hAnsi="Calibri" w:cs="Arial"/>
+                <w:sz w:val="18"/>
+                <w:szCs w:val="18"/>
+                <w:lang w:eastAsia="es-CL"/>
+              </w:rPr>
+              <w:t>Los informes de esta fase ya están</w:t>
             </w:r>
           </w:p>
         </w:tc>
@@ -3288,17 +3169,16 @@
           </w:tcPr>
           <w:p>
             <w:pPr>
-              <w:spacing w:after="120" w:line="259" w:lineRule="auto"/>
-              <w:jc w:val="left"/>
-            </w:pPr>
-            <w:r>
-              <w:rPr>
-                <w:rFonts w:ascii="Calibri" w:hAnsi="Calibri" w:cs="Arial"/>
-                <w:sz w:val="18"/>
-                <w:szCs w:val="18"/>
-                <w:lang w:eastAsia="es-CL"/>
-              </w:rPr>
-              <w:t xml:space="preserve">En curso</w:t>
+              <w:spacing w:after="120"/>
+            </w:pPr>
+            <w:r>
+              <w:rPr>
+                <w:rFonts w:ascii="Calibri" w:hAnsi="Calibri" w:cs="Arial"/>
+                <w:sz w:val="18"/>
+                <w:szCs w:val="18"/>
+                <w:lang w:eastAsia="es-CL"/>
+              </w:rPr>
+              <w:t>En curso</w:t>
             </w:r>
           </w:p>
         </w:tc>
@@ -3308,17 +3188,16 @@
           </w:tcPr>
           <w:p>
             <w:pPr>
-              <w:spacing w:after="120" w:line="259" w:lineRule="auto"/>
-              <w:jc w:val="left"/>
-            </w:pPr>
-            <w:r>
-              <w:rPr>
-                <w:rFonts w:ascii="Calibri" w:hAnsi="Calibri" w:cs="Arial"/>
-                <w:sz w:val="18"/>
-                <w:szCs w:val="18"/>
-                <w:lang w:eastAsia="es-CL"/>
-              </w:rPr>
-              <w:t xml:space="preserve">Manual de usuario y video quedan para la Fase 3</w:t>
+              <w:spacing w:after="120"/>
+            </w:pPr>
+            <w:r>
+              <w:rPr>
+                <w:rFonts w:ascii="Calibri" w:hAnsi="Calibri" w:cs="Arial"/>
+                <w:sz w:val="18"/>
+                <w:szCs w:val="18"/>
+                <w:lang w:eastAsia="es-CL"/>
+              </w:rPr>
+              <w:t>Manual de usuario y video quedan para la Fase 3</w:t>
             </w:r>
           </w:p>
         </w:tc>
@@ -3407,7 +3286,7 @@
                 <w:rFonts w:ascii="Calibri" w:hAnsi="Calibri"/>
                 <w:color w:val="1F3864" w:themeColor="accent1" w:themeShade="80"/>
               </w:rPr>
-              <w:t xml:space="preserve">Profundiza en las observaciones de tu plan de trabajo. Analiza las actividades planificadas y señala qué aspectos facilitaron u obstaculizaron la ejecución del plan. Plantea cómo abordaste y/o abordarás los obstáculos. Por último, señala los ajustes que realizaste al plan de trabajo a partir de este análisis.</w:t>
+              <w:t>Profundiza en las observaciones de tu plan de trabajo. Analiza las actividades planificadas y señala qué aspectos facilitaron u obstaculizaron la ejecución del plan. Plantea cómo abordaste y/o abordarás los obstáculos. Por último, señala los ajustes que realizaste al plan de trabajo a partir de este análisis.</w:t>
             </w:r>
           </w:p>
         </w:tc>
@@ -3469,7 +3348,7 @@
                 <w:rFonts w:ascii="Calibri" w:hAnsi="Calibri"/>
                 <w:color w:val="1F3864" w:themeColor="accent1" w:themeShade="80"/>
               </w:rPr>
-              <w:t xml:space="preserve">Factores que han facilitado y/o dificultado el desarrollo de mi plan de trabajo</w:t>
+              <w:t>Factores que han facilitado y/o dificultado el desarrollo de mi plan de trabajo</w:t>
             </w:r>
             <w:r>
               <w:rPr>
@@ -3504,15 +3383,13 @@
           </w:p>
           <w:p>
             <w:pPr>
-              <w:spacing w:after="120" w:line="259" w:lineRule="auto"/>
+              <w:spacing w:after="120"/>
               <w:jc w:val="both"/>
             </w:pPr>
             <w:r>
               <w:rPr>
                 <w:rFonts w:ascii="Calibri" w:hAnsi="Calibri" w:cs="Arial"/>
                 <w:b/>
-                <w:sz w:val="22"/>
-                <w:szCs w:val="22"/>
                 <w:lang w:eastAsia="es-CL"/>
               </w:rPr>
               <w:t xml:space="preserve">Lo que nos ayudó: </w:t>
@@ -3520,24 +3397,48 @@
             <w:r>
               <w:rPr>
                 <w:rFonts w:ascii="Calibri" w:hAnsi="Calibri" w:cs="Arial"/>
-                <w:sz w:val="22"/>
-                <w:szCs w:val="22"/>
-                <w:lang w:eastAsia="es-CL"/>
-              </w:rPr>
-              <w:t xml:space="preserve">ya habíamos trabajado juntos antes y desde la Fase 1 teníamos claro cómo repartirnos. Raúl se enfocó más en el backend, la base de datos, los manifiestos y los pagos, y Benjamín en el frontend, el portal del cliente y las pruebas con Postman. Tener todo en un mismo repositorio también ayudó harto, porque no trabajábamos sobre copias distintas. Y probar con casos reales de la operación nos dejó claras las reglas: quién cobra, cuándo se da de baja una OT y qué viaje no cobra.</w:t>
-            </w:r>
-          </w:p>
-          <w:p>
-            <w:pPr>
-              <w:spacing w:after="120" w:line="259" w:lineRule="auto"/>
+                <w:lang w:eastAsia="es-CL"/>
+              </w:rPr>
+              <w:t xml:space="preserve">ya habíamos trabajado juntos antes y desde la Fase 1 teníamos claro cómo repartirnos. Raúl se enfocó más en el backend, la base de datos, los manifiestos y los pagos, y </w:t>
+            </w:r>
+            <w:r>
+              <w:rPr>
+                <w:rFonts w:ascii="Calibri" w:hAnsi="Calibri" w:cs="Arial"/>
+                <w:lang w:eastAsia="es-CL"/>
+              </w:rPr>
+              <w:t>yo (</w:t>
+            </w:r>
+            <w:r>
+              <w:rPr>
+                <w:rFonts w:ascii="Calibri" w:hAnsi="Calibri" w:cs="Arial"/>
+                <w:lang w:eastAsia="es-CL"/>
+              </w:rPr>
+              <w:t>Benjamín</w:t>
+            </w:r>
+            <w:r>
+              <w:rPr>
+                <w:rFonts w:ascii="Calibri" w:hAnsi="Calibri" w:cs="Arial"/>
+                <w:lang w:eastAsia="es-CL"/>
+              </w:rPr>
+              <w:t>)</w:t>
+            </w:r>
+            <w:r>
+              <w:rPr>
+                <w:rFonts w:ascii="Calibri" w:hAnsi="Calibri" w:cs="Arial"/>
+                <w:lang w:eastAsia="es-CL"/>
+              </w:rPr>
+              <w:t xml:space="preserve"> en el frontend, el portal del cliente y las pruebas con Postman. Tener todo en un mismo repositorio también ayudó harto, porque no trabajábamos sobre copias distintas. Y probar con casos reales de la operación nos dejó claras las reglas: quién cobra, cuándo se da de baja una OT y qué viaje no cobra.</w:t>
+            </w:r>
+          </w:p>
+          <w:p>
+            <w:pPr>
+              <w:spacing w:after="120"/>
               <w:jc w:val="both"/>
             </w:pPr>
             <w:r>
               <w:rPr>
                 <w:rFonts w:ascii="Calibri" w:hAnsi="Calibri" w:cs="Arial"/>
                 <w:b/>
-                <w:sz w:val="22"/>
-                <w:szCs w:val="22"/>
                 <w:lang w:eastAsia="es-CL"/>
               </w:rPr>
               <w:t xml:space="preserve">Lo que nos complicó y cómo lo resolvimos: </w:t>
@@ -3545,41 +3446,35 @@
             <w:r>
               <w:rPr>
                 <w:rFonts w:ascii="Calibri" w:hAnsi="Calibri" w:cs="Arial"/>
-                <w:sz w:val="22"/>
-                <w:szCs w:val="22"/>
-                <w:lang w:eastAsia="es-CL"/>
-              </w:rPr>
-              <w:t xml:space="preserve">lo más difícil fue el cobro. La primera versión marcaba la OT como pagada apenas el peoneta la entregaba, y eso no calza con cómo trabaja la oficina, que primero revisa el efectivo o la transferencia. Lo cambiamos: ahora la entrega deja la OT por cuadrar y la oficina la da de baja después, orden por orden.</w:t>
-            </w:r>
-          </w:p>
-          <w:p>
-            <w:pPr>
-              <w:spacing w:after="120" w:line="259" w:lineRule="auto"/>
+                <w:lang w:eastAsia="es-CL"/>
+              </w:rPr>
+              <w:t>lo más difícil fue el cobro. La primera versión marcaba la OT como pagada apenas el peoneta la entregaba, y eso no calza con cómo trabaja la oficina, que primero revisa el efectivo o la transferencia. Lo cambiamos: ahora la entrega deja la OT por cuadrar y la oficina la da de baja después, orden por orden.</w:t>
+            </w:r>
+          </w:p>
+          <w:p>
+            <w:pPr>
+              <w:spacing w:after="120"/>
               <w:jc w:val="both"/>
             </w:pPr>
             <w:r>
               <w:rPr>
                 <w:rFonts w:ascii="Calibri" w:hAnsi="Calibri" w:cs="Arial"/>
-                <w:sz w:val="22"/>
-                <w:szCs w:val="22"/>
-                <w:lang w:eastAsia="es-CL"/>
-              </w:rPr>
-              <w:t xml:space="preserve">También tuvimos que rehacer las pantallas de caja y de manifiestos, porque al principio no mostraban el detalle que la oficina necesita. Ahora se revisa una orden a la vez, con los mismos datos que salen en el PDF del manifiesto.</w:t>
-            </w:r>
-          </w:p>
-          <w:p>
-            <w:pPr>
-              <w:spacing w:after="120" w:line="259" w:lineRule="auto"/>
+                <w:lang w:eastAsia="es-CL"/>
+              </w:rPr>
+              <w:t>También tuvimos que rehacer las pantallas de caja y de manifiestos, porque al principio no mostraban el detalle que la oficina necesita. Ahora se revisa una orden a la vez, con los mismos datos que salen en el PDF del manifiesto.</w:t>
+            </w:r>
+          </w:p>
+          <w:p>
+            <w:pPr>
+              <w:spacing w:after="120"/>
               <w:jc w:val="both"/>
             </w:pPr>
             <w:r>
               <w:rPr>
                 <w:rFonts w:ascii="Calibri" w:hAnsi="Calibri" w:cs="Arial"/>
-                <w:sz w:val="22"/>
-                <w:szCs w:val="22"/>
-                <w:lang w:eastAsia="es-CL"/>
-              </w:rPr>
-              <w:t xml:space="preserve">Otra dificultad fue que algunos cambios en la base de datos no quedaban en el repositorio, y eso hacía difícil levantar el proyecto en otro computador. Lo solucionamos exportando la base y dejando instrucciones para levantar el backend y crear usuarios de prueba. Por último, nos costó ordenarnos con los tiempos; para lo que queda vamos a usar un tablero Kanban con tareas semanales.</w:t>
+                <w:lang w:eastAsia="es-CL"/>
+              </w:rPr>
+              <w:t>Otra dificultad fue que algunos cambios en la base de datos no quedaban en el repositorio, y eso hacía difícil levantar el proyecto en otro computador. Lo solucionamos exportando la base y dejando instrucciones para levantar el backend y crear usuarios de prueba. Por último, nos costó ordenarnos con los tiempos; para lo que queda vamos a usar un tablero Kanban con tareas semanales.</w:t>
             </w:r>
           </w:p>
         </w:tc>
@@ -3640,7 +3535,6 @@
                 <w:rFonts w:ascii="Calibri" w:hAnsi="Calibri"/>
                 <w:color w:val="1F3864" w:themeColor="accent1" w:themeShade="80"/>
               </w:rPr>
-              <w:lastRenderedPageBreak/>
               <w:t xml:space="preserve">Actividades ajustadas o eliminadas: </w:t>
             </w:r>
             <w:r>
@@ -3671,15 +3565,13 @@
           </w:p>
           <w:p>
             <w:pPr>
-              <w:spacing w:after="120" w:line="259" w:lineRule="auto"/>
+              <w:spacing w:after="120"/>
               <w:jc w:val="both"/>
             </w:pPr>
             <w:r>
               <w:rPr>
                 <w:rFonts w:ascii="Calibri" w:hAnsi="Calibri" w:cs="Arial"/>
                 <w:b/>
-                <w:sz w:val="22"/>
-                <w:szCs w:val="22"/>
                 <w:lang w:eastAsia="es-CL"/>
               </w:rPr>
               <w:t xml:space="preserve">Machine Learning: </w:t>
@@ -3687,24 +3579,20 @@
             <w:r>
               <w:rPr>
                 <w:rFonts w:ascii="Calibri" w:hAnsi="Calibri" w:cs="Arial"/>
-                <w:sz w:val="22"/>
-                <w:szCs w:val="22"/>
-                <w:lang w:eastAsia="es-CL"/>
-              </w:rPr>
-              <w:t xml:space="preserve">no se entrega en esta fase. No hay suficiente historial para entrenar un modelo que sirva, y preferimos no presentar un resultado que el sistema no produce. Mientras tanto, la cuenta corriente clasifica clientes con reglas simples.</w:t>
-            </w:r>
-          </w:p>
-          <w:p>
-            <w:pPr>
-              <w:spacing w:after="120" w:line="259" w:lineRule="auto"/>
+                <w:lang w:eastAsia="es-CL"/>
+              </w:rPr>
+              <w:t>no se entrega en esta fase. No hay suficiente historial para entrenar un modelo que sirva, y preferimos no presentar un resultado que el sistema no produce. Mientras tanto, la cuenta corriente clasifica clientes con reglas simples.</w:t>
+            </w:r>
+          </w:p>
+          <w:p>
+            <w:pPr>
+              <w:spacing w:after="120"/>
               <w:jc w:val="both"/>
             </w:pPr>
             <w:r>
               <w:rPr>
                 <w:rFonts w:ascii="Calibri" w:hAnsi="Calibri" w:cs="Arial"/>
                 <w:b/>
-                <w:sz w:val="22"/>
-                <w:szCs w:val="22"/>
                 <w:lang w:eastAsia="es-CL"/>
               </w:rPr>
               <w:t xml:space="preserve">Facturación electrónica: </w:t>
@@ -3712,24 +3600,20 @@
             <w:r>
               <w:rPr>
                 <w:rFonts w:ascii="Calibri" w:hAnsi="Calibri" w:cs="Arial"/>
-                <w:sz w:val="22"/>
-                <w:szCs w:val="22"/>
-                <w:lang w:eastAsia="es-CL"/>
-              </w:rPr>
-              <w:t xml:space="preserve">la sacamos del menú. Ya en la Fase 1 dependía de la autorización del servicio tributario, y no tenía sentido mostrar una opción que no funciona.</w:t>
-            </w:r>
-          </w:p>
-          <w:p>
-            <w:pPr>
-              <w:spacing w:after="120" w:line="259" w:lineRule="auto"/>
+                <w:lang w:eastAsia="es-CL"/>
+              </w:rPr>
+              <w:t>la sacamos del menú. Ya en la Fase 1 dependía de la autorización del servicio tributario, y no tenía sentido mostrar una opción que no funciona.</w:t>
+            </w:r>
+          </w:p>
+          <w:p>
+            <w:pPr>
+              <w:spacing w:after="120"/>
               <w:jc w:val="both"/>
             </w:pPr>
             <w:r>
               <w:rPr>
                 <w:rFonts w:ascii="Calibri" w:hAnsi="Calibri" w:cs="Arial"/>
                 <w:b/>
-                <w:sz w:val="22"/>
-                <w:szCs w:val="22"/>
                 <w:lang w:eastAsia="es-CL"/>
               </w:rPr>
               <w:t xml:space="preserve">Manifiestos: </w:t>
@@ -3737,24 +3621,20 @@
             <w:r>
               <w:rPr>
                 <w:rFonts w:ascii="Calibri" w:hAnsi="Calibri" w:cs="Arial"/>
-                <w:sz w:val="22"/>
-                <w:szCs w:val="22"/>
-                <w:lang w:eastAsia="es-CL"/>
-              </w:rPr>
-              <w:t xml:space="preserve">los dividimos en dos tipos, reparto y traspaso, porque el traspaso entre bodegas no se entrega ni se cobra en la puerta.</w:t>
-            </w:r>
-          </w:p>
-          <w:p>
-            <w:pPr>
-              <w:spacing w:after="120" w:line="259" w:lineRule="auto"/>
+                <w:lang w:eastAsia="es-CL"/>
+              </w:rPr>
+              <w:t>los dividimos en dos tipos, reparto y traspaso, porque el traspaso entre bodegas no se entrega ni se cobra en la puerta.</w:t>
+            </w:r>
+          </w:p>
+          <w:p>
+            <w:pPr>
+              <w:spacing w:after="120"/>
               <w:jc w:val="both"/>
             </w:pPr>
             <w:r>
               <w:rPr>
                 <w:rFonts w:ascii="Calibri" w:hAnsi="Calibri" w:cs="Arial"/>
                 <w:b/>
-                <w:sz w:val="22"/>
-                <w:szCs w:val="22"/>
                 <w:lang w:eastAsia="es-CL"/>
               </w:rPr>
               <w:t xml:space="preserve">Pagos: </w:t>
@@ -3762,24 +3642,20 @@
             <w:r>
               <w:rPr>
                 <w:rFonts w:ascii="Calibri" w:hAnsi="Calibri" w:cs="Arial"/>
-                <w:sz w:val="22"/>
-                <w:szCs w:val="22"/>
-                <w:lang w:eastAsia="es-CL"/>
-              </w:rPr>
-              <w:t xml:space="preserve">agregamos el cuadre del manifiesto, la caja del mesón y la planilla mensual de la cuenta corriente. No estaban en el plan original, pero la operación los necesitaba.</w:t>
-            </w:r>
-          </w:p>
-          <w:p>
-            <w:pPr>
-              <w:spacing w:after="120" w:line="259" w:lineRule="auto"/>
+                <w:lang w:eastAsia="es-CL"/>
+              </w:rPr>
+              <w:t>agregamos el cuadre del manifiesto, la caja del mesón y la planilla mensual de la cuenta corriente. No estaban en el plan original, pero la operación los necesitaba.</w:t>
+            </w:r>
+          </w:p>
+          <w:p>
+            <w:pPr>
+              <w:spacing w:after="120"/>
               <w:jc w:val="both"/>
             </w:pPr>
             <w:r>
               <w:rPr>
                 <w:rFonts w:ascii="Calibri" w:hAnsi="Calibri" w:cs="Arial"/>
                 <w:b/>
-                <w:sz w:val="22"/>
-                <w:szCs w:val="22"/>
                 <w:lang w:eastAsia="es-CL"/>
               </w:rPr>
               <w:t xml:space="preserve">Portal del cliente: </w:t>
@@ -3787,24 +3663,20 @@
             <w:r>
               <w:rPr>
                 <w:rFonts w:ascii="Calibri" w:hAnsi="Calibri" w:cs="Arial"/>
-                <w:sz w:val="22"/>
-                <w:szCs w:val="22"/>
-                <w:lang w:eastAsia="es-CL"/>
-              </w:rPr>
-              <w:t xml:space="preserve">lo agregamos como actividad nueva, con su propio módulo en el backend, para que cada cliente vea solo sus órdenes y no las de otro.</w:t>
-            </w:r>
-          </w:p>
-          <w:p>
-            <w:pPr>
-              <w:spacing w:after="120" w:line="259" w:lineRule="auto"/>
+                <w:lang w:eastAsia="es-CL"/>
+              </w:rPr>
+              <w:t>lo agregamos como actividad nueva, con su propio módulo en el backend, para que cada cliente vea solo sus órdenes y no las de otro.</w:t>
+            </w:r>
+          </w:p>
+          <w:p>
+            <w:pPr>
+              <w:spacing w:after="120"/>
               <w:jc w:val="both"/>
             </w:pPr>
             <w:r>
               <w:rPr>
                 <w:rFonts w:ascii="Calibri" w:hAnsi="Calibri" w:cs="Arial"/>
                 <w:b/>
-                <w:sz w:val="22"/>
-                <w:szCs w:val="22"/>
                 <w:lang w:eastAsia="es-CL"/>
               </w:rPr>
               <w:t xml:space="preserve">Prototipo: </w:t>
@@ -3812,11 +3684,9 @@
             <w:r>
               <w:rPr>
                 <w:rFonts w:ascii="Calibri" w:hAnsi="Calibri" w:cs="Arial"/>
-                <w:sz w:val="22"/>
-                <w:szCs w:val="22"/>
-                <w:lang w:eastAsia="es-CL"/>
-              </w:rPr>
-              <w:t xml:space="preserve">el primer frontend fue en HTML y JavaScript para mostrar avances al profesor. Después lo pasamos a React, que era lo planificado.</w:t>
+                <w:lang w:eastAsia="es-CL"/>
+              </w:rPr>
+              <w:t>el primer frontend fue en HTML y JavaScript para mostrar avances al profesor. Después lo pasamos a React, que era lo planificado.</w:t>
             </w:r>
           </w:p>
         </w:tc>
@@ -3917,7 +3787,7 @@
                 <w:szCs w:val="20"/>
                 <w:lang w:eastAsia="es-CL"/>
               </w:rPr>
-              <w:t xml:space="preserve">no hayas iniciado actividades o estén retrasadas</w:t>
+              <w:t>no hayas iniciado actividades o estén retrasadas</w:t>
             </w:r>
             <w:r>
               <w:rPr>
@@ -3933,15 +3803,13 @@
           </w:p>
           <w:p>
             <w:pPr>
-              <w:spacing w:after="120" w:line="259" w:lineRule="auto"/>
+              <w:spacing w:after="120"/>
               <w:jc w:val="both"/>
             </w:pPr>
             <w:r>
               <w:rPr>
                 <w:rFonts w:ascii="Calibri" w:hAnsi="Calibri" w:cs="Arial"/>
                 <w:b/>
-                <w:sz w:val="22"/>
-                <w:szCs w:val="22"/>
                 <w:lang w:eastAsia="es-CL"/>
               </w:rPr>
               <w:t xml:space="preserve">Machine Learning: </w:t>
@@ -3949,24 +3817,20 @@
             <w:r>
               <w:rPr>
                 <w:rFonts w:ascii="Calibri" w:hAnsi="Calibri" w:cs="Arial"/>
-                <w:sz w:val="22"/>
-                <w:szCs w:val="22"/>
-                <w:lang w:eastAsia="es-CL"/>
-              </w:rPr>
-              <w:t xml:space="preserve">no está iniciado (0 % en la carta Gantt). Lo dejamos como proyección y, si alcanzamos a juntar historial, la base serían los datos de la cuenta corriente.</w:t>
-            </w:r>
-          </w:p>
-          <w:p>
-            <w:pPr>
-              <w:spacing w:after="120" w:line="259" w:lineRule="auto"/>
+                <w:lang w:eastAsia="es-CL"/>
+              </w:rPr>
+              <w:t>no está iniciado (0 % en la carta Gantt). Lo dejamos como proyección y, si alcanzamos a juntar historial, la base serían los datos de la cuenta corriente.</w:t>
+            </w:r>
+          </w:p>
+          <w:p>
+            <w:pPr>
+              <w:spacing w:after="120"/>
               <w:jc w:val="both"/>
             </w:pPr>
             <w:r>
               <w:rPr>
                 <w:rFonts w:ascii="Calibri" w:hAnsi="Calibri" w:cs="Arial"/>
                 <w:b/>
-                <w:sz w:val="22"/>
-                <w:szCs w:val="22"/>
                 <w:lang w:eastAsia="es-CL"/>
               </w:rPr>
               <w:t xml:space="preserve">Alertas y reportes: </w:t>
@@ -3974,24 +3838,20 @@
             <w:r>
               <w:rPr>
                 <w:rFonts w:ascii="Calibri" w:hAnsi="Calibri" w:cs="Arial"/>
-                <w:sz w:val="22"/>
-                <w:szCs w:val="22"/>
-                <w:lang w:eastAsia="es-CL"/>
-              </w:rPr>
-              <w:t xml:space="preserve">van a medias. Ya funcionan las alertas de OT creada, carga atrasada e intentos de acceso sospechosos, pero falta la de morosidad. Los reportes muestran datos por período, pero faltan algunos de los que propusimos en la Fase 1. La idea es terminarlos en las semanas que la Gantt tiene para pagos y alertas.</w:t>
-            </w:r>
-          </w:p>
-          <w:p>
-            <w:pPr>
-              <w:spacing w:after="120" w:line="259" w:lineRule="auto"/>
+                <w:lang w:eastAsia="es-CL"/>
+              </w:rPr>
+              <w:t>van a medias. Ya funcionan las alertas de OT creada, carga atrasada e intentos de acceso sospechosos, pero falta la de morosidad. Los reportes muestran datos por período, pero faltan algunos de los que propusimos en la Fase 1. La idea es terminarlos en las semanas que la Gantt tiene para pagos y alertas.</w:t>
+            </w:r>
+          </w:p>
+          <w:p>
+            <w:pPr>
+              <w:spacing w:after="120"/>
               <w:jc w:val="both"/>
             </w:pPr>
             <w:r>
               <w:rPr>
                 <w:rFonts w:ascii="Calibri" w:hAnsi="Calibri" w:cs="Arial"/>
                 <w:b/>
-                <w:sz w:val="22"/>
-                <w:szCs w:val="22"/>
                 <w:lang w:eastAsia="es-CL"/>
               </w:rPr>
               <w:t xml:space="preserve">Pruebas: </w:t>
@@ -3999,24 +3859,20 @@
             <w:r>
               <w:rPr>
                 <w:rFonts w:ascii="Calibri" w:hAnsi="Calibri" w:cs="Arial"/>
-                <w:sz w:val="22"/>
-                <w:szCs w:val="22"/>
-                <w:lang w:eastAsia="es-CL"/>
-              </w:rPr>
-              <w:t xml:space="preserve">tenemos la colección de Postman y el informe de pruebas, pero no una batería automática. Vamos a priorizar los flujos principales (crear OT, manifiesto, entrega y pago) para dejarlos probados antes de la etapa de verificación.</w:t>
-            </w:r>
-          </w:p>
-          <w:p>
-            <w:pPr>
-              <w:spacing w:after="120" w:line="259" w:lineRule="auto"/>
+                <w:lang w:eastAsia="es-CL"/>
+              </w:rPr>
+              <w:t>tenemos la colección de Postman y el informe de pruebas, pero no una batería automática. Vamos a priorizar los flujos principales (crear OT, manifiesto, entrega y pago) para dejarlos probados antes de la etapa de verificación.</w:t>
+            </w:r>
+          </w:p>
+          <w:p>
+            <w:pPr>
+              <w:spacing w:after="120"/>
               <w:jc w:val="both"/>
             </w:pPr>
             <w:r>
               <w:rPr>
                 <w:rFonts w:ascii="Calibri" w:hAnsi="Calibri" w:cs="Arial"/>
                 <w:b/>
-                <w:sz w:val="22"/>
-                <w:szCs w:val="22"/>
                 <w:lang w:eastAsia="es-CL"/>
               </w:rPr>
               <w:t xml:space="preserve">Documentación y video: </w:t>
@@ -4024,26 +3880,22 @@
             <w:r>
               <w:rPr>
                 <w:rFonts w:ascii="Calibri" w:hAnsi="Calibri" w:cs="Arial"/>
-                <w:sz w:val="22"/>
-                <w:szCs w:val="22"/>
-                <w:lang w:eastAsia="es-CL"/>
-              </w:rPr>
-              <w:t xml:space="preserve">los informes de esta fase ya están, pero el manual de usuario y el video demostrativo son parte de la entrega final, así que quedan para la Fase 3.</w:t>
-            </w:r>
-          </w:p>
-          <w:p>
-            <w:pPr>
-              <w:spacing w:after="120" w:line="259" w:lineRule="auto"/>
+                <w:lang w:eastAsia="es-CL"/>
+              </w:rPr>
+              <w:t>los informes de esta fase ya están, pero el manual de usuario y el video demostrativo son parte de la entrega final, así que quedan para la Fase 3.</w:t>
+            </w:r>
+          </w:p>
+          <w:p>
+            <w:pPr>
+              <w:spacing w:after="120"/>
               <w:jc w:val="both"/>
             </w:pPr>
             <w:r>
               <w:rPr>
                 <w:rFonts w:ascii="Calibri" w:hAnsi="Calibri" w:cs="Arial"/>
-                <w:sz w:val="22"/>
-                <w:szCs w:val="22"/>
-                <w:lang w:eastAsia="es-CL"/>
-              </w:rPr>
-              <w:t xml:space="preserve">En general, no cumplimos todo exactamente en las fechas del plan, porque algunas tareas resultaron más complejas de lo que pensábamos. Aun así, el núcleo del sistema quedó listo dentro de la Fase 2.</w:t>
+                <w:lang w:eastAsia="es-CL"/>
+              </w:rPr>
+              <w:t>En general, no cumplimos todo exactamente en las fechas del plan, porque algunas tareas resultaron más complejas de lo que pensábamos. Aun así, el núcleo del sistema quedó listo dentro de la Fase 2.</w:t>
             </w:r>
           </w:p>
         </w:tc>
@@ -4051,11 +3903,11 @@
     </w:tbl>
     <w:p>
       <w:pPr>
-        <w:spacing w:before="0" w:after="0" w:line="120" w:lineRule="exact"/>
+        <w:spacing w:after="0" w:line="120" w:lineRule="exact"/>
         <w:rPr>
-          <w:lang w:val="es-ES"/>
           <w:sz w:val="4"/>
           <w:szCs w:val="4"/>
+          <w:lang w:val="es-ES"/>
         </w:rPr>
       </w:pPr>
     </w:p>
@@ -4071,7 +3923,7 @@
 </file>
 
 <file path=word/endnotes.xml><?xml version="1.0" encoding="utf-8"?>
-<w:endnotes xmlns:wpc="http://schemas.microsoft.com/office/word/2010/wordprocessingCanvas" xmlns:cx="http://schemas.microsoft.com/office/drawing/2014/chartex" xmlns:mc="http://schemas.openxmlformats.org/markup-compatibility/2006" xmlns:o="urn:schemas-microsoft-com:office:office" xmlns:r="http://schemas.openxmlformats.org/officeDocument/2006/relationships" xmlns:m="http://schemas.openxmlformats.org/officeDocument/2006/math" xmlns:v="urn:schemas-microsoft-com:vml" xmlns:wp14="http://schemas.microsoft.com/office/word/2010/wordprocessingDrawing" xmlns:wp="http://schemas.openxmlformats.org/drawingml/2006/wordprocessingDrawing" xmlns:w10="urn:schemas-microsoft-com:office:word" xmlns:w="http://schemas.openxmlformats.org/wordprocessingml/2006/main" xmlns:w14="http://schemas.microsoft.com/office/word/2010/wordml" xmlns:w15="http://schemas.microsoft.com/office/word/2012/wordml" xmlns:w16se="http://schemas.microsoft.com/office/word/2015/wordml/symex" xmlns:wpg="http://schemas.microsoft.com/office/word/2010/wordprocessingGroup" xmlns:wpi="http://schemas.microsoft.com/office/word/2010/wordprocessingInk" xmlns:wne="http://schemas.microsoft.com/office/word/2006/wordml" xmlns:wps="http://schemas.microsoft.com/office/word/2010/wordprocessingShape" mc:Ignorable="w14 w15 w16se wp14">
+<w:endnotes xmlns:wpc="http://schemas.microsoft.com/office/word/2010/wordprocessingCanvas" xmlns:cx="http://schemas.microsoft.com/office/drawing/2014/chartex" xmlns:cx1="http://schemas.microsoft.com/office/drawing/2015/9/8/chartex" xmlns:cx2="http://schemas.microsoft.com/office/drawing/2015/10/21/chartex" xmlns:cx3="http://schemas.microsoft.com/office/drawing/2016/5/9/chartex" xmlns:cx4="http://schemas.microsoft.com/office/drawing/2016/5/10/chartex" xmlns:cx5="http://schemas.microsoft.com/office/drawing/2016/5/11/chartex" xmlns:cx6="http://schemas.microsoft.com/office/drawing/2016/5/12/chartex" xmlns:cx7="http://schemas.microsoft.com/office/drawing/2016/5/13/chartex" xmlns:cx8="http://schemas.microsoft.com/office/drawing/2016/5/14/chartex" xmlns:mc="http://schemas.openxmlformats.org/markup-compatibility/2006" xmlns:aink="http://schemas.microsoft.com/office/drawing/2016/ink" xmlns:am3d="http://schemas.microsoft.com/office/drawing/2017/model3d" xmlns:o="urn:schemas-microsoft-com:office:office" xmlns:oel="http://schemas.microsoft.com/office/2019/extlst" xmlns:r="http://schemas.openxmlformats.org/officeDocument/2006/relationships" xmlns:m="http://schemas.openxmlformats.org/officeDocument/2006/math" xmlns:v="urn:schemas-microsoft-com:vml" xmlns:wp14="http://schemas.microsoft.com/office/word/2010/wordprocessingDrawing" xmlns:wp="http://schemas.openxmlformats.org/drawingml/2006/wordprocessingDrawing" xmlns:w10="urn:schemas-microsoft-com:office:word" xmlns:w="http://schemas.openxmlformats.org/wordprocessingml/2006/main" xmlns:w14="http://schemas.microsoft.com/office/word/2010/wordml" xmlns:w15="http://schemas.microsoft.com/office/word/2012/wordml" xmlns:w16cex="http://schemas.microsoft.com/office/word/2018/wordml/cex" xmlns:w16cid="http://schemas.microsoft.com/office/word/2016/wordml/cid" xmlns:w16="http://schemas.microsoft.com/office/word/2018/wordml" xmlns:w16du="http://schemas.microsoft.com/office/word/2023/wordml/word16du" xmlns:w16sdtdh="http://schemas.microsoft.com/office/word/2020/wordml/sdtdatahash" xmlns:w16sdtfl="http://schemas.microsoft.com/office/word/2024/wordml/sdtformatlock" xmlns:w16se="http://schemas.microsoft.com/office/word/2015/wordml/symex" xmlns:wpg="http://schemas.microsoft.com/office/word/2010/wordprocessingGroup" xmlns:wpi="http://schemas.microsoft.com/office/word/2010/wordprocessingInk" xmlns:wne="http://schemas.microsoft.com/office/word/2006/wordml" xmlns:wps="http://schemas.microsoft.com/office/word/2010/wordprocessingShape" mc:Ignorable="w14 w15 w16se w16cid w16 w16cex w16sdtdh w16sdtfl w16du wp14">
   <w:endnote w:type="separator" w:id="-1">
     <w:p>
       <w:pPr>
@@ -4096,7 +3948,7 @@
 </file>
 
 <file path=word/footnotes.xml><?xml version="1.0" encoding="utf-8"?>
-<w:footnotes xmlns:wpc="http://schemas.microsoft.com/office/word/2010/wordprocessingCanvas" xmlns:cx="http://schemas.microsoft.com/office/drawing/2014/chartex" xmlns:mc="http://schemas.openxmlformats.org/markup-compatibility/2006" xmlns:o="urn:schemas-microsoft-com:office:office" xmlns:r="http://schemas.openxmlformats.org/officeDocument/2006/relationships" xmlns:m="http://schemas.openxmlformats.org/officeDocument/2006/math" xmlns:v="urn:schemas-microsoft-com:vml" xmlns:wp14="http://schemas.microsoft.com/office/word/2010/wordprocessingDrawing" xmlns:wp="http://schemas.openxmlformats.org/drawingml/2006/wordprocessingDrawing" xmlns:w10="urn:schemas-microsoft-com:office:word" xmlns:w="http://schemas.openxmlformats.org/wordprocessingml/2006/main" xmlns:w14="http://schemas.microsoft.com/office/word/2010/wordml" xmlns:w15="http://schemas.microsoft.com/office/word/2012/wordml" xmlns:w16se="http://schemas.microsoft.com/office/word/2015/wordml/symex" xmlns:wpg="http://schemas.microsoft.com/office/word/2010/wordprocessingGroup" xmlns:wpi="http://schemas.microsoft.com/office/word/2010/wordprocessingInk" xmlns:wne="http://schemas.microsoft.com/office/word/2006/wordml" xmlns:wps="http://schemas.microsoft.com/office/word/2010/wordprocessingShape" mc:Ignorable="w14 w15 w16se wp14">
+<w:footnotes xmlns:wpc="http://schemas.microsoft.com/office/word/2010/wordprocessingCanvas" xmlns:cx="http://schemas.microsoft.com/office/drawing/2014/chartex" xmlns:cx1="http://schemas.microsoft.com/office/drawing/2015/9/8/chartex" xmlns:cx2="http://schemas.microsoft.com/office/drawing/2015/10/21/chartex" xmlns:cx3="http://schemas.microsoft.com/office/drawing/2016/5/9/chartex" xmlns:cx4="http://schemas.microsoft.com/office/drawing/2016/5/10/chartex" xmlns:cx5="http://schemas.microsoft.com/office/drawing/2016/5/11/chartex" xmlns:cx6="http://schemas.microsoft.com/office/drawing/2016/5/12/chartex" xmlns:cx7="http://schemas.microsoft.com/office/drawing/2016/5/13/chartex" xmlns:cx8="http://schemas.microsoft.com/office/drawing/2016/5/14/chartex" xmlns:mc="http://schemas.openxmlformats.org/markup-compatibility/2006" xmlns:aink="http://schemas.microsoft.com/office/drawing/2016/ink" xmlns:am3d="http://schemas.microsoft.com/office/drawing/2017/model3d" xmlns:o="urn:schemas-microsoft-com:office:office" xmlns:oel="http://schemas.microsoft.com/office/2019/extlst" xmlns:r="http://schemas.openxmlformats.org/officeDocument/2006/relationships" xmlns:m="http://schemas.openxmlformats.org/officeDocument/2006/math" xmlns:v="urn:schemas-microsoft-com:vml" xmlns:wp14="http://schemas.microsoft.com/office/word/2010/wordprocessingDrawing" xmlns:wp="http://schemas.openxmlformats.org/drawingml/2006/wordprocessingDrawing" xmlns:w10="urn:schemas-microsoft-com:office:word" xmlns:w="http://schemas.openxmlformats.org/wordprocessingml/2006/main" xmlns:w14="http://schemas.microsoft.com/office/word/2010/wordml" xmlns:w15="http://schemas.microsoft.com/office/word/2012/wordml" xmlns:w16cex="http://schemas.microsoft.com/office/word/2018/wordml/cex" xmlns:w16cid="http://schemas.microsoft.com/office/word/2016/wordml/cid" xmlns:w16="http://schemas.microsoft.com/office/word/2018/wordml" xmlns:w16du="http://schemas.microsoft.com/office/word/2023/wordml/word16du" xmlns:w16sdtdh="http://schemas.microsoft.com/office/word/2020/wordml/sdtdatahash" xmlns:w16sdtfl="http://schemas.microsoft.com/office/word/2024/wordml/sdtformatlock" xmlns:w16se="http://schemas.microsoft.com/office/word/2015/wordml/symex" xmlns:wpg="http://schemas.microsoft.com/office/word/2010/wordprocessingGroup" xmlns:wpi="http://schemas.microsoft.com/office/word/2010/wordprocessingInk" xmlns:wne="http://schemas.microsoft.com/office/word/2006/wordml" xmlns:wps="http://schemas.microsoft.com/office/word/2010/wordprocessingShape" mc:Ignorable="w14 w15 w16se w16cid w16 w16cex w16sdtdh w16sdtfl w16du wp14">
   <w:footnote w:type="separator" w:id="-1">
     <w:p>
       <w:pPr>
@@ -4179,7 +4031,7 @@
 </file>
 
 <file path=word/header1.xml><?xml version="1.0" encoding="utf-8"?>
-<w:hdr xmlns:wpc="http://schemas.microsoft.com/office/word/2010/wordprocessingCanvas" xmlns:cx="http://schemas.microsoft.com/office/drawing/2014/chartex" xmlns:mc="http://schemas.openxmlformats.org/markup-compatibility/2006" xmlns:o="urn:schemas-microsoft-com:office:office" xmlns:r="http://schemas.openxmlformats.org/officeDocument/2006/relationships" xmlns:m="http://schemas.openxmlformats.org/officeDocument/2006/math" xmlns:v="urn:schemas-microsoft-com:vml" xmlns:wp14="http://schemas.microsoft.com/office/word/2010/wordprocessingDrawing" xmlns:wp="http://schemas.openxmlformats.org/drawingml/2006/wordprocessingDrawing" xmlns:w10="urn:schemas-microsoft-com:office:word" xmlns:w="http://schemas.openxmlformats.org/wordprocessingml/2006/main" xmlns:w14="http://schemas.microsoft.com/office/word/2010/wordml" xmlns:w15="http://schemas.microsoft.com/office/word/2012/wordml" xmlns:w16se="http://schemas.microsoft.com/office/word/2015/wordml/symex" xmlns:wpg="http://schemas.microsoft.com/office/word/2010/wordprocessingGroup" xmlns:wpi="http://schemas.microsoft.com/office/word/2010/wordprocessingInk" xmlns:wne="http://schemas.microsoft.com/office/word/2006/wordml" xmlns:wps="http://schemas.microsoft.com/office/word/2010/wordprocessingShape" mc:Ignorable="w14 w15 w16se wp14">
+<w:hdr xmlns:wpc="http://schemas.microsoft.com/office/word/2010/wordprocessingCanvas" xmlns:cx="http://schemas.microsoft.com/office/drawing/2014/chartex" xmlns:cx1="http://schemas.microsoft.com/office/drawing/2015/9/8/chartex" xmlns:cx2="http://schemas.microsoft.com/office/drawing/2015/10/21/chartex" xmlns:cx3="http://schemas.microsoft.com/office/drawing/2016/5/9/chartex" xmlns:cx4="http://schemas.microsoft.com/office/drawing/2016/5/10/chartex" xmlns:cx5="http://schemas.microsoft.com/office/drawing/2016/5/11/chartex" xmlns:cx6="http://schemas.microsoft.com/office/drawing/2016/5/12/chartex" xmlns:cx7="http://schemas.microsoft.com/office/drawing/2016/5/13/chartex" xmlns:cx8="http://schemas.microsoft.com/office/drawing/2016/5/14/chartex" xmlns:mc="http://schemas.openxmlformats.org/markup-compatibility/2006" xmlns:aink="http://schemas.microsoft.com/office/drawing/2016/ink" xmlns:am3d="http://schemas.microsoft.com/office/drawing/2017/model3d" xmlns:o="urn:schemas-microsoft-com:office:office" xmlns:oel="http://schemas.microsoft.com/office/2019/extlst" xmlns:r="http://schemas.openxmlformats.org/officeDocument/2006/relationships" xmlns:m="http://schemas.openxmlformats.org/officeDocument/2006/math" xmlns:v="urn:schemas-microsoft-com:vml" xmlns:wp14="http://schemas.microsoft.com/office/word/2010/wordprocessingDrawing" xmlns:wp="http://schemas.openxmlformats.org/drawingml/2006/wordprocessingDrawing" xmlns:w10="urn:schemas-microsoft-com:office:word" xmlns:w="http://schemas.openxmlformats.org/wordprocessingml/2006/main" xmlns:w14="http://schemas.microsoft.com/office/word/2010/wordml" xmlns:w15="http://schemas.microsoft.com/office/word/2012/wordml" xmlns:w16cex="http://schemas.microsoft.com/office/word/2018/wordml/cex" xmlns:w16cid="http://schemas.microsoft.com/office/word/2016/wordml/cid" xmlns:w16="http://schemas.microsoft.com/office/word/2018/wordml" xmlns:w16du="http://schemas.microsoft.com/office/word/2023/wordml/word16du" xmlns:w16sdtdh="http://schemas.microsoft.com/office/word/2020/wordml/sdtdatahash" xmlns:w16sdtfl="http://schemas.microsoft.com/office/word/2024/wordml/sdtformatlock" xmlns:w16se="http://schemas.microsoft.com/office/word/2015/wordml/symex" xmlns:wpg="http://schemas.microsoft.com/office/word/2010/wordprocessingGroup" xmlns:wpi="http://schemas.microsoft.com/office/word/2010/wordprocessingInk" xmlns:wne="http://schemas.microsoft.com/office/word/2006/wordml" xmlns:wps="http://schemas.microsoft.com/office/word/2010/wordprocessingShape" mc:Ignorable="w14 w15 w16se w16cid w16 w16cex w16sdtdh w16sdtfl w16du wp14">
   <w:tbl>
     <w:tblPr>
       <w:tblStyle w:val="Tablaconcuadrcula1"/>
@@ -4404,7 +4256,7 @@
 </file>
 
 <file path=word/numbering.xml><?xml version="1.0" encoding="utf-8"?>
-<w:numbering xmlns:wpc="http://schemas.microsoft.com/office/word/2010/wordprocessingCanvas" xmlns:cx="http://schemas.microsoft.com/office/drawing/2014/chartex" xmlns:mc="http://schemas.openxmlformats.org/markup-compatibility/2006" xmlns:o="urn:schemas-microsoft-com:office:office" xmlns:r="http://schemas.openxmlformats.org/officeDocument/2006/relationships" xmlns:m="http://schemas.openxmlformats.org/officeDocument/2006/math" xmlns:v="urn:schemas-microsoft-com:vml" xmlns:wp14="http://schemas.microsoft.com/office/word/2010/wordprocessingDrawing" xmlns:wp="http://schemas.openxmlformats.org/drawingml/2006/wordprocessingDrawing" xmlns:w10="urn:schemas-microsoft-com:office:word" xmlns:w="http://schemas.openxmlformats.org/wordprocessingml/2006/main" xmlns:w14="http://schemas.microsoft.com/office/word/2010/wordml" xmlns:w15="http://schemas.microsoft.com/office/word/2012/wordml" xmlns:w16se="http://schemas.microsoft.com/office/word/2015/wordml/symex" xmlns:wpg="http://schemas.microsoft.com/office/word/2010/wordprocessingGroup" xmlns:wpi="http://schemas.microsoft.com/office/word/2010/wordprocessingInk" xmlns:wne="http://schemas.microsoft.com/office/word/2006/wordml" xmlns:wps="http://schemas.microsoft.com/office/word/2010/wordprocessingShape" mc:Ignorable="w14 w15 w16se wp14">
+<w:numbering xmlns:wpc="http://schemas.microsoft.com/office/word/2010/wordprocessingCanvas" xmlns:cx="http://schemas.microsoft.com/office/drawing/2014/chartex" xmlns:cx1="http://schemas.microsoft.com/office/drawing/2015/9/8/chartex" xmlns:cx2="http://schemas.microsoft.com/office/drawing/2015/10/21/chartex" xmlns:cx3="http://schemas.microsoft.com/office/drawing/2016/5/9/chartex" xmlns:cx4="http://schemas.microsoft.com/office/drawing/2016/5/10/chartex" xmlns:cx5="http://schemas.microsoft.com/office/drawing/2016/5/11/chartex" xmlns:cx6="http://schemas.microsoft.com/office/drawing/2016/5/12/chartex" xmlns:cx7="http://schemas.microsoft.com/office/drawing/2016/5/13/chartex" xmlns:cx8="http://schemas.microsoft.com/office/drawing/2016/5/14/chartex" xmlns:mc="http://schemas.openxmlformats.org/markup-compatibility/2006" xmlns:aink="http://schemas.microsoft.com/office/drawing/2016/ink" xmlns:am3d="http://schemas.microsoft.com/office/drawing/2017/model3d" xmlns:o="urn:schemas-microsoft-com:office:office" xmlns:oel="http://schemas.microsoft.com/office/2019/extlst" xmlns:r="http://schemas.openxmlformats.org/officeDocument/2006/relationships" xmlns:m="http://schemas.openxmlformats.org/officeDocument/2006/math" xmlns:v="urn:schemas-microsoft-com:vml" xmlns:wp14="http://schemas.microsoft.com/office/word/2010/wordprocessingDrawing" xmlns:wp="http://schemas.openxmlformats.org/drawingml/2006/wordprocessingDrawing" xmlns:w10="urn:schemas-microsoft-com:office:word" xmlns:w="http://schemas.openxmlformats.org/wordprocessingml/2006/main" xmlns:w14="http://schemas.microsoft.com/office/word/2010/wordml" xmlns:w15="http://schemas.microsoft.com/office/word/2012/wordml" xmlns:w16cex="http://schemas.microsoft.com/office/word/2018/wordml/cex" xmlns:w16cid="http://schemas.microsoft.com/office/word/2016/wordml/cid" xmlns:w16="http://schemas.microsoft.com/office/word/2018/wordml" xmlns:w16du="http://schemas.microsoft.com/office/word/2023/wordml/word16du" xmlns:w16sdtdh="http://schemas.microsoft.com/office/word/2020/wordml/sdtdatahash" xmlns:w16sdtfl="http://schemas.microsoft.com/office/word/2024/wordml/sdtformatlock" xmlns:w16se="http://schemas.microsoft.com/office/word/2015/wordml/symex" xmlns:wpg="http://schemas.microsoft.com/office/word/2010/wordprocessingGroup" xmlns:wpi="http://schemas.microsoft.com/office/word/2010/wordprocessingInk" xmlns:wne="http://schemas.microsoft.com/office/word/2006/wordml" xmlns:wps="http://schemas.microsoft.com/office/word/2010/wordprocessingShape" mc:Ignorable="w14 w15 w16se w16cid w16 w16cex w16sdtdh w16sdtfl w16du wp14">
   <w:abstractNum w:abstractNumId="0" w15:restartNumberingAfterBreak="0">
     <w:nsid w:val="2FFD4C7F"/>
     <w:multiLevelType w:val="multilevel"/>
@@ -4526,14 +4378,14 @@
       </w:rPr>
     </w:lvl>
   </w:abstractNum>
-  <w:num w:numId="1">
+  <w:num w:numId="1" w16cid:durableId="1515070411">
     <w:abstractNumId w:val="0"/>
   </w:num>
 </w:numbering>
 </file>
 
 <file path=word/styles.xml><?xml version="1.0" encoding="utf-8"?>
-<w:styles xmlns:mc="http://schemas.openxmlformats.org/markup-compatibility/2006" xmlns:r="http://schemas.openxmlformats.org/officeDocument/2006/relationships" xmlns:w="http://schemas.openxmlformats.org/wordprocessingml/2006/main" xmlns:w14="http://schemas.microsoft.com/office/word/2010/wordml" xmlns:w15="http://schemas.microsoft.com/office/word/2012/wordml" xmlns:w16se="http://schemas.microsoft.com/office/word/2015/wordml/symex" mc:Ignorable="w14 w15 w16se">
+<w:styles xmlns:mc="http://schemas.openxmlformats.org/markup-compatibility/2006" xmlns:r="http://schemas.openxmlformats.org/officeDocument/2006/relationships" xmlns:w="http://schemas.openxmlformats.org/wordprocessingml/2006/main" xmlns:w14="http://schemas.microsoft.com/office/word/2010/wordml" xmlns:w15="http://schemas.microsoft.com/office/word/2012/wordml" xmlns:w16cex="http://schemas.microsoft.com/office/word/2018/wordml/cex" xmlns:w16cid="http://schemas.microsoft.com/office/word/2016/wordml/cid" xmlns:w16="http://schemas.microsoft.com/office/word/2018/wordml" xmlns:w16du="http://schemas.microsoft.com/office/word/2023/wordml/word16du" xmlns:w16sdtdh="http://schemas.microsoft.com/office/word/2020/wordml/sdtdatahash" xmlns:w16sdtfl="http://schemas.microsoft.com/office/word/2024/wordml/sdtformatlock" xmlns:w16se="http://schemas.microsoft.com/office/word/2015/wordml/symex" mc:Ignorable="w14 w15 w16se w16cid w16 w16cex w16sdtdh w16sdtfl w16du">
   <w:docDefaults>
     <w:rPrDefault>
       <w:rPr>
@@ -4545,7 +4397,7 @@
     </w:rPrDefault>
     <w:pPrDefault/>
   </w:docDefaults>
-  <w:latentStyles w:defLockedState="0" w:defUIPriority="99" w:defSemiHidden="0" w:defUnhideWhenUsed="0" w:defQFormat="0" w:count="371">
+  <w:latentStyles w:defLockedState="0" w:defUIPriority="99" w:defSemiHidden="0" w:defUnhideWhenUsed="0" w:defQFormat="0" w:count="376">
     <w:lsdException w:name="Normal" w:uiPriority="0" w:qFormat="1"/>
     <w:lsdException w:name="heading 1" w:uiPriority="9" w:qFormat="1"/>
     <w:lsdException w:name="heading 2" w:semiHidden="1" w:uiPriority="9" w:unhideWhenUsed="1" w:qFormat="1"/>
@@ -4917,6 +4769,11 @@
     <w:lsdException w:name="List Table 5 Dark Accent 6" w:uiPriority="50"/>
     <w:lsdException w:name="List Table 6 Colorful Accent 6" w:uiPriority="51"/>
     <w:lsdException w:name="List Table 7 Colorful Accent 6" w:uiPriority="52"/>
+    <w:lsdException w:name="Mention" w:semiHidden="1" w:unhideWhenUsed="1"/>
+    <w:lsdException w:name="Smart Hyperlink" w:semiHidden="1" w:unhideWhenUsed="1"/>
+    <w:lsdException w:name="Hashtag" w:semiHidden="1" w:unhideWhenUsed="1"/>
+    <w:lsdException w:name="Unresolved Mention" w:semiHidden="1" w:unhideWhenUsed="1"/>
+    <w:lsdException w:name="Smart Link" w:semiHidden="1" w:unhideWhenUsed="1"/>
   </w:latentStyles>
   <w:style w:type="paragraph" w:default="1" w:styleId="Normal">
     <w:name w:val="Normal"/>
@@ -5519,9 +5376,12 @@
 </file>
 
 <file path=customXml/item1.xml><?xml version="1.0" encoding="utf-8"?>
-<p:properties xmlns:p="http://schemas.microsoft.com/office/2006/metadata/properties" xmlns:xsi="http://www.w3.org/2001/XMLSchema-instance" xmlns:pc="http://schemas.microsoft.com/office/infopath/2007/PartnerControls">
-  <documentManagement/>
-</p:properties>
+<?mso-contentType ?>
+<FormTemplates xmlns="http://schemas.microsoft.com/sharepoint/v3/contenttype/forms">
+  <Display>DocumentLibraryForm</Display>
+  <Edit>DocumentLibraryForm</Edit>
+  <New>DocumentLibraryForm</New>
+</FormTemplates>
 </file>
 
 <file path=customXml/item2.xml><?xml version="1.0" encoding="utf-8"?>
@@ -5657,26 +5517,15 @@
 </file>
 
 <file path=customXml/item3.xml><?xml version="1.0" encoding="utf-8"?>
-<?mso-contentType ?>
-<FormTemplates xmlns="http://schemas.microsoft.com/sharepoint/v3/contenttype/forms">
-  <Display>DocumentLibraryForm</Display>
-  <Edit>DocumentLibraryForm</Edit>
-  <New>DocumentLibraryForm</New>
-</FormTemplates>
+<p:properties xmlns:p="http://schemas.microsoft.com/office/2006/metadata/properties" xmlns:xsi="http://www.w3.org/2001/XMLSchema-instance" xmlns:pc="http://schemas.microsoft.com/office/infopath/2007/PartnerControls">
+  <documentManagement/>
+</p:properties>
 </file>
 
 <file path=customXml/itemProps1.xml><?xml version="1.0" encoding="utf-8"?>
-<ds:datastoreItem xmlns:ds="http://schemas.openxmlformats.org/officeDocument/2006/customXml" ds:itemID="{46CA5683-AF87-4E40-B841-2E23A3B52406}">
+<ds:datastoreItem xmlns:ds="http://schemas.openxmlformats.org/officeDocument/2006/customXml" ds:itemID="{D51C61E4-DB75-4684-AD25-71F546404E96}">
   <ds:schemaRefs>
-    <ds:schemaRef ds:uri="http://purl.org/dc/terms/"/>
-    <ds:schemaRef ds:uri="http://purl.org/dc/elements/1.1/"/>
-    <ds:schemaRef ds:uri="http://schemas.openxmlformats.org/package/2006/metadata/core-properties"/>
-    <ds:schemaRef ds:uri="http://www.w3.org/XML/1998/namespace"/>
-    <ds:schemaRef ds:uri="http://schemas.microsoft.com/office/2006/metadata/properties"/>
-    <ds:schemaRef ds:uri="http://schemas.microsoft.com/office/2006/documentManagement/types"/>
-    <ds:schemaRef ds:uri="http://purl.org/dc/dcmitype/"/>
-    <ds:schemaRef ds:uri="http://schemas.microsoft.com/office/infopath/2007/PartnerControls"/>
-    <ds:schemaRef ds:uri="126e8a1c-9ea9-435a-ac89-d06c80d62e30"/>
+    <ds:schemaRef ds:uri="http://schemas.microsoft.com/sharepoint/v3/contenttype/forms"/>
   </ds:schemaRefs>
 </ds:datastoreItem>
 </file>
@@ -5700,9 +5549,10 @@
 </file>
 
 <file path=customXml/itemProps3.xml><?xml version="1.0" encoding="utf-8"?>
-<ds:datastoreItem xmlns:ds="http://schemas.openxmlformats.org/officeDocument/2006/customXml" ds:itemID="{D51C61E4-DB75-4684-AD25-71F546404E96}">
+<ds:datastoreItem xmlns:ds="http://schemas.openxmlformats.org/officeDocument/2006/customXml" ds:itemID="{46CA5683-AF87-4E40-B841-2E23A3B52406}">
   <ds:schemaRefs>
-    <ds:schemaRef ds:uri="http://schemas.microsoft.com/sharepoint/v3/contenttype/forms"/>
+    <ds:schemaRef ds:uri="http://schemas.microsoft.com/office/2006/metadata/properties"/>
+    <ds:schemaRef ds:uri="http://schemas.microsoft.com/office/infopath/2007/PartnerControls"/>
   </ds:schemaRefs>
 </ds:datastoreItem>
 </file>
</xml_diff>